<commit_message>
Link data, scripts, tests and outputs in the report; set GitHub URLs
Adds a Data, Code and Output Availability section with clickable links
to every data file, script, test and output on GitHub, makes repository
paths in the report clickable (docx, pdf and tex), and replaces the
username placeholder in all deliverables.

Co-Authored-By: Claude Opus 5.5 <noreply@anthropic.com>
</commit_message>
<xml_diff>
--- a/reports/module1_report.docx
+++ b/reports/module1_report.docx
@@ -258,9 +258,15 @@
             <w:tcW w:w="5102" w:type="dxa"/>
           </w:tcPr>
           <w:p>
-            <w:r>
-              <w:t>https://github.com/&lt;your-github-username&gt;/module1-vit-antenna-image-classification</w:t>
-            </w:r>
+            <w:hyperlink r:id="rId8">
+              <w:r>
+                <w:rPr>
+                  <w:color w:val="1F5FA8"/>
+                  <w:u w:val="single"/>
+                </w:rPr>
+                <w:t>https://github.com/rathiabeth/module1-vit-antenna-image-classification</w:t>
+              </w:r>
+            </w:hyperlink>
           </w:p>
         </w:tc>
       </w:tr>
@@ -285,7 +291,7 @@
       <w:pPr>
         <w:pStyle w:val="Heading1"/>
       </w:pPr>
-      <w:bookmarkStart w:id="0" w:name="_Toc243937735"/>
+      <w:bookmarkStart w:id="0" w:name="_Toc243938830"/>
       <w:r>
         <w:lastRenderedPageBreak/>
         <w:t>Table of Contents</w:t>
@@ -316,7 +322,7 @@
       <w:r>
         <w:fldChar w:fldCharType="separate"/>
       </w:r>
-      <w:hyperlink w:anchor="_Toc243937735" w:history="1">
+      <w:hyperlink w:anchor="_Toc243938830" w:history="1">
         <w:r>
           <w:rPr>
             <w:rStyle w:val="Hyperlink"/>
@@ -343,7 +349,7 @@
             <w:noProof/>
             <w:webHidden/>
           </w:rPr>
-          <w:instrText xml:space="preserve"> PAGEREF _Toc243937735 \h </w:instrText>
+          <w:instrText xml:space="preserve"> PAGEREF _Toc243938830 \h </w:instrText>
         </w:r>
         <w:r>
           <w:rPr>
@@ -389,7 +395,7 @@
           <w14:ligatures w14:val="standardContextual"/>
         </w:rPr>
       </w:pPr>
-      <w:hyperlink w:anchor="_Toc243937736" w:history="1">
+      <w:hyperlink w:anchor="_Toc243938831" w:history="1">
         <w:r>
           <w:rPr>
             <w:rStyle w:val="Hyperlink"/>
@@ -416,7 +422,7 @@
             <w:noProof/>
             <w:webHidden/>
           </w:rPr>
-          <w:instrText xml:space="preserve"> PAGEREF _Toc243937736 \h </w:instrText>
+          <w:instrText xml:space="preserve"> PAGEREF _Toc243938831 \h </w:instrText>
         </w:r>
         <w:r>
           <w:rPr>
@@ -462,7 +468,7 @@
           <w14:ligatures w14:val="standardContextual"/>
         </w:rPr>
       </w:pPr>
-      <w:hyperlink w:anchor="_Toc243937737" w:history="1">
+      <w:hyperlink w:anchor="_Toc243938832" w:history="1">
         <w:r>
           <w:rPr>
             <w:rStyle w:val="Hyperlink"/>
@@ -489,7 +495,7 @@
             <w:noProof/>
             <w:webHidden/>
           </w:rPr>
-          <w:instrText xml:space="preserve"> PAGEREF _Toc243937737 \h </w:instrText>
+          <w:instrText xml:space="preserve"> PAGEREF _Toc243938832 \h </w:instrText>
         </w:r>
         <w:r>
           <w:rPr>
@@ -535,7 +541,7 @@
           <w14:ligatures w14:val="standardContextual"/>
         </w:rPr>
       </w:pPr>
-      <w:hyperlink w:anchor="_Toc243937738" w:history="1">
+      <w:hyperlink w:anchor="_Toc243938833" w:history="1">
         <w:r>
           <w:rPr>
             <w:rStyle w:val="Hyperlink"/>
@@ -562,7 +568,7 @@
             <w:noProof/>
             <w:webHidden/>
           </w:rPr>
-          <w:instrText xml:space="preserve"> PAGEREF _Toc243937738 \h </w:instrText>
+          <w:instrText xml:space="preserve"> PAGEREF _Toc243938833 \h </w:instrText>
         </w:r>
         <w:r>
           <w:rPr>
@@ -608,7 +614,7 @@
           <w14:ligatures w14:val="standardContextual"/>
         </w:rPr>
       </w:pPr>
-      <w:hyperlink w:anchor="_Toc243937739" w:history="1">
+      <w:hyperlink w:anchor="_Toc243938834" w:history="1">
         <w:r>
           <w:rPr>
             <w:rStyle w:val="Hyperlink"/>
@@ -635,7 +641,7 @@
             <w:noProof/>
             <w:webHidden/>
           </w:rPr>
-          <w:instrText xml:space="preserve"> PAGEREF _Toc243937739 \h </w:instrText>
+          <w:instrText xml:space="preserve"> PAGEREF _Toc243938834 \h </w:instrText>
         </w:r>
         <w:r>
           <w:rPr>
@@ -681,7 +687,7 @@
           <w14:ligatures w14:val="standardContextual"/>
         </w:rPr>
       </w:pPr>
-      <w:hyperlink w:anchor="_Toc243937740" w:history="1">
+      <w:hyperlink w:anchor="_Toc243938835" w:history="1">
         <w:r>
           <w:rPr>
             <w:rStyle w:val="Hyperlink"/>
@@ -708,7 +714,7 @@
             <w:noProof/>
             <w:webHidden/>
           </w:rPr>
-          <w:instrText xml:space="preserve"> PAGEREF _Toc243937740 \h </w:instrText>
+          <w:instrText xml:space="preserve"> PAGEREF _Toc243938835 \h </w:instrText>
         </w:r>
         <w:r>
           <w:rPr>
@@ -754,7 +760,7 @@
           <w14:ligatures w14:val="standardContextual"/>
         </w:rPr>
       </w:pPr>
-      <w:hyperlink w:anchor="_Toc243937741" w:history="1">
+      <w:hyperlink w:anchor="_Toc243938836" w:history="1">
         <w:r>
           <w:rPr>
             <w:rStyle w:val="Hyperlink"/>
@@ -781,7 +787,7 @@
             <w:noProof/>
             <w:webHidden/>
           </w:rPr>
-          <w:instrText xml:space="preserve"> PAGEREF _Toc243937741 \h </w:instrText>
+          <w:instrText xml:space="preserve"> PAGEREF _Toc243938836 \h </w:instrText>
         </w:r>
         <w:r>
           <w:rPr>
@@ -827,7 +833,7 @@
           <w14:ligatures w14:val="standardContextual"/>
         </w:rPr>
       </w:pPr>
-      <w:hyperlink w:anchor="_Toc243937742" w:history="1">
+      <w:hyperlink w:anchor="_Toc243938837" w:history="1">
         <w:r>
           <w:rPr>
             <w:rStyle w:val="Hyperlink"/>
@@ -854,7 +860,7 @@
             <w:noProof/>
             <w:webHidden/>
           </w:rPr>
-          <w:instrText xml:space="preserve"> PAGEREF _Toc243937742 \h </w:instrText>
+          <w:instrText xml:space="preserve"> PAGEREF _Toc243938837 \h </w:instrText>
         </w:r>
         <w:r>
           <w:rPr>
@@ -900,7 +906,7 @@
           <w14:ligatures w14:val="standardContextual"/>
         </w:rPr>
       </w:pPr>
-      <w:hyperlink w:anchor="_Toc243937743" w:history="1">
+      <w:hyperlink w:anchor="_Toc243938838" w:history="1">
         <w:r>
           <w:rPr>
             <w:rStyle w:val="Hyperlink"/>
@@ -927,7 +933,7 @@
             <w:noProof/>
             <w:webHidden/>
           </w:rPr>
-          <w:instrText xml:space="preserve"> PAGEREF _Toc243937743 \h </w:instrText>
+          <w:instrText xml:space="preserve"> PAGEREF _Toc243938838 \h </w:instrText>
         </w:r>
         <w:r>
           <w:rPr>
@@ -973,7 +979,7 @@
           <w14:ligatures w14:val="standardContextual"/>
         </w:rPr>
       </w:pPr>
-      <w:hyperlink w:anchor="_Toc243937744" w:history="1">
+      <w:hyperlink w:anchor="_Toc243938839" w:history="1">
         <w:r>
           <w:rPr>
             <w:rStyle w:val="Hyperlink"/>
@@ -1000,7 +1006,7 @@
             <w:noProof/>
             <w:webHidden/>
           </w:rPr>
-          <w:instrText xml:space="preserve"> PAGEREF _Toc243937744 \h </w:instrText>
+          <w:instrText xml:space="preserve"> PAGEREF _Toc243938839 \h </w:instrText>
         </w:r>
         <w:r>
           <w:rPr>
@@ -1046,7 +1052,7 @@
           <w14:ligatures w14:val="standardContextual"/>
         </w:rPr>
       </w:pPr>
-      <w:hyperlink w:anchor="_Toc243937745" w:history="1">
+      <w:hyperlink w:anchor="_Toc243938840" w:history="1">
         <w:r>
           <w:rPr>
             <w:rStyle w:val="Hyperlink"/>
@@ -1073,7 +1079,7 @@
             <w:noProof/>
             <w:webHidden/>
           </w:rPr>
-          <w:instrText xml:space="preserve"> PAGEREF _Toc243937745 \h </w:instrText>
+          <w:instrText xml:space="preserve"> PAGEREF _Toc243938840 \h </w:instrText>
         </w:r>
         <w:r>
           <w:rPr>
@@ -1119,7 +1125,7 @@
           <w14:ligatures w14:val="standardContextual"/>
         </w:rPr>
       </w:pPr>
-      <w:hyperlink w:anchor="_Toc243937746" w:history="1">
+      <w:hyperlink w:anchor="_Toc243938841" w:history="1">
         <w:r>
           <w:rPr>
             <w:rStyle w:val="Hyperlink"/>
@@ -1146,7 +1152,7 @@
             <w:noProof/>
             <w:webHidden/>
           </w:rPr>
-          <w:instrText xml:space="preserve"> PAGEREF _Toc243937746 \h </w:instrText>
+          <w:instrText xml:space="preserve"> PAGEREF _Toc243938841 \h </w:instrText>
         </w:r>
         <w:r>
           <w:rPr>
@@ -1192,7 +1198,7 @@
           <w14:ligatures w14:val="standardContextual"/>
         </w:rPr>
       </w:pPr>
-      <w:hyperlink w:anchor="_Toc243937747" w:history="1">
+      <w:hyperlink w:anchor="_Toc243938842" w:history="1">
         <w:r>
           <w:rPr>
             <w:rStyle w:val="Hyperlink"/>
@@ -1219,7 +1225,7 @@
             <w:noProof/>
             <w:webHidden/>
           </w:rPr>
-          <w:instrText xml:space="preserve"> PAGEREF _Toc243937747 \h </w:instrText>
+          <w:instrText xml:space="preserve"> PAGEREF _Toc243938842 \h </w:instrText>
         </w:r>
         <w:r>
           <w:rPr>
@@ -1265,7 +1271,7 @@
           <w14:ligatures w14:val="standardContextual"/>
         </w:rPr>
       </w:pPr>
-      <w:hyperlink w:anchor="_Toc243937748" w:history="1">
+      <w:hyperlink w:anchor="_Toc243938843" w:history="1">
         <w:r>
           <w:rPr>
             <w:rStyle w:val="Hyperlink"/>
@@ -1292,7 +1298,7 @@
             <w:noProof/>
             <w:webHidden/>
           </w:rPr>
-          <w:instrText xml:space="preserve"> PAGEREF _Toc243937748 \h </w:instrText>
+          <w:instrText xml:space="preserve"> PAGEREF _Toc243938843 \h </w:instrText>
         </w:r>
         <w:r>
           <w:rPr>
@@ -1338,7 +1344,7 @@
           <w14:ligatures w14:val="standardContextual"/>
         </w:rPr>
       </w:pPr>
-      <w:hyperlink w:anchor="_Toc243937749" w:history="1">
+      <w:hyperlink w:anchor="_Toc243938844" w:history="1">
         <w:r>
           <w:rPr>
             <w:rStyle w:val="Hyperlink"/>
@@ -1365,7 +1371,7 @@
             <w:noProof/>
             <w:webHidden/>
           </w:rPr>
-          <w:instrText xml:space="preserve"> PAGEREF _Toc243937749 \h </w:instrText>
+          <w:instrText xml:space="preserve"> PAGEREF _Toc243938844 \h </w:instrText>
         </w:r>
         <w:r>
           <w:rPr>
@@ -1411,7 +1417,7 @@
           <w14:ligatures w14:val="standardContextual"/>
         </w:rPr>
       </w:pPr>
-      <w:hyperlink w:anchor="_Toc243937750" w:history="1">
+      <w:hyperlink w:anchor="_Toc243938845" w:history="1">
         <w:r>
           <w:rPr>
             <w:rStyle w:val="Hyperlink"/>
@@ -1438,7 +1444,7 @@
             <w:noProof/>
             <w:webHidden/>
           </w:rPr>
-          <w:instrText xml:space="preserve"> PAGEREF _Toc243937750 \h </w:instrText>
+          <w:instrText xml:space="preserve"> PAGEREF _Toc243938845 \h </w:instrText>
         </w:r>
         <w:r>
           <w:rPr>
@@ -1484,7 +1490,7 @@
           <w14:ligatures w14:val="standardContextual"/>
         </w:rPr>
       </w:pPr>
-      <w:hyperlink w:anchor="_Toc243937751" w:history="1">
+      <w:hyperlink w:anchor="_Toc243938846" w:history="1">
         <w:r>
           <w:rPr>
             <w:rStyle w:val="Hyperlink"/>
@@ -1511,7 +1517,7 @@
             <w:noProof/>
             <w:webHidden/>
           </w:rPr>
-          <w:instrText xml:space="preserve"> PAGEREF _Toc243937751 \h </w:instrText>
+          <w:instrText xml:space="preserve"> PAGEREF _Toc243938846 \h </w:instrText>
         </w:r>
         <w:r>
           <w:rPr>
@@ -1557,7 +1563,7 @@
           <w14:ligatures w14:val="standardContextual"/>
         </w:rPr>
       </w:pPr>
-      <w:hyperlink w:anchor="_Toc243937752" w:history="1">
+      <w:hyperlink w:anchor="_Toc243938847" w:history="1">
         <w:r>
           <w:rPr>
             <w:rStyle w:val="Hyperlink"/>
@@ -1584,7 +1590,7 @@
             <w:noProof/>
             <w:webHidden/>
           </w:rPr>
-          <w:instrText xml:space="preserve"> PAGEREF _Toc243937752 \h </w:instrText>
+          <w:instrText xml:space="preserve"> PAGEREF _Toc243938847 \h </w:instrText>
         </w:r>
         <w:r>
           <w:rPr>
@@ -1630,7 +1636,7 @@
           <w14:ligatures w14:val="standardContextual"/>
         </w:rPr>
       </w:pPr>
-      <w:hyperlink w:anchor="_Toc243937753" w:history="1">
+      <w:hyperlink w:anchor="_Toc243938848" w:history="1">
         <w:r>
           <w:rPr>
             <w:rStyle w:val="Hyperlink"/>
@@ -1657,7 +1663,7 @@
             <w:noProof/>
             <w:webHidden/>
           </w:rPr>
-          <w:instrText xml:space="preserve"> PAGEREF _Toc243937753 \h </w:instrText>
+          <w:instrText xml:space="preserve"> PAGEREF _Toc243938848 \h </w:instrText>
         </w:r>
         <w:r>
           <w:rPr>
@@ -1703,7 +1709,7 @@
           <w14:ligatures w14:val="standardContextual"/>
         </w:rPr>
       </w:pPr>
-      <w:hyperlink w:anchor="_Toc243937754" w:history="1">
+      <w:hyperlink w:anchor="_Toc243938849" w:history="1">
         <w:r>
           <w:rPr>
             <w:rStyle w:val="Hyperlink"/>
@@ -1730,7 +1736,7 @@
             <w:noProof/>
             <w:webHidden/>
           </w:rPr>
-          <w:instrText xml:space="preserve"> PAGEREF _Toc243937754 \h </w:instrText>
+          <w:instrText xml:space="preserve"> PAGEREF _Toc243938849 \h </w:instrText>
         </w:r>
         <w:r>
           <w:rPr>
@@ -1776,7 +1782,7 @@
           <w14:ligatures w14:val="standardContextual"/>
         </w:rPr>
       </w:pPr>
-      <w:hyperlink w:anchor="_Toc243937755" w:history="1">
+      <w:hyperlink w:anchor="_Toc243938850" w:history="1">
         <w:r>
           <w:rPr>
             <w:rStyle w:val="Hyperlink"/>
@@ -1803,7 +1809,7 @@
             <w:noProof/>
             <w:webHidden/>
           </w:rPr>
-          <w:instrText xml:space="preserve"> PAGEREF _Toc243937755 \h </w:instrText>
+          <w:instrText xml:space="preserve"> PAGEREF _Toc243938850 \h </w:instrText>
         </w:r>
         <w:r>
           <w:rPr>
@@ -1849,7 +1855,7 @@
           <w14:ligatures w14:val="standardContextual"/>
         </w:rPr>
       </w:pPr>
-      <w:hyperlink w:anchor="_Toc243937756" w:history="1">
+      <w:hyperlink w:anchor="_Toc243938851" w:history="1">
         <w:r>
           <w:rPr>
             <w:rStyle w:val="Hyperlink"/>
@@ -1876,7 +1882,7 @@
             <w:noProof/>
             <w:webHidden/>
           </w:rPr>
-          <w:instrText xml:space="preserve"> PAGEREF _Toc243937756 \h </w:instrText>
+          <w:instrText xml:space="preserve"> PAGEREF _Toc243938851 \h </w:instrText>
         </w:r>
         <w:r>
           <w:rPr>
@@ -1922,7 +1928,7 @@
           <w14:ligatures w14:val="standardContextual"/>
         </w:rPr>
       </w:pPr>
-      <w:hyperlink w:anchor="_Toc243937757" w:history="1">
+      <w:hyperlink w:anchor="_Toc243938852" w:history="1">
         <w:r>
           <w:rPr>
             <w:rStyle w:val="Hyperlink"/>
@@ -1949,7 +1955,7 @@
             <w:noProof/>
             <w:webHidden/>
           </w:rPr>
-          <w:instrText xml:space="preserve"> PAGEREF _Toc243937757 \h </w:instrText>
+          <w:instrText xml:space="preserve"> PAGEREF _Toc243938852 \h </w:instrText>
         </w:r>
         <w:r>
           <w:rPr>
@@ -1995,13 +2001,13 @@
           <w14:ligatures w14:val="standardContextual"/>
         </w:rPr>
       </w:pPr>
-      <w:hyperlink w:anchor="_Toc243937758" w:history="1">
+      <w:hyperlink w:anchor="_Toc243938853" w:history="1">
         <w:r>
           <w:rPr>
             <w:rStyle w:val="Hyperlink"/>
             <w:noProof/>
           </w:rPr>
-          <w:t>References</w:t>
+          <w:t>Data, Code and Output Availability</w:t>
         </w:r>
         <w:r>
           <w:rPr>
@@ -2022,7 +2028,7 @@
             <w:noProof/>
             <w:webHidden/>
           </w:rPr>
-          <w:instrText xml:space="preserve"> PAGEREF _Toc243937758 \h </w:instrText>
+          <w:instrText xml:space="preserve"> PAGEREF _Toc243938853 \h </w:instrText>
         </w:r>
         <w:r>
           <w:rPr>
@@ -2068,13 +2074,13 @@
           <w14:ligatures w14:val="standardContextual"/>
         </w:rPr>
       </w:pPr>
-      <w:hyperlink w:anchor="_Toc243937759" w:history="1">
+      <w:hyperlink w:anchor="_Toc243938854" w:history="1">
         <w:r>
           <w:rPr>
             <w:rStyle w:val="Hyperlink"/>
             <w:noProof/>
           </w:rPr>
-          <w:t>Appendix A. Data Dictionary</w:t>
+          <w:t>References</w:t>
         </w:r>
         <w:r>
           <w:rPr>
@@ -2095,7 +2101,7 @@
             <w:noProof/>
             <w:webHidden/>
           </w:rPr>
-          <w:instrText xml:space="preserve"> PAGEREF _Toc243937759 \h </w:instrText>
+          <w:instrText xml:space="preserve"> PAGEREF _Toc243938854 \h </w:instrText>
         </w:r>
         <w:r>
           <w:rPr>
@@ -2141,13 +2147,13 @@
           <w14:ligatures w14:val="standardContextual"/>
         </w:rPr>
       </w:pPr>
-      <w:hyperlink w:anchor="_Toc243937760" w:history="1">
+      <w:hyperlink w:anchor="_Toc243938855" w:history="1">
         <w:r>
           <w:rPr>
             <w:rStyle w:val="Hyperlink"/>
             <w:noProof/>
           </w:rPr>
-          <w:t>Appendix B. Configuration</w:t>
+          <w:t>Appendix A. Data Dictionary</w:t>
         </w:r>
         <w:r>
           <w:rPr>
@@ -2168,7 +2174,7 @@
             <w:noProof/>
             <w:webHidden/>
           </w:rPr>
-          <w:instrText xml:space="preserve"> PAGEREF _Toc243937760 \h </w:instrText>
+          <w:instrText xml:space="preserve"> PAGEREF _Toc243938855 \h </w:instrText>
         </w:r>
         <w:r>
           <w:rPr>
@@ -2214,7 +2220,80 @@
           <w14:ligatures w14:val="standardContextual"/>
         </w:rPr>
       </w:pPr>
-      <w:hyperlink w:anchor="_Toc243937761" w:history="1">
+      <w:hyperlink w:anchor="_Toc243938856" w:history="1">
+        <w:r>
+          <w:rPr>
+            <w:rStyle w:val="Hyperlink"/>
+            <w:noProof/>
+          </w:rPr>
+          <w:t>Appendix B. Configuration</w:t>
+        </w:r>
+        <w:r>
+          <w:rPr>
+            <w:noProof/>
+            <w:webHidden/>
+          </w:rPr>
+          <w:tab/>
+        </w:r>
+        <w:r>
+          <w:rPr>
+            <w:noProof/>
+            <w:webHidden/>
+          </w:rPr>
+          <w:fldChar w:fldCharType="begin"/>
+        </w:r>
+        <w:r>
+          <w:rPr>
+            <w:noProof/>
+            <w:webHidden/>
+          </w:rPr>
+          <w:instrText xml:space="preserve"> PAGEREF _Toc243938856 \h </w:instrText>
+        </w:r>
+        <w:r>
+          <w:rPr>
+            <w:noProof/>
+            <w:webHidden/>
+          </w:rPr>
+        </w:r>
+        <w:r>
+          <w:rPr>
+            <w:noProof/>
+            <w:webHidden/>
+          </w:rPr>
+          <w:fldChar w:fldCharType="separate"/>
+        </w:r>
+        <w:r>
+          <w:rPr>
+            <w:noProof/>
+            <w:webHidden/>
+          </w:rPr>
+          <w:t>19</w:t>
+        </w:r>
+        <w:r>
+          <w:rPr>
+            <w:noProof/>
+            <w:webHidden/>
+          </w:rPr>
+          <w:fldChar w:fldCharType="end"/>
+        </w:r>
+      </w:hyperlink>
+    </w:p>
+    <w:p>
+      <w:pPr>
+        <w:pStyle w:val="TOC1"/>
+        <w:tabs>
+          <w:tab w:val="right" w:leader="dot" w:pos="9174"/>
+        </w:tabs>
+        <w:rPr>
+          <w:rFonts w:asciiTheme="minorHAnsi" w:eastAsiaTheme="minorEastAsia" w:hAnsiTheme="minorHAnsi"/>
+          <w:noProof/>
+          <w:kern w:val="2"/>
+          <w:sz w:val="24"/>
+          <w:szCs w:val="24"/>
+          <w14:ligatures w14:val="standardContextual"/>
+        </w:rPr>
+      </w:pPr>
+      <w:hyperlink w:anchor="_Toc243938857" w:history="1">
         <w:r>
           <w:rPr>
             <w:rStyle w:val="Hyperlink"/>
@@ -2241,80 +2320,7 @@
             <w:noProof/>
             <w:webHidden/>
           </w:rPr>
-          <w:instrText xml:space="preserve"> PAGEREF _Toc243937761 \h </w:instrText>
-        </w:r>
-        <w:r>
-          <w:rPr>
-            <w:noProof/>
-            <w:webHidden/>
-          </w:rPr>
-        </w:r>
-        <w:r>
-          <w:rPr>
-            <w:noProof/>
-            <w:webHidden/>
-          </w:rPr>
-          <w:fldChar w:fldCharType="separate"/>
-        </w:r>
-        <w:r>
-          <w:rPr>
-            <w:noProof/>
-            <w:webHidden/>
-          </w:rPr>
-          <w:t>20</w:t>
-        </w:r>
-        <w:r>
-          <w:rPr>
-            <w:noProof/>
-            <w:webHidden/>
-          </w:rPr>
-          <w:fldChar w:fldCharType="end"/>
-        </w:r>
-      </w:hyperlink>
-    </w:p>
-    <w:p>
-      <w:pPr>
-        <w:pStyle w:val="TOC1"/>
-        <w:tabs>
-          <w:tab w:val="right" w:leader="dot" w:pos="9174"/>
-        </w:tabs>
-        <w:rPr>
-          <w:rFonts w:asciiTheme="minorHAnsi" w:eastAsiaTheme="minorEastAsia" w:hAnsiTheme="minorHAnsi"/>
-          <w:noProof/>
-          <w:kern w:val="2"/>
-          <w:sz w:val="24"/>
-          <w:szCs w:val="24"/>
-          <w14:ligatures w14:val="standardContextual"/>
-        </w:rPr>
-      </w:pPr>
-      <w:hyperlink w:anchor="_Toc243937762" w:history="1">
-        <w:r>
-          <w:rPr>
-            <w:rStyle w:val="Hyperlink"/>
-            <w:noProof/>
-          </w:rPr>
-          <w:t>Appendix D. Reproducibility Instructions</w:t>
-        </w:r>
-        <w:r>
-          <w:rPr>
-            <w:noProof/>
-            <w:webHidden/>
-          </w:rPr>
-          <w:tab/>
-        </w:r>
-        <w:r>
-          <w:rPr>
-            <w:noProof/>
-            <w:webHidden/>
-          </w:rPr>
-          <w:fldChar w:fldCharType="begin"/>
-        </w:r>
-        <w:r>
-          <w:rPr>
-            <w:noProof/>
-            <w:webHidden/>
-          </w:rPr>
-          <w:instrText xml:space="preserve"> PAGEREF _Toc243937762 \h </w:instrText>
+          <w:instrText xml:space="preserve"> PAGEREF _Toc243938857 \h </w:instrText>
         </w:r>
         <w:r>
           <w:rPr>
@@ -2346,6 +2352,79 @@
       </w:hyperlink>
     </w:p>
     <w:p>
+      <w:pPr>
+        <w:pStyle w:val="TOC1"/>
+        <w:tabs>
+          <w:tab w:val="right" w:leader="dot" w:pos="9174"/>
+        </w:tabs>
+        <w:rPr>
+          <w:rFonts w:asciiTheme="minorHAnsi" w:eastAsiaTheme="minorEastAsia" w:hAnsiTheme="minorHAnsi"/>
+          <w:noProof/>
+          <w:kern w:val="2"/>
+          <w:sz w:val="24"/>
+          <w:szCs w:val="24"/>
+          <w14:ligatures w14:val="standardContextual"/>
+        </w:rPr>
+      </w:pPr>
+      <w:hyperlink w:anchor="_Toc243938858" w:history="1">
+        <w:r>
+          <w:rPr>
+            <w:rStyle w:val="Hyperlink"/>
+            <w:noProof/>
+          </w:rPr>
+          <w:t>Appendix D. Reproducibility Instructions</w:t>
+        </w:r>
+        <w:r>
+          <w:rPr>
+            <w:noProof/>
+            <w:webHidden/>
+          </w:rPr>
+          <w:tab/>
+        </w:r>
+        <w:r>
+          <w:rPr>
+            <w:noProof/>
+            <w:webHidden/>
+          </w:rPr>
+          <w:fldChar w:fldCharType="begin"/>
+        </w:r>
+        <w:r>
+          <w:rPr>
+            <w:noProof/>
+            <w:webHidden/>
+          </w:rPr>
+          <w:instrText xml:space="preserve"> PAGEREF _Toc243938858 \h </w:instrText>
+        </w:r>
+        <w:r>
+          <w:rPr>
+            <w:noProof/>
+            <w:webHidden/>
+          </w:rPr>
+        </w:r>
+        <w:r>
+          <w:rPr>
+            <w:noProof/>
+            <w:webHidden/>
+          </w:rPr>
+          <w:fldChar w:fldCharType="separate"/>
+        </w:r>
+        <w:r>
+          <w:rPr>
+            <w:noProof/>
+            <w:webHidden/>
+          </w:rPr>
+          <w:t>22</w:t>
+        </w:r>
+        <w:r>
+          <w:rPr>
+            <w:noProof/>
+            <w:webHidden/>
+          </w:rPr>
+          <w:fldChar w:fldCharType="end"/>
+        </w:r>
+      </w:hyperlink>
+    </w:p>
+    <w:p>
       <w:r>
         <w:fldChar w:fldCharType="end"/>
       </w:r>
@@ -2359,7 +2438,7 @@
       <w:pPr>
         <w:pStyle w:val="Heading1"/>
       </w:pPr>
-      <w:bookmarkStart w:id="1" w:name="_Toc243937736"/>
+      <w:bookmarkStart w:id="1" w:name="_Toc243938831"/>
       <w:r>
         <w:lastRenderedPageBreak/>
         <w:t>Abstract</w:t>
@@ -2401,7 +2480,7 @@
       <w:pPr>
         <w:pStyle w:val="Heading1"/>
       </w:pPr>
-      <w:bookmarkStart w:id="2" w:name="_Toc243937737"/>
+      <w:bookmarkStart w:id="2" w:name="_Toc243938832"/>
       <w:r>
         <w:t>1. Introduction and Recap of the Research Problem</w:t>
       </w:r>
@@ -2432,7 +2511,19 @@
         <w:t>to investigate whether standardised antenna geometry and electromagnetic images can support antenna-performance classification and explainable visual analysis.</w:t>
       </w:r>
       <w:r>
-        <w:t xml:space="preserve"> Module 1 is the image branch of the overall framework. The numerical-text surrogate, the multimodal fusion stage and the NSGA-II optimisation form Module 2, which is documented in a separate report and repository (https://github.com/&lt;your-github-username&gt;/module2-numerical-surrogate-antenna-design). The only artefact Module 1 passes to Module 2 is the 384-dimensional image embedding of each design.</w:t>
+        <w:t xml:space="preserve"> Module 1 is the image branch of the overall framework. The numerical-text surrogate, the multimodal fusion stage and the NSGA-II optimisation form Module 2, which is documented in a separate report and repository (</w:t>
+      </w:r>
+      <w:hyperlink r:id="rId9">
+        <w:r>
+          <w:rPr>
+            <w:color w:val="1F5FA8"/>
+            <w:u w:val="single"/>
+          </w:rPr>
+          <w:t>https://github.com/rathiabeth/module2-numerical-surrogate-antenna-design</w:t>
+        </w:r>
+      </w:hyperlink>
+      <w:r>
+        <w:t>). The only artefact Module 1 passes to Module 2 is the 384-dimensional image embedding of each design.</w:t>
       </w:r>
     </w:p>
     <w:p>
@@ -2566,12 +2657,16 @@
             <w:pPr>
               <w:keepNext/>
             </w:pPr>
-            <w:r>
-              <w:rPr>
-                <w:sz w:val="19"/>
-              </w:rPr>
-              <w:t>docs/DATASET_SURVEY.md</w:t>
-            </w:r>
+            <w:hyperlink r:id="rId10">
+              <w:r>
+                <w:rPr>
+                  <w:color w:val="1F5FA8"/>
+                  <w:sz w:val="19"/>
+                  <w:u w:val="single"/>
+                </w:rPr>
+                <w:t>docs/DATASET_SURVEY.md</w:t>
+              </w:r>
+            </w:hyperlink>
           </w:p>
         </w:tc>
       </w:tr>
@@ -2623,12 +2718,48 @@
             <w:pPr>
               <w:keepNext/>
             </w:pPr>
-            <w:r>
-              <w:rPr>
-                <w:sz w:val="19"/>
-              </w:rPr>
-              <w:t>src/preprocessing.py, src/dataset.py, data/</w:t>
-            </w:r>
+            <w:hyperlink r:id="rId11">
+              <w:r>
+                <w:rPr>
+                  <w:color w:val="1F5FA8"/>
+                  <w:sz w:val="19"/>
+                  <w:u w:val="single"/>
+                </w:rPr>
+                <w:t>src/preprocessing.py</w:t>
+              </w:r>
+            </w:hyperlink>
+            <w:r>
+              <w:rPr>
+                <w:sz w:val="19"/>
+              </w:rPr>
+              <w:t xml:space="preserve">, </w:t>
+            </w:r>
+            <w:hyperlink r:id="rId12">
+              <w:r>
+                <w:rPr>
+                  <w:color w:val="1F5FA8"/>
+                  <w:sz w:val="19"/>
+                  <w:u w:val="single"/>
+                </w:rPr>
+                <w:t>src/dataset.py</w:t>
+              </w:r>
+            </w:hyperlink>
+            <w:r>
+              <w:rPr>
+                <w:sz w:val="19"/>
+              </w:rPr>
+              <w:t xml:space="preserve">, </w:t>
+            </w:r>
+            <w:hyperlink r:id="rId13">
+              <w:r>
+                <w:rPr>
+                  <w:color w:val="1F5FA8"/>
+                  <w:sz w:val="19"/>
+                  <w:u w:val="single"/>
+                </w:rPr>
+                <w:t>data</w:t>
+              </w:r>
+            </w:hyperlink>
           </w:p>
         </w:tc>
       </w:tr>
@@ -2677,12 +2808,32 @@
             <w:pPr>
               <w:keepNext/>
             </w:pPr>
-            <w:r>
-              <w:rPr>
-                <w:sz w:val="19"/>
-              </w:rPr>
-              <w:t>src/train_vit.py, results/metrics/</w:t>
-            </w:r>
+            <w:hyperlink r:id="rId14">
+              <w:r>
+                <w:rPr>
+                  <w:color w:val="1F5FA8"/>
+                  <w:sz w:val="19"/>
+                  <w:u w:val="single"/>
+                </w:rPr>
+                <w:t>src/train_vit.py</w:t>
+              </w:r>
+            </w:hyperlink>
+            <w:r>
+              <w:rPr>
+                <w:sz w:val="19"/>
+              </w:rPr>
+              <w:t xml:space="preserve">, </w:t>
+            </w:r>
+            <w:hyperlink r:id="rId15">
+              <w:r>
+                <w:rPr>
+                  <w:color w:val="1F5FA8"/>
+                  <w:sz w:val="19"/>
+                  <w:u w:val="single"/>
+                </w:rPr>
+                <w:t>results/metrics</w:t>
+              </w:r>
+            </w:hyperlink>
           </w:p>
         </w:tc>
       </w:tr>
@@ -2734,12 +2885,16 @@
             <w:pPr>
               <w:keepNext/>
             </w:pPr>
-            <w:r>
-              <w:rPr>
-                <w:sz w:val="19"/>
-              </w:rPr>
-              <w:t>src/train_baseline.py</w:t>
-            </w:r>
+            <w:hyperlink r:id="rId16">
+              <w:r>
+                <w:rPr>
+                  <w:color w:val="1F5FA8"/>
+                  <w:sz w:val="19"/>
+                  <w:u w:val="single"/>
+                </w:rPr>
+                <w:t>src/train_baseline.py</w:t>
+              </w:r>
+            </w:hyperlink>
           </w:p>
         </w:tc>
       </w:tr>
@@ -2788,12 +2943,16 @@
             <w:pPr>
               <w:keepNext/>
             </w:pPr>
-            <w:r>
-              <w:rPr>
-                <w:sz w:val="19"/>
-              </w:rPr>
-              <w:t>src/evaluate.py</w:t>
-            </w:r>
+            <w:hyperlink r:id="rId17">
+              <w:r>
+                <w:rPr>
+                  <w:color w:val="1F5FA8"/>
+                  <w:sz w:val="19"/>
+                  <w:u w:val="single"/>
+                </w:rPr>
+                <w:t>src/evaluate.py</w:t>
+              </w:r>
+            </w:hyperlink>
           </w:p>
         </w:tc>
       </w:tr>
@@ -2845,12 +3004,16 @@
             <w:pPr>
               <w:keepNext/>
             </w:pPr>
-            <w:r>
-              <w:rPr>
-                <w:sz w:val="19"/>
-              </w:rPr>
-              <w:t>src/explainability.py</w:t>
-            </w:r>
+            <w:hyperlink r:id="rId18">
+              <w:r>
+                <w:rPr>
+                  <w:color w:val="1F5FA8"/>
+                  <w:sz w:val="19"/>
+                  <w:u w:val="single"/>
+                </w:rPr>
+                <w:t>src/explainability.py</w:t>
+              </w:r>
+            </w:hyperlink>
           </w:p>
         </w:tc>
       </w:tr>
@@ -2871,7 +3034,7 @@
               <w:rPr>
                 <w:sz w:val="19"/>
               </w:rPr>
-              <w:t>Embedding export for Module 2 fusion</w:t>
+              <w:t>Automated tests</w:t>
             </w:r>
           </w:p>
         </w:tc>
@@ -2899,12 +3062,32 @@
             <w:pPr>
               <w:keepNext/>
             </w:pPr>
-            <w:r>
-              <w:rPr>
-                <w:sz w:val="19"/>
-              </w:rPr>
-              <w:t>results/features/</w:t>
-            </w:r>
+            <w:hyperlink r:id="rId19">
+              <w:r>
+                <w:rPr>
+                  <w:color w:val="1F5FA8"/>
+                  <w:sz w:val="19"/>
+                  <w:u w:val="single"/>
+                </w:rPr>
+                <w:t>tests</w:t>
+              </w:r>
+            </w:hyperlink>
+            <w:r>
+              <w:rPr>
+                <w:sz w:val="19"/>
+              </w:rPr>
+              <w:t xml:space="preserve">, </w:t>
+            </w:r>
+            <w:hyperlink r:id="rId20">
+              <w:r>
+                <w:rPr>
+                  <w:color w:val="1F5FA8"/>
+                  <w:sz w:val="19"/>
+                  <w:u w:val="single"/>
+                </w:rPr>
+                <w:t>results/test_report.txt</w:t>
+              </w:r>
+            </w:hyperlink>
           </w:p>
         </w:tc>
       </w:tr>
@@ -2926,7 +3109,7 @@
               <w:rPr>
                 <w:sz w:val="19"/>
               </w:rPr>
-              <w:t>HFSS hybrid-slotted DGS images (geometry, current, E-field)</w:t>
+              <w:t>Embedding export for Module 2 fusion</w:t>
             </w:r>
           </w:p>
         </w:tc>
@@ -2943,7 +3126,7 @@
               <w:rPr>
                 <w:sz w:val="19"/>
               </w:rPr>
-              <w:t>Proposed (HFSS unavailable)</w:t>
+              <w:t>Completed and executed</w:t>
             </w:r>
           </w:p>
         </w:tc>
@@ -2956,12 +3139,16 @@
             <w:pPr>
               <w:keepNext/>
             </w:pPr>
-            <w:r>
-              <w:rPr>
-                <w:sz w:val="19"/>
-              </w:rPr>
-              <w:t>Section 11</w:t>
-            </w:r>
+            <w:hyperlink r:id="rId21">
+              <w:r>
+                <w:rPr>
+                  <w:color w:val="1F5FA8"/>
+                  <w:sz w:val="19"/>
+                  <w:u w:val="single"/>
+                </w:rPr>
+                <w:t>results/features</w:t>
+              </w:r>
+            </w:hyperlink>
           </w:p>
         </w:tc>
       </w:tr>
@@ -2975,6 +3162,61 @@
             <w:tcW w:w="3061" w:type="dxa"/>
           </w:tcPr>
           <w:p>
+            <w:pPr>
+              <w:keepNext/>
+            </w:pPr>
+            <w:r>
+              <w:rPr>
+                <w:sz w:val="19"/>
+              </w:rPr>
+              <w:t>HFSS hybrid-slotted DGS images (geometry, current, E-field)</w:t>
+            </w:r>
+          </w:p>
+        </w:tc>
+        <w:tc>
+          <w:tcPr>
+            <w:tcW w:w="3061" w:type="dxa"/>
+          </w:tcPr>
+          <w:p>
+            <w:pPr>
+              <w:keepNext/>
+            </w:pPr>
+            <w:r>
+              <w:rPr>
+                <w:sz w:val="19"/>
+              </w:rPr>
+              <w:t>Proposed (HFSS unavailable)</w:t>
+            </w:r>
+          </w:p>
+        </w:tc>
+        <w:tc>
+          <w:tcPr>
+            <w:tcW w:w="3061" w:type="dxa"/>
+          </w:tcPr>
+          <w:p>
+            <w:pPr>
+              <w:keepNext/>
+            </w:pPr>
+            <w:r>
+              <w:rPr>
+                <w:sz w:val="19"/>
+              </w:rPr>
+              <w:t>Section 11</w:t>
+            </w:r>
+          </w:p>
+        </w:tc>
+      </w:tr>
+      <w:tr>
+        <w:trPr>
+          <w:cantSplit/>
+          <w:jc w:val="center"/>
+        </w:trPr>
+        <w:tc>
+          <w:tcPr>
+            <w:tcW w:w="3061" w:type="dxa"/>
+            <w:shd w:val="clear" w:color="auto" w:fill="EEF4FA"/>
+          </w:tcPr>
+          <w:p>
             <w:r>
               <w:rPr>
                 <w:sz w:val="19"/>
@@ -2986,6 +3228,7 @@
         <w:tc>
           <w:tcPr>
             <w:tcW w:w="3061" w:type="dxa"/>
+            <w:shd w:val="clear" w:color="auto" w:fill="EEF4FA"/>
           </w:tcPr>
           <w:p>
             <w:r>
@@ -2999,14 +3242,19 @@
         <w:tc>
           <w:tcPr>
             <w:tcW w:w="3061" w:type="dxa"/>
-          </w:tcPr>
-          <w:p>
-            <w:r>
-              <w:rPr>
-                <w:sz w:val="19"/>
-              </w:rPr>
-              <w:t>results/figures/module1_architecture.png</w:t>
-            </w:r>
+            <w:shd w:val="clear" w:color="auto" w:fill="EEF4FA"/>
+          </w:tcPr>
+          <w:p>
+            <w:hyperlink r:id="rId22">
+              <w:r>
+                <w:rPr>
+                  <w:color w:val="1F5FA8"/>
+                  <w:sz w:val="19"/>
+                  <w:u w:val="single"/>
+                </w:rPr>
+                <w:t>results/figures/module1_architecture.png</w:t>
+              </w:r>
+            </w:hyperlink>
           </w:p>
         </w:tc>
       </w:tr>
@@ -3022,7 +3270,7 @@
           <w:noProof/>
         </w:rPr>
         <w:drawing>
-          <wp:inline distT="0" distB="0" distL="0" distR="0" wp14:anchorId="1E0DF639" wp14:editId="18AB9BF6">
+          <wp:inline distT="0" distB="0" distL="0" distR="0" wp14:anchorId="1BAE283C" wp14:editId="034A5766">
             <wp:extent cx="5760720" cy="2747420"/>
             <wp:effectExtent l="0" t="0" r="0" b="0"/>
             <wp:docPr id="1" name="Picture 1"/>
@@ -3037,7 +3285,7 @@
                     <pic:cNvPicPr/>
                   </pic:nvPicPr>
                   <pic:blipFill>
-                    <a:blip r:embed="rId8"/>
+                    <a:blip r:embed="rId23"/>
                     <a:stretch>
                       <a:fillRect/>
                     </a:stretch>
@@ -3071,7 +3319,7 @@
       <w:pPr>
         <w:pStyle w:val="Heading1"/>
       </w:pPr>
-      <w:bookmarkStart w:id="3" w:name="_Toc243937738"/>
+      <w:bookmarkStart w:id="3" w:name="_Toc243938833"/>
       <w:r>
         <w:t>2. Research Design and Hypotheses</w:t>
       </w:r>
@@ -3082,11 +3330,11 @@
         <w:jc w:val="both"/>
       </w:pPr>
       <w:r>
-        <w:t xml:space="preserve">The study follows an applied, experimental machine-learning design. The independent variables are the model family (majority class, compact CNN, frozen ViT with a linear probe, partially fine-tuned ViT), the image modality (geometry drawing or radiation-pattern plot) and the evaluation distribution (in-distribution test split or out-of-distribution hold-out). The dependent variables are classification </w:t>
+        <w:t xml:space="preserve">The study follows an applied, experimental machine-learning design. The independent variables are the model family (majority class, compact CNN, frozen ViT with a linear probe, partially fine-tuned ViT), the image modality (geometry drawing or radiation-pattern plot) and the evaluation distribution </w:t>
       </w:r>
       <w:r>
         <w:lastRenderedPageBreak/>
-        <w:t>metrics on simulated performance classes. The research questions, hypotheses, label rules, split and seed were committed to Git before any fine-tuned result existed (docs/HYPOTHESES.md). One frozen linear-probe test score had been printed beforehand; this is disclosed in that file.</w:t>
+        <w:t>(in-distribution test split or out-of-distribution hold-out). The dependent variables are classification metrics on simulated performance classes. The research questions, hypotheses, label rules, split and seed were committed to Git before any fine-tuned result existed (docs/HYPOTHESES.md). One frozen linear-probe test score had been printed beforehand; this is disclosed in that file.</w:t>
       </w:r>
     </w:p>
     <w:p>
@@ -3533,7 +3781,7 @@
       <w:pPr>
         <w:pStyle w:val="Heading1"/>
       </w:pPr>
-      <w:bookmarkStart w:id="4" w:name="_Toc243937739"/>
+      <w:bookmarkStart w:id="4" w:name="_Toc243938834"/>
       <w:r>
         <w:t>3. Dataset Description and Source Verification</w:t>
       </w:r>
@@ -3872,7 +4120,7 @@
       <w:pPr>
         <w:pStyle w:val="Heading1"/>
       </w:pPr>
-      <w:bookmarkStart w:id="5" w:name="_Toc243937740"/>
+      <w:bookmarkStart w:id="5" w:name="_Toc243938835"/>
       <w:r>
         <w:t>4. Data Preprocessing and Preparation</w:t>
       </w:r>
@@ -3882,7 +4130,7 @@
       <w:pPr>
         <w:pStyle w:val="Heading2"/>
       </w:pPr>
-      <w:bookmarkStart w:id="6" w:name="_Toc243937741"/>
+      <w:bookmarkStart w:id="6" w:name="_Toc243938836"/>
       <w:r>
         <w:t>4.1 Targets and label rules</w:t>
       </w:r>
@@ -3960,7 +4208,7 @@
       <w:pPr>
         <w:pStyle w:val="Heading2"/>
       </w:pPr>
-      <w:bookmarkStart w:id="7" w:name="_Toc243937742"/>
+      <w:bookmarkStart w:id="7" w:name="_Toc243938837"/>
       <w:r>
         <w:t>4.2 Standardised geometry images</w:t>
       </w:r>
@@ -3988,7 +4236,7 @@
           <w:noProof/>
         </w:rPr>
         <w:drawing>
-          <wp:inline distT="0" distB="0" distL="0" distR="0" wp14:anchorId="0A8AE923" wp14:editId="0E1EA31C">
+          <wp:inline distT="0" distB="0" distL="0" distR="0" wp14:anchorId="5607901D" wp14:editId="7B307AE1">
             <wp:extent cx="5760720" cy="1780586"/>
             <wp:effectExtent l="0" t="0" r="0" b="0"/>
             <wp:docPr id="2" name="Picture 2"/>
@@ -4003,7 +4251,7 @@
                     <pic:cNvPicPr/>
                   </pic:nvPicPr>
                   <pic:blipFill>
-                    <a:blip r:embed="rId9"/>
+                    <a:blip r:embed="rId24"/>
                     <a:stretch>
                       <a:fillRect/>
                     </a:stretch>
@@ -4043,7 +4291,7 @@
           <w:noProof/>
         </w:rPr>
         <w:drawing>
-          <wp:inline distT="0" distB="0" distL="0" distR="0" wp14:anchorId="48640FE9" wp14:editId="41C333F6">
+          <wp:inline distT="0" distB="0" distL="0" distR="0" wp14:anchorId="0DE7127C" wp14:editId="74BCE58D">
             <wp:extent cx="5120640" cy="981456"/>
             <wp:effectExtent l="0" t="0" r="0" b="0"/>
             <wp:docPr id="3" name="Picture 3"/>
@@ -4058,7 +4306,7 @@
                     <pic:cNvPicPr/>
                   </pic:nvPicPr>
                   <pic:blipFill>
-                    <a:blip r:embed="rId10"/>
+                    <a:blip r:embed="rId25"/>
                     <a:stretch>
                       <a:fillRect/>
                     </a:stretch>
@@ -4092,7 +4340,7 @@
       <w:pPr>
         <w:pStyle w:val="Heading2"/>
       </w:pPr>
-      <w:bookmarkStart w:id="8" w:name="_Toc243937743"/>
+      <w:bookmarkStart w:id="8" w:name="_Toc243938838"/>
       <w:r>
         <w:t>4.3 Cleaning, duplicates and leakage control</w:t>
       </w:r>
@@ -4151,14 +4399,50 @@
         <w:jc w:val="both"/>
       </w:pPr>
       <w:r>
-        <w:t>The data dictionary is in Appendix A. Every count and threshold is logged in data/processed/preprocessing_log.json, and the rules are enforced by 18 automated tests (Section 10).</w:t>
+        <w:t xml:space="preserve">The data dictionary is in Appendix A and online at </w:t>
+      </w:r>
+      <w:hyperlink r:id="rId26">
+        <w:r>
+          <w:rPr>
+            <w:color w:val="1F5FA8"/>
+            <w:u w:val="single"/>
+          </w:rPr>
+          <w:t>data/data_dictionary.csv</w:t>
+        </w:r>
+      </w:hyperlink>
+      <w:r>
+        <w:t xml:space="preserve">. Every count and threshold is logged in </w:t>
+      </w:r>
+      <w:hyperlink r:id="rId27">
+        <w:r>
+          <w:rPr>
+            <w:color w:val="1F5FA8"/>
+            <w:u w:val="single"/>
+          </w:rPr>
+          <w:t>data/processed/preprocessing_log.json</w:t>
+        </w:r>
+      </w:hyperlink>
+      <w:r>
+        <w:t xml:space="preserve">, the split manifests are in </w:t>
+      </w:r>
+      <w:hyperlink r:id="rId28">
+        <w:r>
+          <w:rPr>
+            <w:color w:val="1F5FA8"/>
+            <w:u w:val="single"/>
+          </w:rPr>
+          <w:t>data/splits</w:t>
+        </w:r>
+      </w:hyperlink>
+      <w:r>
+        <w:t>, and the rules are enforced by 18 automated tests (Section 10).</w:t>
       </w:r>
     </w:p>
     <w:p>
       <w:pPr>
         <w:pStyle w:val="Heading1"/>
       </w:pPr>
-      <w:bookmarkStart w:id="9" w:name="_Toc243937744"/>
+      <w:bookmarkStart w:id="9" w:name="_Toc243938839"/>
       <w:r>
         <w:lastRenderedPageBreak/>
         <w:t>5. Proposed Model: Vision Transformer</w:t>
@@ -4208,7 +4492,7 @@
       <w:pPr>
         <w:pStyle w:val="Heading1"/>
       </w:pPr>
-      <w:bookmarkStart w:id="10" w:name="_Toc243937745"/>
+      <w:bookmarkStart w:id="10" w:name="_Toc243938840"/>
       <w:r>
         <w:t>6. Training Strategy and Experimental Setup</w:t>
       </w:r>
@@ -4769,7 +5053,7 @@
       <w:pPr>
         <w:pStyle w:val="Heading1"/>
       </w:pPr>
-      <w:bookmarkStart w:id="11" w:name="_Toc243937746"/>
+      <w:bookmarkStart w:id="11" w:name="_Toc243938841"/>
       <w:r>
         <w:t>7. Baseline Methods and Comparative Models</w:t>
       </w:r>
@@ -4835,7 +5119,7 @@
       <w:pPr>
         <w:pStyle w:val="Heading1"/>
       </w:pPr>
-      <w:bookmarkStart w:id="12" w:name="_Toc243937747"/>
+      <w:bookmarkStart w:id="12" w:name="_Toc243938842"/>
       <w:r>
         <w:t>8. Evaluation Metrics and Analysis Plan</w:t>
       </w:r>
@@ -4856,7 +5140,7 @@
       <w:pPr>
         <w:pStyle w:val="Heading1"/>
       </w:pPr>
-      <w:bookmarkStart w:id="13" w:name="_Toc243937748"/>
+      <w:bookmarkStart w:id="13" w:name="_Toc243938843"/>
       <w:r>
         <w:t>9. Results and Discussion</w:t>
       </w:r>
@@ -4874,7 +5158,7 @@
       <w:pPr>
         <w:pStyle w:val="Heading2"/>
       </w:pPr>
-      <w:bookmarkStart w:id="14" w:name="_Toc243937749"/>
+      <w:bookmarkStart w:id="14" w:name="_Toc243938844"/>
       <w:r>
         <w:lastRenderedPageBreak/>
         <w:t>9.1 Main task: geometry image to matching class (RQ1, RQ2)</w:t>
@@ -5933,7 +6217,7 @@
           <w:noProof/>
         </w:rPr>
         <w:drawing>
-          <wp:inline distT="0" distB="0" distL="0" distR="0" wp14:anchorId="78AD47CB" wp14:editId="2AA83860">
+          <wp:inline distT="0" distB="0" distL="0" distR="0" wp14:anchorId="0DBF4F82" wp14:editId="7F59D64F">
             <wp:extent cx="5760720" cy="1400175"/>
             <wp:effectExtent l="0" t="0" r="0" b="0"/>
             <wp:docPr id="4" name="Picture 4"/>
@@ -5948,7 +6232,7 @@
                     <pic:cNvPicPr/>
                   </pic:nvPicPr>
                   <pic:blipFill>
-                    <a:blip r:embed="rId11"/>
+                    <a:blip r:embed="rId29"/>
                     <a:stretch>
                       <a:fillRect/>
                     </a:stretch>
@@ -5988,7 +6272,7 @@
           <w:noProof/>
         </w:rPr>
         <w:drawing>
-          <wp:inline distT="0" distB="0" distL="0" distR="0" wp14:anchorId="128777A5" wp14:editId="7205B454">
+          <wp:inline distT="0" distB="0" distL="0" distR="0" wp14:anchorId="347F9BB9" wp14:editId="1E85C7F9">
             <wp:extent cx="5486400" cy="1351722"/>
             <wp:effectExtent l="0" t="0" r="0" b="0"/>
             <wp:docPr id="5" name="Picture 5"/>
@@ -6003,7 +6287,7 @@
                     <pic:cNvPicPr/>
                   </pic:nvPicPr>
                   <pic:blipFill>
-                    <a:blip r:embed="rId12"/>
+                    <a:blip r:embed="rId30"/>
                     <a:stretch>
                       <a:fillRect/>
                     </a:stretch>
@@ -6037,7 +6321,7 @@
       <w:pPr>
         <w:pStyle w:val="Heading2"/>
       </w:pPr>
-      <w:bookmarkStart w:id="15" w:name="_Toc243937750"/>
+      <w:bookmarkStart w:id="15" w:name="_Toc243938845"/>
       <w:r>
         <w:lastRenderedPageBreak/>
         <w:t>9.2 Diagnosing the underperformance: Amendment 1 and augmentation ablation</w:t>
@@ -6455,7 +6739,7 @@
       <w:pPr>
         <w:pStyle w:val="Heading2"/>
       </w:pPr>
-      <w:bookmarkStart w:id="16" w:name="_Toc243937751"/>
+      <w:bookmarkStart w:id="16" w:name="_Toc243938846"/>
       <w:r>
         <w:t>9.3 Secondary task and modality comparison (RQ3)</w:t>
       </w:r>
@@ -6761,7 +7045,7 @@
         </w:rPr>
         <w:lastRenderedPageBreak/>
         <w:drawing>
-          <wp:inline distT="0" distB="0" distL="0" distR="0" wp14:anchorId="5FE3EDFA" wp14:editId="462D8C93">
+          <wp:inline distT="0" distB="0" distL="0" distR="0" wp14:anchorId="0D55650A" wp14:editId="2011F259">
             <wp:extent cx="5486400" cy="2194560"/>
             <wp:effectExtent l="0" t="0" r="0" b="0"/>
             <wp:docPr id="6" name="Picture 6"/>
@@ -6776,7 +7060,7 @@
                     <pic:cNvPicPr/>
                   </pic:nvPicPr>
                   <pic:blipFill>
-                    <a:blip r:embed="rId13"/>
+                    <a:blip r:embed="rId31"/>
                     <a:stretch>
                       <a:fillRect/>
                     </a:stretch>
@@ -6836,7 +7120,7 @@
       <w:pPr>
         <w:pStyle w:val="Heading2"/>
       </w:pPr>
-      <w:bookmarkStart w:id="17" w:name="_Toc243937752"/>
+      <w:bookmarkStart w:id="17" w:name="_Toc243938847"/>
       <w:r>
         <w:t>9.4 Explainability (RQ4)</w:t>
       </w:r>
@@ -6852,7 +7136,7 @@
           <w:noProof/>
         </w:rPr>
         <w:drawing>
-          <wp:inline distT="0" distB="0" distL="0" distR="0" wp14:anchorId="5C76CDCD" wp14:editId="54C2089D">
+          <wp:inline distT="0" distB="0" distL="0" distR="0" wp14:anchorId="6B8AFF45" wp14:editId="4E6FEA15">
             <wp:extent cx="5760720" cy="1847187"/>
             <wp:effectExtent l="0" t="0" r="0" b="0"/>
             <wp:docPr id="7" name="Picture 7"/>
@@ -6867,7 +7151,7 @@
                     <pic:cNvPicPr/>
                   </pic:nvPicPr>
                   <pic:blipFill>
-                    <a:blip r:embed="rId14"/>
+                    <a:blip r:embed="rId32"/>
                     <a:stretch>
                       <a:fillRect/>
                     </a:stretch>
@@ -6907,7 +7191,7 @@
           <w:noProof/>
         </w:rPr>
         <w:drawing>
-          <wp:inline distT="0" distB="0" distL="0" distR="0" wp14:anchorId="32D15264" wp14:editId="23529AA0">
+          <wp:inline distT="0" distB="0" distL="0" distR="0" wp14:anchorId="367416C0" wp14:editId="1E99858A">
             <wp:extent cx="5029200" cy="1788160"/>
             <wp:effectExtent l="0" t="0" r="0" b="0"/>
             <wp:docPr id="8" name="Picture 8"/>
@@ -6922,7 +7206,7 @@
                     <pic:cNvPicPr/>
                   </pic:nvPicPr>
                   <pic:blipFill>
-                    <a:blip r:embed="rId15"/>
+                    <a:blip r:embed="rId33"/>
                     <a:stretch>
                       <a:fillRect/>
                     </a:stretch>
@@ -6977,7 +7261,7 @@
       <w:pPr>
         <w:pStyle w:val="Heading2"/>
       </w:pPr>
-      <w:bookmarkStart w:id="18" w:name="_Toc243937753"/>
+      <w:bookmarkStart w:id="18" w:name="_Toc243938848"/>
       <w:r>
         <w:t>9.5 Robustness and out-of-distribution generalisation (RQ5)</w:t>
       </w:r>
@@ -7604,7 +7888,7 @@
       <w:pPr>
         <w:pStyle w:val="Heading2"/>
       </w:pPr>
-      <w:bookmarkStart w:id="19" w:name="_Toc243937754"/>
+      <w:bookmarkStart w:id="19" w:name="_Toc243938849"/>
       <w:r>
         <w:lastRenderedPageBreak/>
         <w:t>9.6 Summary of hypotheses</w:t>
@@ -7969,7 +8253,7 @@
       <w:pPr>
         <w:pStyle w:val="Heading1"/>
       </w:pPr>
-      <w:bookmarkStart w:id="20" w:name="_Toc243937755"/>
+      <w:bookmarkStart w:id="20" w:name="_Toc243938850"/>
       <w:r>
         <w:t>10. Ethics, Bias, Privacy, and Reproducibility</w:t>
       </w:r>
@@ -8038,7 +8322,7 @@
       <w:pPr>
         <w:pStyle w:val="Heading1"/>
       </w:pPr>
-      <w:bookmarkStart w:id="21" w:name="_Toc243937756"/>
+      <w:bookmarkStart w:id="21" w:name="_Toc243938851"/>
       <w:r>
         <w:t>11. Limitations and Future Work</w:t>
       </w:r>
@@ -8150,7 +8434,7 @@
       <w:pPr>
         <w:pStyle w:val="Heading1"/>
       </w:pPr>
-      <w:bookmarkStart w:id="22" w:name="_Toc243937757"/>
+      <w:bookmarkStart w:id="22" w:name="_Toc243938852"/>
       <w:r>
         <w:t>12. Conclusion</w:t>
       </w:r>
@@ -8174,140 +8458,43 @@
       <w:pPr>
         <w:pStyle w:val="Heading1"/>
       </w:pPr>
-      <w:bookmarkStart w:id="23" w:name="_Toc243937758"/>
-      <w:r>
-        <w:t>References</w:t>
+      <w:bookmarkStart w:id="23" w:name="_Toc243938853"/>
+      <w:r>
+        <w:t>Data, Code and Output Availability</w:t>
       </w:r>
       <w:bookmarkEnd w:id="23"/>
     </w:p>
     <w:p>
       <w:pPr>
-        <w:pStyle w:val="ListNumber"/>
+        <w:jc w:val="both"/>
       </w:pPr>
       <w:r>
-        <w:t>A. Dosovitskiy et al., "An image is worth 16x16 words: Transformers for image recognition at scale," in Proc. ICLR, 2021, arXiv:2010.11929.</w:t>
-      </w:r>
-    </w:p>
-    <w:p>
-      <w:pPr>
-        <w:pStyle w:val="ListNumber"/>
-      </w:pPr>
-      <w:r>
-        <w:t>B. LaBash et al., "Improving generative inverse design of rectangular patch antennas with test time optimization," arXiv:2505.18188, 2025. Dataset: huggingface.co/datasets/becklabash/rectangular-patch-antenna-freq-response (MIT), rev. 4be72a2.</w:t>
-      </w:r>
-    </w:p>
-    <w:p>
-      <w:pPr>
-        <w:pStyle w:val="ListNumber"/>
-      </w:pPr>
-      <w:r>
-        <w:lastRenderedPageBreak/>
-        <w:t>C. M. Bhuma, P. Sure, S. K. Painam, J. Chandrasekhar Rao and U. Srinivasa Rao, "RadPat-50K: A large-scale benchmark for antenna array radiation patterns," Zenodo, v1.1, 2025, doi:10.5281/zenodo.17067881 (CC BY 4.0).</w:t>
-      </w:r>
-    </w:p>
-    <w:p>
-      <w:pPr>
-        <w:pStyle w:val="ListNumber"/>
-      </w:pPr>
-      <w:r>
-        <w:t>C. A. Balanis, Antenna Theory: Analysis and Design, 4th ed. Hoboken, NJ: Wiley, 2016.</w:t>
-      </w:r>
-    </w:p>
-    <w:p>
-      <w:pPr>
-        <w:pStyle w:val="ListNumber"/>
-      </w:pPr>
-      <w:r>
-        <w:t>3GPP, "NR; User Equipment (UE) radio transmission and reception; Part 1: Range 1 Standalone," TS 38.101-1.</w:t>
-      </w:r>
-    </w:p>
-    <w:p>
-      <w:pPr>
-        <w:pStyle w:val="ListNumber"/>
-      </w:pPr>
-      <w:r>
-        <w:t>R. Wightman, "PyTorch Image Models (timm)," GitHub repository, 2019–2026; A. Steiner et al., "How to train your ViT? Data, augmentation, and regularization in vision transformers," TMLR, 2022.</w:t>
-      </w:r>
-    </w:p>
-    <w:p>
-      <w:pPr>
-        <w:pStyle w:val="ListNumber"/>
-      </w:pPr>
-      <w:r>
-        <w:t>S. Abnar and W. Zuidema, "Quantifying attention flow in transformers," in Proc. ACL, 2020, pp. 4190–4197.</w:t>
-      </w:r>
-    </w:p>
-    <w:p>
-      <w:pPr>
-        <w:pStyle w:val="ListNumber"/>
-      </w:pPr>
-      <w:r>
-        <w:t>C. Guo, G. Pleiss, Y. Sun and K. Q. Weinberger, "On calibration of modern neural networks," in Proc. ICML, 2017.</w:t>
-      </w:r>
-    </w:p>
-    <w:p>
-      <w:pPr>
-        <w:pStyle w:val="ListNumber"/>
-      </w:pPr>
-      <w:r>
-        <w:t>A. Paszke et al., "PyTorch: An imperative style, high-performance deep learning library," in Proc. NeurIPS, 2019.</w:t>
-      </w:r>
-    </w:p>
-    <w:p>
-      <w:pPr>
-        <w:pStyle w:val="ListNumber"/>
-      </w:pPr>
-      <w:r>
-        <w:t>H. Touvron et al., "Training data-efficient image transformers &amp; distillation through attention," in Proc. ICML, 2021.</w:t>
-      </w:r>
-    </w:p>
-    <w:p>
-      <w:pPr>
-        <w:pStyle w:val="ListNumber"/>
-      </w:pPr>
-      <w:r>
-        <w:t>T. Liebig et al., openEMS – a free and open electromagnetic field solver, https://openems.de.</w:t>
-      </w:r>
-    </w:p>
-    <w:p>
-      <w:pPr>
-        <w:pStyle w:val="ListNumber"/>
-      </w:pPr>
-      <w:r>
-        <w:t>Q. McNemar, "Note on the sampling error of the difference between correlated proportions or percentages," Psychometrika, vol. 12, pp. 153–157, 1947.</w:t>
-      </w:r>
-    </w:p>
-    <w:p>
-      <w:pPr>
-        <w:pStyle w:val="ListNumber"/>
-      </w:pPr>
-      <w:r>
-        <w:t>B. Efron and R. J. Tibshirani, An Introduction to the Bootstrap. New York: Chapman &amp; Hall, 1993.</w:t>
-      </w:r>
-    </w:p>
-    <w:p>
-      <w:pPr>
-        <w:pStyle w:val="ListNumber"/>
-      </w:pPr>
-      <w:r>
-        <w:t>T. Darcet, M. Oquab, J. Mairal and P. Bojanowski, "Vision transformers need registers," in Proc. ICLR, 2024.</w:t>
-      </w:r>
-    </w:p>
-    <w:p>
-      <w:r>
-        <w:br w:type="page"/>
-      </w:r>
-    </w:p>
-    <w:p>
-      <w:pPr>
-        <w:pStyle w:val="Heading1"/>
-      </w:pPr>
-      <w:bookmarkStart w:id="24" w:name="_Toc243937759"/>
-      <w:r>
-        <w:lastRenderedPageBreak/>
-        <w:t>Appendix A. Data Dictionary</w:t>
-      </w:r>
-      <w:bookmarkEnd w:id="24"/>
+        <w:t xml:space="preserve">All data derivatives, code, tests and outputs of Module 1 are public in the GitHub repository </w:t>
+      </w:r>
+      <w:hyperlink r:id="rId34">
+        <w:r>
+          <w:rPr>
+            <w:color w:val="1F5FA8"/>
+            <w:u w:val="single"/>
+          </w:rPr>
+          <w:t>https://github.com/rathiabeth/module1-vit-antenna-image-classification</w:t>
+        </w:r>
+      </w:hyperlink>
+      <w:r>
+        <w:t xml:space="preserve">. Each entry below links directly to the file or folder; raw third-party archives are linked at their source because they are re-downloaded with checksums rather than redistributed. Module 2 is at </w:t>
+      </w:r>
+      <w:hyperlink r:id="rId35">
+        <w:r>
+          <w:rPr>
+            <w:color w:val="1F5FA8"/>
+            <w:u w:val="single"/>
+          </w:rPr>
+          <w:t>https://github.com/rathiabeth/module2-numerical-surrogate-antenna-design</w:t>
+        </w:r>
+      </w:hyperlink>
+      <w:r>
+        <w:t>.</w:t>
+      </w:r>
     </w:p>
     <w:p>
       <w:pPr>
@@ -8315,7 +8502,1482 @@
         <w:keepNext/>
       </w:pPr>
       <w:r>
-        <w:t>Table 11. Data dictionary (data/data_dictionary.csv).</w:t>
+        <w:lastRenderedPageBreak/>
+        <w:t>Table 11. Links to the data, scripts, tests and outputs of Module 1 (branch main).</w:t>
+      </w:r>
+    </w:p>
+    <w:tbl>
+      <w:tblPr>
+        <w:tblStyle w:val="TableGrid"/>
+        <w:tblW w:w="0" w:type="auto"/>
+        <w:jc w:val="center"/>
+        <w:tblLook w:val="04A0" w:firstRow="1" w:lastRow="0" w:firstColumn="1" w:lastColumn="0" w:noHBand="0" w:noVBand="1"/>
+      </w:tblPr>
+      <w:tblGrid>
+        <w:gridCol w:w="2831"/>
+        <w:gridCol w:w="2906"/>
+        <w:gridCol w:w="3663"/>
+      </w:tblGrid>
+      <w:tr>
+        <w:trPr>
+          <w:cantSplit/>
+          <w:tblHeader/>
+          <w:jc w:val="center"/>
+        </w:trPr>
+        <w:tc>
+          <w:tcPr>
+            <w:tcW w:w="3061" w:type="dxa"/>
+            <w:shd w:val="clear" w:color="auto" w:fill="2F6FAE"/>
+          </w:tcPr>
+          <w:p>
+            <w:r>
+              <w:rPr>
+                <w:b/>
+                <w:color w:val="FFFFFF"/>
+                <w:sz w:val="19"/>
+              </w:rPr>
+              <w:t>Category</w:t>
+            </w:r>
+          </w:p>
+        </w:tc>
+        <w:tc>
+          <w:tcPr>
+            <w:tcW w:w="3061" w:type="dxa"/>
+            <w:shd w:val="clear" w:color="auto" w:fill="2F6FAE"/>
+          </w:tcPr>
+          <w:p>
+            <w:r>
+              <w:rPr>
+                <w:b/>
+                <w:color w:val="FFFFFF"/>
+                <w:sz w:val="19"/>
+              </w:rPr>
+              <w:t>Content</w:t>
+            </w:r>
+          </w:p>
+        </w:tc>
+        <w:tc>
+          <w:tcPr>
+            <w:tcW w:w="3061" w:type="dxa"/>
+            <w:shd w:val="clear" w:color="auto" w:fill="2F6FAE"/>
+          </w:tcPr>
+          <w:p>
+            <w:r>
+              <w:rPr>
+                <w:b/>
+                <w:color w:val="FFFFFF"/>
+                <w:sz w:val="19"/>
+              </w:rPr>
+              <w:t>Link</w:t>
+            </w:r>
+          </w:p>
+        </w:tc>
+      </w:tr>
+      <w:tr>
+        <w:trPr>
+          <w:cantSplit/>
+          <w:jc w:val="center"/>
+        </w:trPr>
+        <w:tc>
+          <w:tcPr>
+            <w:tcW w:w="3061" w:type="dxa"/>
+          </w:tcPr>
+          <w:p>
+            <w:r>
+              <w:rPr>
+                <w:b/>
+                <w:sz w:val="19"/>
+              </w:rPr>
+              <w:t>Data</w:t>
+            </w:r>
+          </w:p>
+        </w:tc>
+        <w:tc>
+          <w:tcPr>
+            <w:tcW w:w="3061" w:type="dxa"/>
+          </w:tcPr>
+          <w:p>
+            <w:r>
+              <w:rPr>
+                <w:sz w:val="19"/>
+              </w:rPr>
+              <w:t>Patch dataset source (2,051 openEMS designs, MIT)</w:t>
+            </w:r>
+          </w:p>
+        </w:tc>
+        <w:tc>
+          <w:tcPr>
+            <w:tcW w:w="3061" w:type="dxa"/>
+          </w:tcPr>
+          <w:p>
+            <w:hyperlink r:id="rId36">
+              <w:r>
+                <w:rPr>
+                  <w:color w:val="1F5FA8"/>
+                  <w:sz w:val="19"/>
+                  <w:u w:val="single"/>
+                </w:rPr>
+                <w:t>Hugging Face, rev. 4be72a2</w:t>
+              </w:r>
+            </w:hyperlink>
+          </w:p>
+        </w:tc>
+      </w:tr>
+      <w:tr>
+        <w:trPr>
+          <w:cantSplit/>
+          <w:jc w:val="center"/>
+        </w:trPr>
+        <w:tc>
+          <w:tcPr>
+            <w:tcW w:w="3061" w:type="dxa"/>
+            <w:shd w:val="clear" w:color="auto" w:fill="EEF4FA"/>
+          </w:tcPr>
+          <w:p/>
+        </w:tc>
+        <w:tc>
+          <w:tcPr>
+            <w:tcW w:w="3061" w:type="dxa"/>
+            <w:shd w:val="clear" w:color="auto" w:fill="EEF4FA"/>
+          </w:tcPr>
+          <w:p>
+            <w:r>
+              <w:rPr>
+                <w:sz w:val="19"/>
+              </w:rPr>
+              <w:t>RadPat-50K source (CC BY 4.0)</w:t>
+            </w:r>
+          </w:p>
+        </w:tc>
+        <w:tc>
+          <w:tcPr>
+            <w:tcW w:w="3061" w:type="dxa"/>
+            <w:shd w:val="clear" w:color="auto" w:fill="EEF4FA"/>
+          </w:tcPr>
+          <w:p>
+            <w:hyperlink r:id="rId37">
+              <w:r>
+                <w:rPr>
+                  <w:color w:val="1F5FA8"/>
+                  <w:sz w:val="19"/>
+                  <w:u w:val="single"/>
+                </w:rPr>
+                <w:t>Zenodo 10.5281/zenodo.17067881</w:t>
+              </w:r>
+            </w:hyperlink>
+          </w:p>
+        </w:tc>
+      </w:tr>
+      <w:tr>
+        <w:trPr>
+          <w:cantSplit/>
+          <w:jc w:val="center"/>
+        </w:trPr>
+        <w:tc>
+          <w:tcPr>
+            <w:tcW w:w="3061" w:type="dxa"/>
+          </w:tcPr>
+          <w:p/>
+        </w:tc>
+        <w:tc>
+          <w:tcPr>
+            <w:tcW w:w="3061" w:type="dxa"/>
+          </w:tcPr>
+          <w:p>
+            <w:r>
+              <w:rPr>
+                <w:sz w:val="19"/>
+              </w:rPr>
+              <w:t>Processed design table (parameters, S11 targets, labels, split)</w:t>
+            </w:r>
+          </w:p>
+        </w:tc>
+        <w:tc>
+          <w:tcPr>
+            <w:tcW w:w="3061" w:type="dxa"/>
+          </w:tcPr>
+          <w:p>
+            <w:hyperlink r:id="rId38">
+              <w:r>
+                <w:rPr>
+                  <w:color w:val="1F5FA8"/>
+                  <w:sz w:val="19"/>
+                  <w:u w:val="single"/>
+                </w:rPr>
+                <w:t>data/processed/patch_designs.csv</w:t>
+              </w:r>
+            </w:hyperlink>
+          </w:p>
+        </w:tc>
+      </w:tr>
+      <w:tr>
+        <w:trPr>
+          <w:cantSplit/>
+          <w:jc w:val="center"/>
+        </w:trPr>
+        <w:tc>
+          <w:tcPr>
+            <w:tcW w:w="3061" w:type="dxa"/>
+            <w:shd w:val="clear" w:color="auto" w:fill="EEF4FA"/>
+          </w:tcPr>
+          <w:p/>
+        </w:tc>
+        <w:tc>
+          <w:tcPr>
+            <w:tcW w:w="3061" w:type="dxa"/>
+            <w:shd w:val="clear" w:color="auto" w:fill="EEF4FA"/>
+          </w:tcPr>
+          <w:p>
+            <w:r>
+              <w:rPr>
+                <w:sz w:val="19"/>
+              </w:rPr>
+              <w:t>Standardised 224 × 224 geometry images (one per design)</w:t>
+            </w:r>
+          </w:p>
+        </w:tc>
+        <w:tc>
+          <w:tcPr>
+            <w:tcW w:w="3061" w:type="dxa"/>
+            <w:shd w:val="clear" w:color="auto" w:fill="EEF4FA"/>
+          </w:tcPr>
+          <w:p>
+            <w:hyperlink r:id="rId39">
+              <w:r>
+                <w:rPr>
+                  <w:color w:val="1F5FA8"/>
+                  <w:sz w:val="19"/>
+                  <w:u w:val="single"/>
+                </w:rPr>
+                <w:t>data/processed/patch_images</w:t>
+              </w:r>
+            </w:hyperlink>
+          </w:p>
+        </w:tc>
+      </w:tr>
+      <w:tr>
+        <w:trPr>
+          <w:cantSplit/>
+          <w:jc w:val="center"/>
+        </w:trPr>
+        <w:tc>
+          <w:tcPr>
+            <w:tcW w:w="3061" w:type="dxa"/>
+          </w:tcPr>
+          <w:p/>
+        </w:tc>
+        <w:tc>
+          <w:tcPr>
+            <w:tcW w:w="3061" w:type="dxa"/>
+          </w:tcPr>
+          <w:p>
+            <w:r>
+              <w:rPr>
+                <w:sz w:val="19"/>
+              </w:rPr>
+              <w:t>RadPat sample table with beamwidth labels</w:t>
+            </w:r>
+          </w:p>
+        </w:tc>
+        <w:tc>
+          <w:tcPr>
+            <w:tcW w:w="3061" w:type="dxa"/>
+          </w:tcPr>
+          <w:p>
+            <w:hyperlink r:id="rId40">
+              <w:r>
+                <w:rPr>
+                  <w:color w:val="1F5FA8"/>
+                  <w:sz w:val="19"/>
+                  <w:u w:val="single"/>
+                </w:rPr>
+                <w:t>data/processed/radpat_designs.csv</w:t>
+              </w:r>
+            </w:hyperlink>
+          </w:p>
+        </w:tc>
+      </w:tr>
+      <w:tr>
+        <w:trPr>
+          <w:cantSplit/>
+          <w:jc w:val="center"/>
+        </w:trPr>
+        <w:tc>
+          <w:tcPr>
+            <w:tcW w:w="3061" w:type="dxa"/>
+            <w:shd w:val="clear" w:color="auto" w:fill="EEF4FA"/>
+          </w:tcPr>
+          <w:p/>
+        </w:tc>
+        <w:tc>
+          <w:tcPr>
+            <w:tcW w:w="3061" w:type="dxa"/>
+            <w:shd w:val="clear" w:color="auto" w:fill="EEF4FA"/>
+          </w:tcPr>
+          <w:p>
+            <w:r>
+              <w:rPr>
+                <w:sz w:val="19"/>
+              </w:rPr>
+              <w:t>Locked split manifests (train / val / test / OOD)</w:t>
+            </w:r>
+          </w:p>
+        </w:tc>
+        <w:tc>
+          <w:tcPr>
+            <w:tcW w:w="3061" w:type="dxa"/>
+            <w:shd w:val="clear" w:color="auto" w:fill="EEF4FA"/>
+          </w:tcPr>
+          <w:p>
+            <w:hyperlink r:id="rId41">
+              <w:r>
+                <w:rPr>
+                  <w:color w:val="1F5FA8"/>
+                  <w:sz w:val="19"/>
+                  <w:u w:val="single"/>
+                </w:rPr>
+                <w:t>data/splits</w:t>
+              </w:r>
+            </w:hyperlink>
+          </w:p>
+        </w:tc>
+      </w:tr>
+      <w:tr>
+        <w:trPr>
+          <w:cantSplit/>
+          <w:jc w:val="center"/>
+        </w:trPr>
+        <w:tc>
+          <w:tcPr>
+            <w:tcW w:w="3061" w:type="dxa"/>
+          </w:tcPr>
+          <w:p/>
+        </w:tc>
+        <w:tc>
+          <w:tcPr>
+            <w:tcW w:w="3061" w:type="dxa"/>
+          </w:tcPr>
+          <w:p>
+            <w:r>
+              <w:rPr>
+                <w:sz w:val="19"/>
+              </w:rPr>
+              <w:t>Data dictionary and preprocessing log</w:t>
+            </w:r>
+          </w:p>
+        </w:tc>
+        <w:tc>
+          <w:tcPr>
+            <w:tcW w:w="3061" w:type="dxa"/>
+          </w:tcPr>
+          <w:p>
+            <w:hyperlink r:id="rId42">
+              <w:r>
+                <w:rPr>
+                  <w:color w:val="1F5FA8"/>
+                  <w:sz w:val="19"/>
+                  <w:u w:val="single"/>
+                </w:rPr>
+                <w:t>data/data_dictionary.csv</w:t>
+              </w:r>
+            </w:hyperlink>
+            <w:r>
+              <w:rPr>
+                <w:sz w:val="19"/>
+              </w:rPr>
+              <w:t xml:space="preserve">; </w:t>
+            </w:r>
+            <w:hyperlink r:id="rId43">
+              <w:r>
+                <w:rPr>
+                  <w:color w:val="1F5FA8"/>
+                  <w:sz w:val="19"/>
+                  <w:u w:val="single"/>
+                </w:rPr>
+                <w:t>data/processed/preprocessing_log.json</w:t>
+              </w:r>
+            </w:hyperlink>
+          </w:p>
+        </w:tc>
+      </w:tr>
+      <w:tr>
+        <w:trPr>
+          <w:cantSplit/>
+          <w:jc w:val="center"/>
+        </w:trPr>
+        <w:tc>
+          <w:tcPr>
+            <w:tcW w:w="3061" w:type="dxa"/>
+            <w:shd w:val="clear" w:color="auto" w:fill="EEF4FA"/>
+          </w:tcPr>
+          <w:p/>
+        </w:tc>
+        <w:tc>
+          <w:tcPr>
+            <w:tcW w:w="3061" w:type="dxa"/>
+            <w:shd w:val="clear" w:color="auto" w:fill="EEF4FA"/>
+          </w:tcPr>
+          <w:p>
+            <w:r>
+              <w:rPr>
+                <w:sz w:val="19"/>
+              </w:rPr>
+              <w:t>Configuration (seed, thresholds, hyperparameters)</w:t>
+            </w:r>
+          </w:p>
+        </w:tc>
+        <w:tc>
+          <w:tcPr>
+            <w:tcW w:w="3061" w:type="dxa"/>
+            <w:shd w:val="clear" w:color="auto" w:fill="EEF4FA"/>
+          </w:tcPr>
+          <w:p>
+            <w:hyperlink r:id="rId44">
+              <w:r>
+                <w:rPr>
+                  <w:color w:val="1F5FA8"/>
+                  <w:sz w:val="19"/>
+                  <w:u w:val="single"/>
+                </w:rPr>
+                <w:t>configs/default.yaml</w:t>
+              </w:r>
+            </w:hyperlink>
+          </w:p>
+        </w:tc>
+      </w:tr>
+      <w:tr>
+        <w:trPr>
+          <w:cantSplit/>
+          <w:jc w:val="center"/>
+        </w:trPr>
+        <w:tc>
+          <w:tcPr>
+            <w:tcW w:w="3061" w:type="dxa"/>
+          </w:tcPr>
+          <w:p>
+            <w:r>
+              <w:rPr>
+                <w:b/>
+                <w:sz w:val="19"/>
+              </w:rPr>
+              <w:t>Scripts</w:t>
+            </w:r>
+          </w:p>
+        </w:tc>
+        <w:tc>
+          <w:tcPr>
+            <w:tcW w:w="3061" w:type="dxa"/>
+          </w:tcPr>
+          <w:p>
+            <w:r>
+              <w:rPr>
+                <w:sz w:val="19"/>
+              </w:rPr>
+              <w:t>Download and preprocessing (labels, rendering, split)</w:t>
+            </w:r>
+          </w:p>
+        </w:tc>
+        <w:tc>
+          <w:tcPr>
+            <w:tcW w:w="3061" w:type="dxa"/>
+          </w:tcPr>
+          <w:p>
+            <w:hyperlink r:id="rId45">
+              <w:r>
+                <w:rPr>
+                  <w:color w:val="1F5FA8"/>
+                  <w:sz w:val="19"/>
+                  <w:u w:val="single"/>
+                </w:rPr>
+                <w:t>src/download_data.py</w:t>
+              </w:r>
+            </w:hyperlink>
+            <w:r>
+              <w:rPr>
+                <w:sz w:val="19"/>
+              </w:rPr>
+              <w:t xml:space="preserve">; </w:t>
+            </w:r>
+            <w:hyperlink r:id="rId46">
+              <w:r>
+                <w:rPr>
+                  <w:color w:val="1F5FA8"/>
+                  <w:sz w:val="19"/>
+                  <w:u w:val="single"/>
+                </w:rPr>
+                <w:t>src/preprocessing.py</w:t>
+              </w:r>
+            </w:hyperlink>
+            <w:r>
+              <w:rPr>
+                <w:sz w:val="19"/>
+              </w:rPr>
+              <w:t xml:space="preserve">; </w:t>
+            </w:r>
+            <w:hyperlink r:id="rId47">
+              <w:r>
+                <w:rPr>
+                  <w:color w:val="1F5FA8"/>
+                  <w:sz w:val="19"/>
+                  <w:u w:val="single"/>
+                </w:rPr>
+                <w:t>src/dataset.py</w:t>
+              </w:r>
+            </w:hyperlink>
+          </w:p>
+        </w:tc>
+      </w:tr>
+      <w:tr>
+        <w:trPr>
+          <w:cantSplit/>
+          <w:jc w:val="center"/>
+        </w:trPr>
+        <w:tc>
+          <w:tcPr>
+            <w:tcW w:w="3061" w:type="dxa"/>
+            <w:shd w:val="clear" w:color="auto" w:fill="EEF4FA"/>
+          </w:tcPr>
+          <w:p/>
+        </w:tc>
+        <w:tc>
+          <w:tcPr>
+            <w:tcW w:w="3061" w:type="dxa"/>
+            <w:shd w:val="clear" w:color="auto" w:fill="EEF4FA"/>
+          </w:tcPr>
+          <w:p>
+            <w:r>
+              <w:rPr>
+                <w:sz w:val="19"/>
+              </w:rPr>
+              <w:t>ViT-S/16 fine-tuning and linear probe</w:t>
+            </w:r>
+          </w:p>
+        </w:tc>
+        <w:tc>
+          <w:tcPr>
+            <w:tcW w:w="3061" w:type="dxa"/>
+            <w:shd w:val="clear" w:color="auto" w:fill="EEF4FA"/>
+          </w:tcPr>
+          <w:p>
+            <w:hyperlink r:id="rId48">
+              <w:r>
+                <w:rPr>
+                  <w:color w:val="1F5FA8"/>
+                  <w:sz w:val="19"/>
+                  <w:u w:val="single"/>
+                </w:rPr>
+                <w:t>src/train_vit.py</w:t>
+              </w:r>
+            </w:hyperlink>
+            <w:r>
+              <w:rPr>
+                <w:sz w:val="19"/>
+              </w:rPr>
+              <w:t xml:space="preserve">; </w:t>
+            </w:r>
+            <w:hyperlink r:id="rId49">
+              <w:r>
+                <w:rPr>
+                  <w:color w:val="1F5FA8"/>
+                  <w:sz w:val="19"/>
+                  <w:u w:val="single"/>
+                </w:rPr>
+                <w:t>src/train_common.py</w:t>
+              </w:r>
+            </w:hyperlink>
+          </w:p>
+        </w:tc>
+      </w:tr>
+      <w:tr>
+        <w:trPr>
+          <w:cantSplit/>
+          <w:jc w:val="center"/>
+        </w:trPr>
+        <w:tc>
+          <w:tcPr>
+            <w:tcW w:w="3061" w:type="dxa"/>
+          </w:tcPr>
+          <w:p/>
+        </w:tc>
+        <w:tc>
+          <w:tcPr>
+            <w:tcW w:w="3061" w:type="dxa"/>
+          </w:tcPr>
+          <w:p>
+            <w:r>
+              <w:rPr>
+                <w:sz w:val="19"/>
+              </w:rPr>
+              <w:t>Majority and compact CNN baselines</w:t>
+            </w:r>
+          </w:p>
+        </w:tc>
+        <w:tc>
+          <w:tcPr>
+            <w:tcW w:w="3061" w:type="dxa"/>
+          </w:tcPr>
+          <w:p>
+            <w:hyperlink r:id="rId50">
+              <w:r>
+                <w:rPr>
+                  <w:color w:val="1F5FA8"/>
+                  <w:sz w:val="19"/>
+                  <w:u w:val="single"/>
+                </w:rPr>
+                <w:t>src/train_baseline.py</w:t>
+              </w:r>
+            </w:hyperlink>
+          </w:p>
+        </w:tc>
+      </w:tr>
+      <w:tr>
+        <w:trPr>
+          <w:cantSplit/>
+          <w:jc w:val="center"/>
+        </w:trPr>
+        <w:tc>
+          <w:tcPr>
+            <w:tcW w:w="3061" w:type="dxa"/>
+            <w:shd w:val="clear" w:color="auto" w:fill="EEF4FA"/>
+          </w:tcPr>
+          <w:p/>
+        </w:tc>
+        <w:tc>
+          <w:tcPr>
+            <w:tcW w:w="3061" w:type="dxa"/>
+            <w:shd w:val="clear" w:color="auto" w:fill="EEF4FA"/>
+          </w:tcPr>
+          <w:p>
+            <w:r>
+              <w:rPr>
+                <w:sz w:val="19"/>
+              </w:rPr>
+              <w:t>Evaluation, statistics and figures</w:t>
+            </w:r>
+          </w:p>
+        </w:tc>
+        <w:tc>
+          <w:tcPr>
+            <w:tcW w:w="3061" w:type="dxa"/>
+            <w:shd w:val="clear" w:color="auto" w:fill="EEF4FA"/>
+          </w:tcPr>
+          <w:p>
+            <w:hyperlink r:id="rId51">
+              <w:r>
+                <w:rPr>
+                  <w:color w:val="1F5FA8"/>
+                  <w:sz w:val="19"/>
+                  <w:u w:val="single"/>
+                </w:rPr>
+                <w:t>src/evaluate.py</w:t>
+              </w:r>
+            </w:hyperlink>
+            <w:r>
+              <w:rPr>
+                <w:sz w:val="19"/>
+              </w:rPr>
+              <w:t xml:space="preserve">; </w:t>
+            </w:r>
+            <w:hyperlink r:id="rId52">
+              <w:r>
+                <w:rPr>
+                  <w:color w:val="1F5FA8"/>
+                  <w:sz w:val="19"/>
+                  <w:u w:val="single"/>
+                </w:rPr>
+                <w:t>src/select_final.py</w:t>
+              </w:r>
+            </w:hyperlink>
+          </w:p>
+        </w:tc>
+      </w:tr>
+      <w:tr>
+        <w:trPr>
+          <w:cantSplit/>
+          <w:jc w:val="center"/>
+        </w:trPr>
+        <w:tc>
+          <w:tcPr>
+            <w:tcW w:w="3061" w:type="dxa"/>
+          </w:tcPr>
+          <w:p/>
+        </w:tc>
+        <w:tc>
+          <w:tcPr>
+            <w:tcW w:w="3061" w:type="dxa"/>
+          </w:tcPr>
+          <w:p>
+            <w:r>
+              <w:rPr>
+                <w:sz w:val="19"/>
+              </w:rPr>
+              <w:t>Attention rollout, robustness and OOD tests</w:t>
+            </w:r>
+          </w:p>
+        </w:tc>
+        <w:tc>
+          <w:tcPr>
+            <w:tcW w:w="3061" w:type="dxa"/>
+          </w:tcPr>
+          <w:p>
+            <w:hyperlink r:id="rId53">
+              <w:r>
+                <w:rPr>
+                  <w:color w:val="1F5FA8"/>
+                  <w:sz w:val="19"/>
+                  <w:u w:val="single"/>
+                </w:rPr>
+                <w:t>src/explainability.py</w:t>
+              </w:r>
+            </w:hyperlink>
+          </w:p>
+        </w:tc>
+      </w:tr>
+      <w:tr>
+        <w:trPr>
+          <w:cantSplit/>
+          <w:jc w:val="center"/>
+        </w:trPr>
+        <w:tc>
+          <w:tcPr>
+            <w:tcW w:w="3061" w:type="dxa"/>
+            <w:shd w:val="clear" w:color="auto" w:fill="EEF4FA"/>
+          </w:tcPr>
+          <w:p/>
+        </w:tc>
+        <w:tc>
+          <w:tcPr>
+            <w:tcW w:w="3061" w:type="dxa"/>
+            <w:shd w:val="clear" w:color="auto" w:fill="EEF4FA"/>
+          </w:tcPr>
+          <w:p>
+            <w:r>
+              <w:rPr>
+                <w:sz w:val="19"/>
+              </w:rPr>
+              <w:t>Full experiment queue</w:t>
+            </w:r>
+          </w:p>
+        </w:tc>
+        <w:tc>
+          <w:tcPr>
+            <w:tcW w:w="3061" w:type="dxa"/>
+            <w:shd w:val="clear" w:color="auto" w:fill="EEF4FA"/>
+          </w:tcPr>
+          <w:p>
+            <w:hyperlink r:id="rId54">
+              <w:r>
+                <w:rPr>
+                  <w:color w:val="1F5FA8"/>
+                  <w:sz w:val="19"/>
+                  <w:u w:val="single"/>
+                </w:rPr>
+                <w:t>scripts/run_experiments.ps1</w:t>
+              </w:r>
+            </w:hyperlink>
+            <w:r>
+              <w:rPr>
+                <w:sz w:val="19"/>
+              </w:rPr>
+              <w:t xml:space="preserve">; </w:t>
+            </w:r>
+            <w:hyperlink r:id="rId55">
+              <w:r>
+                <w:rPr>
+                  <w:color w:val="1F5FA8"/>
+                  <w:sz w:val="19"/>
+                  <w:u w:val="single"/>
+                </w:rPr>
+                <w:t>scripts/run_experiments.sh</w:t>
+              </w:r>
+            </w:hyperlink>
+          </w:p>
+        </w:tc>
+      </w:tr>
+      <w:tr>
+        <w:trPr>
+          <w:cantSplit/>
+          <w:jc w:val="center"/>
+        </w:trPr>
+        <w:tc>
+          <w:tcPr>
+            <w:tcW w:w="3061" w:type="dxa"/>
+          </w:tcPr>
+          <w:p/>
+        </w:tc>
+        <w:tc>
+          <w:tcPr>
+            <w:tcW w:w="3061" w:type="dxa"/>
+          </w:tcPr>
+          <w:p>
+            <w:r>
+              <w:rPr>
+                <w:sz w:val="19"/>
+              </w:rPr>
+              <w:t>Report, slides, poster and diagram generators</w:t>
+            </w:r>
+          </w:p>
+        </w:tc>
+        <w:tc>
+          <w:tcPr>
+            <w:tcW w:w="3061" w:type="dxa"/>
+          </w:tcPr>
+          <w:p>
+            <w:hyperlink r:id="rId56">
+              <w:r>
+                <w:rPr>
+                  <w:color w:val="1F5FA8"/>
+                  <w:sz w:val="19"/>
+                  <w:u w:val="single"/>
+                </w:rPr>
+                <w:t>scripts</w:t>
+              </w:r>
+            </w:hyperlink>
+          </w:p>
+        </w:tc>
+      </w:tr>
+      <w:tr>
+        <w:trPr>
+          <w:cantSplit/>
+          <w:jc w:val="center"/>
+        </w:trPr>
+        <w:tc>
+          <w:tcPr>
+            <w:tcW w:w="3061" w:type="dxa"/>
+            <w:shd w:val="clear" w:color="auto" w:fill="EEF4FA"/>
+          </w:tcPr>
+          <w:p>
+            <w:r>
+              <w:rPr>
+                <w:b/>
+                <w:sz w:val="19"/>
+              </w:rPr>
+              <w:t>Tests</w:t>
+            </w:r>
+          </w:p>
+        </w:tc>
+        <w:tc>
+          <w:tcPr>
+            <w:tcW w:w="3061" w:type="dxa"/>
+            <w:shd w:val="clear" w:color="auto" w:fill="EEF4FA"/>
+          </w:tcPr>
+          <w:p>
+            <w:r>
+              <w:rPr>
+                <w:sz w:val="19"/>
+              </w:rPr>
+              <w:t>Label rules, S11 extraction, rendering determinism</w:t>
+            </w:r>
+          </w:p>
+        </w:tc>
+        <w:tc>
+          <w:tcPr>
+            <w:tcW w:w="3061" w:type="dxa"/>
+            <w:shd w:val="clear" w:color="auto" w:fill="EEF4FA"/>
+          </w:tcPr>
+          <w:p>
+            <w:hyperlink r:id="rId57">
+              <w:r>
+                <w:rPr>
+                  <w:color w:val="1F5FA8"/>
+                  <w:sz w:val="19"/>
+                  <w:u w:val="single"/>
+                </w:rPr>
+                <w:t>tests/test_preprocessing.py</w:t>
+              </w:r>
+            </w:hyperlink>
+          </w:p>
+        </w:tc>
+      </w:tr>
+      <w:tr>
+        <w:trPr>
+          <w:cantSplit/>
+          <w:jc w:val="center"/>
+        </w:trPr>
+        <w:tc>
+          <w:tcPr>
+            <w:tcW w:w="3061" w:type="dxa"/>
+          </w:tcPr>
+          <w:p/>
+        </w:tc>
+        <w:tc>
+          <w:tcPr>
+            <w:tcW w:w="3061" w:type="dxa"/>
+          </w:tcPr>
+          <w:p>
+            <w:r>
+              <w:rPr>
+                <w:sz w:val="19"/>
+              </w:rPr>
+              <w:t>Split disjointness, OOD rule, physical ranges, leakage checks</w:t>
+            </w:r>
+          </w:p>
+        </w:tc>
+        <w:tc>
+          <w:tcPr>
+            <w:tcW w:w="3061" w:type="dxa"/>
+          </w:tcPr>
+          <w:p>
+            <w:hyperlink r:id="rId58">
+              <w:r>
+                <w:rPr>
+                  <w:color w:val="1F5FA8"/>
+                  <w:sz w:val="19"/>
+                  <w:u w:val="single"/>
+                </w:rPr>
+                <w:t>tests/test_dataset_integrity.py</w:t>
+              </w:r>
+            </w:hyperlink>
+          </w:p>
+        </w:tc>
+      </w:tr>
+      <w:tr>
+        <w:trPr>
+          <w:cantSplit/>
+          <w:jc w:val="center"/>
+        </w:trPr>
+        <w:tc>
+          <w:tcPr>
+            <w:tcW w:w="3061" w:type="dxa"/>
+            <w:shd w:val="clear" w:color="auto" w:fill="EEF4FA"/>
+          </w:tcPr>
+          <w:p/>
+        </w:tc>
+        <w:tc>
+          <w:tcPr>
+            <w:tcW w:w="3061" w:type="dxa"/>
+            <w:shd w:val="clear" w:color="auto" w:fill="EEF4FA"/>
+          </w:tcPr>
+          <w:p>
+            <w:r>
+              <w:rPr>
+                <w:sz w:val="19"/>
+              </w:rPr>
+              <w:t>Stored pytest output (18 passed in 4.18s)</w:t>
+            </w:r>
+          </w:p>
+        </w:tc>
+        <w:tc>
+          <w:tcPr>
+            <w:tcW w:w="3061" w:type="dxa"/>
+            <w:shd w:val="clear" w:color="auto" w:fill="EEF4FA"/>
+          </w:tcPr>
+          <w:p>
+            <w:hyperlink r:id="rId59">
+              <w:r>
+                <w:rPr>
+                  <w:color w:val="1F5FA8"/>
+                  <w:sz w:val="19"/>
+                  <w:u w:val="single"/>
+                </w:rPr>
+                <w:t>results/test_report.txt</w:t>
+              </w:r>
+            </w:hyperlink>
+          </w:p>
+        </w:tc>
+      </w:tr>
+      <w:tr>
+        <w:trPr>
+          <w:cantSplit/>
+          <w:jc w:val="center"/>
+        </w:trPr>
+        <w:tc>
+          <w:tcPr>
+            <w:tcW w:w="3061" w:type="dxa"/>
+          </w:tcPr>
+          <w:p>
+            <w:r>
+              <w:rPr>
+                <w:b/>
+                <w:sz w:val="19"/>
+              </w:rPr>
+              <w:t>Outputs</w:t>
+            </w:r>
+          </w:p>
+        </w:tc>
+        <w:tc>
+          <w:tcPr>
+            <w:tcW w:w="3061" w:type="dxa"/>
+          </w:tcPr>
+          <w:p>
+            <w:r>
+              <w:rPr>
+                <w:sz w:val="19"/>
+              </w:rPr>
+              <w:t>Summary table of every model and split</w:t>
+            </w:r>
+          </w:p>
+        </w:tc>
+        <w:tc>
+          <w:tcPr>
+            <w:tcW w:w="3061" w:type="dxa"/>
+          </w:tcPr>
+          <w:p>
+            <w:hyperlink r:id="rId60">
+              <w:r>
+                <w:rPr>
+                  <w:color w:val="1F5FA8"/>
+                  <w:sz w:val="19"/>
+                  <w:u w:val="single"/>
+                </w:rPr>
+                <w:t>results/metrics/summary_table.csv</w:t>
+              </w:r>
+            </w:hyperlink>
+          </w:p>
+        </w:tc>
+      </w:tr>
+      <w:tr>
+        <w:trPr>
+          <w:cantSplit/>
+          <w:jc w:val="center"/>
+        </w:trPr>
+        <w:tc>
+          <w:tcPr>
+            <w:tcW w:w="3061" w:type="dxa"/>
+            <w:shd w:val="clear" w:color="auto" w:fill="EEF4FA"/>
+          </w:tcPr>
+          <w:p/>
+        </w:tc>
+        <w:tc>
+          <w:tcPr>
+            <w:tcW w:w="3061" w:type="dxa"/>
+            <w:shd w:val="clear" w:color="auto" w:fill="EEF4FA"/>
+          </w:tcPr>
+          <w:p>
+            <w:r>
+              <w:rPr>
+                <w:sz w:val="19"/>
+              </w:rPr>
+              <w:t>Per-run metrics, training histories, McNemar and bootstrap tests</w:t>
+            </w:r>
+          </w:p>
+        </w:tc>
+        <w:tc>
+          <w:tcPr>
+            <w:tcW w:w="3061" w:type="dxa"/>
+            <w:shd w:val="clear" w:color="auto" w:fill="EEF4FA"/>
+          </w:tcPr>
+          <w:p>
+            <w:hyperlink r:id="rId61">
+              <w:r>
+                <w:rPr>
+                  <w:color w:val="1F5FA8"/>
+                  <w:sz w:val="19"/>
+                  <w:u w:val="single"/>
+                </w:rPr>
+                <w:t>results/metrics</w:t>
+              </w:r>
+            </w:hyperlink>
+          </w:p>
+        </w:tc>
+      </w:tr>
+      <w:tr>
+        <w:trPr>
+          <w:cantSplit/>
+          <w:jc w:val="center"/>
+        </w:trPr>
+        <w:tc>
+          <w:tcPr>
+            <w:tcW w:w="3061" w:type="dxa"/>
+          </w:tcPr>
+          <w:p/>
+        </w:tc>
+        <w:tc>
+          <w:tcPr>
+            <w:tcW w:w="3061" w:type="dxa"/>
+          </w:tcPr>
+          <w:p>
+            <w:r>
+              <w:rPr>
+                <w:sz w:val="19"/>
+              </w:rPr>
+              <w:t>Per-design test predictions with calibrated confidence</w:t>
+            </w:r>
+          </w:p>
+        </w:tc>
+        <w:tc>
+          <w:tcPr>
+            <w:tcW w:w="3061" w:type="dxa"/>
+          </w:tcPr>
+          <w:p>
+            <w:hyperlink r:id="rId62">
+              <w:r>
+                <w:rPr>
+                  <w:color w:val="1F5FA8"/>
+                  <w:sz w:val="19"/>
+                  <w:u w:val="single"/>
+                </w:rPr>
+                <w:t>results/predictions</w:t>
+              </w:r>
+            </w:hyperlink>
+          </w:p>
+        </w:tc>
+      </w:tr>
+      <w:tr>
+        <w:trPr>
+          <w:cantSplit/>
+          <w:jc w:val="center"/>
+        </w:trPr>
+        <w:tc>
+          <w:tcPr>
+            <w:tcW w:w="3061" w:type="dxa"/>
+            <w:shd w:val="clear" w:color="auto" w:fill="EEF4FA"/>
+          </w:tcPr>
+          <w:p/>
+        </w:tc>
+        <w:tc>
+          <w:tcPr>
+            <w:tcW w:w="3061" w:type="dxa"/>
+            <w:shd w:val="clear" w:color="auto" w:fill="EEF4FA"/>
+          </w:tcPr>
+          <w:p>
+            <w:r>
+              <w:rPr>
+                <w:sz w:val="19"/>
+              </w:rPr>
+              <w:t>Explainability summary (attention enrichment, robustness)</w:t>
+            </w:r>
+          </w:p>
+        </w:tc>
+        <w:tc>
+          <w:tcPr>
+            <w:tcW w:w="3061" w:type="dxa"/>
+            <w:shd w:val="clear" w:color="auto" w:fill="EEF4FA"/>
+          </w:tcPr>
+          <w:p>
+            <w:hyperlink r:id="rId63">
+              <w:r>
+                <w:rPr>
+                  <w:color w:val="1F5FA8"/>
+                  <w:sz w:val="19"/>
+                  <w:u w:val="single"/>
+                </w:rPr>
+                <w:t>results/metrics/explainability_summary.json</w:t>
+              </w:r>
+            </w:hyperlink>
+          </w:p>
+        </w:tc>
+      </w:tr>
+      <w:tr>
+        <w:trPr>
+          <w:cantSplit/>
+          <w:jc w:val="center"/>
+        </w:trPr>
+        <w:tc>
+          <w:tcPr>
+            <w:tcW w:w="3061" w:type="dxa"/>
+          </w:tcPr>
+          <w:p/>
+        </w:tc>
+        <w:tc>
+          <w:tcPr>
+            <w:tcW w:w="3061" w:type="dxa"/>
+          </w:tcPr>
+          <w:p>
+            <w:r>
+              <w:rPr>
+                <w:sz w:val="19"/>
+              </w:rPr>
+              <w:t>All figures used in this report</w:t>
+            </w:r>
+          </w:p>
+        </w:tc>
+        <w:tc>
+          <w:tcPr>
+            <w:tcW w:w="3061" w:type="dxa"/>
+          </w:tcPr>
+          <w:p>
+            <w:hyperlink r:id="rId64">
+              <w:r>
+                <w:rPr>
+                  <w:color w:val="1F5FA8"/>
+                  <w:sz w:val="19"/>
+                  <w:u w:val="single"/>
+                </w:rPr>
+                <w:t>results/figures</w:t>
+              </w:r>
+            </w:hyperlink>
+          </w:p>
+        </w:tc>
+      </w:tr>
+      <w:tr>
+        <w:trPr>
+          <w:cantSplit/>
+          <w:jc w:val="center"/>
+        </w:trPr>
+        <w:tc>
+          <w:tcPr>
+            <w:tcW w:w="3061" w:type="dxa"/>
+            <w:shd w:val="clear" w:color="auto" w:fill="EEF4FA"/>
+          </w:tcPr>
+          <w:p/>
+        </w:tc>
+        <w:tc>
+          <w:tcPr>
+            <w:tcW w:w="3061" w:type="dxa"/>
+            <w:shd w:val="clear" w:color="auto" w:fill="EEF4FA"/>
+          </w:tcPr>
+          <w:p>
+            <w:r>
+              <w:rPr>
+                <w:sz w:val="19"/>
+              </w:rPr>
+              <w:t>Image embeddings handed to Module 2</w:t>
+            </w:r>
+          </w:p>
+        </w:tc>
+        <w:tc>
+          <w:tcPr>
+            <w:tcW w:w="3061" w:type="dxa"/>
+            <w:shd w:val="clear" w:color="auto" w:fill="EEF4FA"/>
+          </w:tcPr>
+          <w:p>
+            <w:hyperlink r:id="rId65">
+              <w:r>
+                <w:rPr>
+                  <w:color w:val="1F5FA8"/>
+                  <w:sz w:val="19"/>
+                  <w:u w:val="single"/>
+                </w:rPr>
+                <w:t>results/features</w:t>
+              </w:r>
+            </w:hyperlink>
+          </w:p>
+        </w:tc>
+      </w:tr>
+      <w:tr>
+        <w:trPr>
+          <w:cantSplit/>
+          <w:jc w:val="center"/>
+        </w:trPr>
+        <w:tc>
+          <w:tcPr>
+            <w:tcW w:w="3061" w:type="dxa"/>
+          </w:tcPr>
+          <w:p/>
+        </w:tc>
+        <w:tc>
+          <w:tcPr>
+            <w:tcW w:w="3061" w:type="dxa"/>
+          </w:tcPr>
+          <w:p>
+            <w:r>
+              <w:rPr>
+                <w:sz w:val="19"/>
+              </w:rPr>
+              <w:t>Report, slides and poster</w:t>
+            </w:r>
+          </w:p>
+        </w:tc>
+        <w:tc>
+          <w:tcPr>
+            <w:tcW w:w="3061" w:type="dxa"/>
+          </w:tcPr>
+          <w:p>
+            <w:hyperlink r:id="rId66">
+              <w:r>
+                <w:rPr>
+                  <w:color w:val="1F5FA8"/>
+                  <w:sz w:val="19"/>
+                  <w:u w:val="single"/>
+                </w:rPr>
+                <w:t>reports</w:t>
+              </w:r>
+            </w:hyperlink>
+            <w:r>
+              <w:rPr>
+                <w:sz w:val="19"/>
+              </w:rPr>
+              <w:t xml:space="preserve">; </w:t>
+            </w:r>
+            <w:hyperlink r:id="rId67">
+              <w:r>
+                <w:rPr>
+                  <w:color w:val="1F5FA8"/>
+                  <w:sz w:val="19"/>
+                  <w:u w:val="single"/>
+                </w:rPr>
+                <w:t>presentations</w:t>
+              </w:r>
+            </w:hyperlink>
+            <w:r>
+              <w:rPr>
+                <w:sz w:val="19"/>
+              </w:rPr>
+              <w:t xml:space="preserve">; </w:t>
+            </w:r>
+            <w:hyperlink r:id="rId68">
+              <w:r>
+                <w:rPr>
+                  <w:color w:val="1F5FA8"/>
+                  <w:sz w:val="19"/>
+                  <w:u w:val="single"/>
+                </w:rPr>
+                <w:t>poster</w:t>
+              </w:r>
+            </w:hyperlink>
+          </w:p>
+        </w:tc>
+      </w:tr>
+    </w:tbl>
+    <w:p/>
+    <w:p>
+      <w:pPr>
+        <w:pStyle w:val="Heading1"/>
+      </w:pPr>
+      <w:bookmarkStart w:id="24" w:name="_Toc243938854"/>
+      <w:r>
+        <w:t>References</w:t>
+      </w:r>
+      <w:bookmarkEnd w:id="24"/>
+    </w:p>
+    <w:p>
+      <w:pPr>
+        <w:pStyle w:val="ListNumber"/>
+      </w:pPr>
+      <w:r>
+        <w:t>A. Dosovitskiy et al., "An image is worth 16x16 words: Transformers for image recognition at scale," in Proc. ICLR, 2021, arXiv:2010.11929.</w:t>
+      </w:r>
+    </w:p>
+    <w:p>
+      <w:pPr>
+        <w:pStyle w:val="ListNumber"/>
+      </w:pPr>
+      <w:r>
+        <w:t>B. LaBash et al., "Improving generative inverse design of rectangular patch antennas with test time optimization," arXiv:2505.18188, 2025. Dataset: huggingface.co/datasets/becklabash/rectangular-patch-antenna-freq-response (MIT), rev. 4be72a2.</w:t>
+      </w:r>
+    </w:p>
+    <w:p>
+      <w:pPr>
+        <w:pStyle w:val="ListNumber"/>
+      </w:pPr>
+      <w:r>
+        <w:t>C. M. Bhuma, P. Sure, S. K. Painam, J. Chandrasekhar Rao and U. Srinivasa Rao, "RadPat-50K: A large-scale benchmark for antenna array radiation patterns," Zenodo, v1.1, 2025, doi:10.5281/zenodo.17067881 (CC BY 4.0).</w:t>
+      </w:r>
+    </w:p>
+    <w:p>
+      <w:pPr>
+        <w:pStyle w:val="ListNumber"/>
+      </w:pPr>
+      <w:r>
+        <w:t>C. A. Balanis, Antenna Theory: Analysis and Design, 4th ed. Hoboken, NJ: Wiley, 2016.</w:t>
+      </w:r>
+    </w:p>
+    <w:p>
+      <w:pPr>
+        <w:pStyle w:val="ListNumber"/>
+      </w:pPr>
+      <w:r>
+        <w:t>3GPP, "NR; User Equipment (UE) radio transmission and reception; Part 1: Range 1 Standalone," TS 38.101-1.</w:t>
+      </w:r>
+    </w:p>
+    <w:p>
+      <w:pPr>
+        <w:pStyle w:val="ListNumber"/>
+      </w:pPr>
+      <w:r>
+        <w:t>R. Wightman, "PyTorch Image Models (timm)," GitHub repository, 2019–2026; A. Steiner et al., "How to train your ViT? Data, augmentation, and regularization in vision transformers," TMLR, 2022.</w:t>
+      </w:r>
+    </w:p>
+    <w:p>
+      <w:pPr>
+        <w:pStyle w:val="ListNumber"/>
+      </w:pPr>
+      <w:r>
+        <w:t>S. Abnar and W. Zuidema, "Quantifying attention flow in transformers," in Proc. ACL, 2020, pp. 4190–4197.</w:t>
+      </w:r>
+    </w:p>
+    <w:p>
+      <w:pPr>
+        <w:pStyle w:val="ListNumber"/>
+      </w:pPr>
+      <w:r>
+        <w:t>C. Guo, G. Pleiss, Y. Sun and K. Q. Weinberger, "On calibration of modern neural networks," in Proc. ICML, 2017.</w:t>
+      </w:r>
+    </w:p>
+    <w:p>
+      <w:pPr>
+        <w:pStyle w:val="ListNumber"/>
+      </w:pPr>
+      <w:r>
+        <w:t>A. Paszke et al., "PyTorch: An imperative style, high-performance deep learning library," in Proc. NeurIPS, 2019.</w:t>
+      </w:r>
+    </w:p>
+    <w:p>
+      <w:pPr>
+        <w:pStyle w:val="ListNumber"/>
+      </w:pPr>
+      <w:r>
+        <w:t>H. Touvron et al., "Training data-efficient image transformers &amp; distillation through attention," in Proc. ICML, 2021.</w:t>
+      </w:r>
+    </w:p>
+    <w:p>
+      <w:pPr>
+        <w:pStyle w:val="ListNumber"/>
+      </w:pPr>
+      <w:r>
+        <w:t xml:space="preserve">T. Liebig et al., openEMS – a free and open electromagnetic field solver, </w:t>
+      </w:r>
+      <w:hyperlink r:id="rId69">
+        <w:r>
+          <w:rPr>
+            <w:color w:val="1F5FA8"/>
+            <w:u w:val="single"/>
+          </w:rPr>
+          <w:t>https://openems.de</w:t>
+        </w:r>
+      </w:hyperlink>
+      <w:r>
+        <w:t>.</w:t>
+      </w:r>
+    </w:p>
+    <w:p>
+      <w:pPr>
+        <w:pStyle w:val="ListNumber"/>
+      </w:pPr>
+      <w:r>
+        <w:t>Q. McNemar, "Note on the sampling error of the difference between correlated proportions or percentages," Psychometrika, vol. 12, pp. 153–157, 1947.</w:t>
+      </w:r>
+    </w:p>
+    <w:p>
+      <w:pPr>
+        <w:pStyle w:val="ListNumber"/>
+      </w:pPr>
+      <w:r>
+        <w:t>B. Efron and R. J. Tibshirani, An Introduction to the Bootstrap. New York: Chapman &amp; Hall, 1993.</w:t>
+      </w:r>
+    </w:p>
+    <w:p>
+      <w:pPr>
+        <w:pStyle w:val="ListNumber"/>
+      </w:pPr>
+      <w:r>
+        <w:t>T. Darcet, M. Oquab, J. Mairal and P. Bojanowski, "Vision transformers need registers," in Proc. ICLR, 2024.</w:t>
+      </w:r>
+    </w:p>
+    <w:p>
+      <w:r>
+        <w:br w:type="page"/>
+      </w:r>
+    </w:p>
+    <w:p>
+      <w:pPr>
+        <w:pStyle w:val="Heading1"/>
+      </w:pPr>
+      <w:bookmarkStart w:id="25" w:name="_Toc243938855"/>
+      <w:r>
+        <w:lastRenderedPageBreak/>
+        <w:t>Appendix A. Data Dictionary</w:t>
+      </w:r>
+      <w:bookmarkEnd w:id="25"/>
+    </w:p>
+    <w:p>
+      <w:pPr>
+        <w:pStyle w:val="Caption"/>
+        <w:keepNext/>
+      </w:pPr>
+      <w:r>
+        <w:t>Table 12. Data dictionary (data/data_dictionary.csv).</w:t>
       </w:r>
     </w:p>
     <w:tbl>
@@ -10261,11 +11923,11 @@
       <w:pPr>
         <w:pStyle w:val="Heading1"/>
       </w:pPr>
-      <w:bookmarkStart w:id="25" w:name="_Toc243937760"/>
+      <w:bookmarkStart w:id="26" w:name="_Toc243938856"/>
       <w:r>
         <w:t>Appendix B. Configuration</w:t>
       </w:r>
-      <w:bookmarkEnd w:id="25"/>
+      <w:bookmarkEnd w:id="26"/>
     </w:p>
     <w:p>
       <w:pPr>
@@ -10966,11 +12628,11 @@
       <w:pPr>
         <w:pStyle w:val="Heading1"/>
       </w:pPr>
-      <w:bookmarkStart w:id="26" w:name="_Toc243937761"/>
+      <w:bookmarkStart w:id="27" w:name="_Toc243938857"/>
       <w:r>
         <w:t>Appendix C. Experimental Details</w:t>
       </w:r>
-      <w:bookmarkEnd w:id="26"/>
+      <w:bookmarkEnd w:id="27"/>
     </w:p>
     <w:p>
       <w:pPr>
@@ -10978,7 +12640,7 @@
         <w:keepNext/>
       </w:pPr>
       <w:r>
-        <w:t>Table 12. Every executed classification run (test split).</w:t>
+        <w:t>Table 13. Every executed classification run (test split).</w:t>
       </w:r>
     </w:p>
     <w:tbl>
@@ -13313,11 +14975,11 @@
       <w:pPr>
         <w:pStyle w:val="Heading1"/>
       </w:pPr>
-      <w:bookmarkStart w:id="27" w:name="_Toc243937762"/>
+      <w:bookmarkStart w:id="28" w:name="_Toc243938858"/>
       <w:r>
         <w:t>Appendix D. Reproducibility Instructions</w:t>
       </w:r>
-      <w:bookmarkEnd w:id="27"/>
+      <w:bookmarkEnd w:id="28"/>
     </w:p>
     <w:p>
       <w:pPr>
@@ -13384,11 +15046,47 @@
         <w:jc w:val="both"/>
       </w:pPr>
       <w:r>
-        <w:t>Repository: https://github.com/&lt;your-github-username&gt;/module1-vit-antenna-image-classification. The pytest output is stored in results/test_report.txt; environment, runtimes and determinism notes are in docs/REPRODUCIBILITY.md.</w:t>
+        <w:t xml:space="preserve">Repository: </w:t>
+      </w:r>
+      <w:hyperlink r:id="rId70">
+        <w:r>
+          <w:rPr>
+            <w:color w:val="1F5FA8"/>
+            <w:u w:val="single"/>
+          </w:rPr>
+          <w:t>https://github.com/rathiabeth/module1-vit-antenna-image-classification</w:t>
+        </w:r>
+      </w:hyperlink>
+      <w:r>
+        <w:t xml:space="preserve">. The pytest output (18 passed in 4.18s) is stored in </w:t>
+      </w:r>
+      <w:hyperlink r:id="rId71">
+        <w:r>
+          <w:rPr>
+            <w:color w:val="1F5FA8"/>
+            <w:u w:val="single"/>
+          </w:rPr>
+          <w:t>results/test_report.txt</w:t>
+        </w:r>
+      </w:hyperlink>
+      <w:r>
+        <w:t xml:space="preserve">; environment, runtimes and determinism notes are in </w:t>
+      </w:r>
+      <w:hyperlink r:id="rId72">
+        <w:r>
+          <w:rPr>
+            <w:color w:val="1F5FA8"/>
+            <w:u w:val="single"/>
+          </w:rPr>
+          <w:t>docs/REPRODUCIBILITY.md</w:t>
+        </w:r>
+      </w:hyperlink>
+      <w:r>
+        <w:t>. All links are listed in the section Data, Code and Output Availability.</w:t>
       </w:r>
     </w:p>
     <w:sectPr>
-      <w:footerReference w:type="default" r:id="rId16"/>
+      <w:footerReference w:type="default" r:id="rId73"/>
       <w:pgSz w:w="11906" w:h="16838"/>
       <w:pgMar w:top="1361" w:right="1361" w:bottom="1361" w:left="1361" w:header="720" w:footer="720" w:gutter="0"/>
       <w:cols w:space="720"/>
@@ -13651,31 +15349,31 @@
       </w:rPr>
     </w:lvl>
   </w:abstractNum>
-  <w:num w:numId="1" w16cid:durableId="1792893904">
+  <w:num w:numId="1" w16cid:durableId="1954822574">
     <w:abstractNumId w:val="8"/>
   </w:num>
-  <w:num w:numId="2" w16cid:durableId="1846505877">
+  <w:num w:numId="2" w16cid:durableId="474032186">
     <w:abstractNumId w:val="6"/>
   </w:num>
-  <w:num w:numId="3" w16cid:durableId="2069187136">
+  <w:num w:numId="3" w16cid:durableId="1218669266">
     <w:abstractNumId w:val="5"/>
   </w:num>
-  <w:num w:numId="4" w16cid:durableId="1310939771">
+  <w:num w:numId="4" w16cid:durableId="777289230">
     <w:abstractNumId w:val="4"/>
   </w:num>
-  <w:num w:numId="5" w16cid:durableId="1943608367">
+  <w:num w:numId="5" w16cid:durableId="962928708">
     <w:abstractNumId w:val="7"/>
   </w:num>
-  <w:num w:numId="6" w16cid:durableId="381758771">
+  <w:num w:numId="6" w16cid:durableId="2095129589">
     <w:abstractNumId w:val="3"/>
   </w:num>
-  <w:num w:numId="7" w16cid:durableId="853610800">
+  <w:num w:numId="7" w16cid:durableId="240482811">
     <w:abstractNumId w:val="2"/>
   </w:num>
-  <w:num w:numId="8" w16cid:durableId="1706783819">
+  <w:num w:numId="8" w16cid:durableId="1705254396">
     <w:abstractNumId w:val="1"/>
   </w:num>
-  <w:num w:numId="9" w16cid:durableId="1200702187">
+  <w:num w:numId="9" w16cid:durableId="1206990643">
     <w:abstractNumId w:val="0"/>
   </w:num>
 </w:numbering>
@@ -25065,7 +26763,7 @@
     <w:autoRedefine/>
     <w:uiPriority w:val="39"/>
     <w:unhideWhenUsed/>
-    <w:rsid w:val="004D5FD4"/>
+    <w:rsid w:val="0075332B"/>
     <w:pPr>
       <w:spacing w:after="100"/>
     </w:pPr>
@@ -25077,7 +26775,7 @@
     <w:autoRedefine/>
     <w:uiPriority w:val="39"/>
     <w:unhideWhenUsed/>
-    <w:rsid w:val="004D5FD4"/>
+    <w:rsid w:val="0075332B"/>
     <w:pPr>
       <w:spacing w:after="100"/>
       <w:ind w:left="220"/>
@@ -25088,7 +26786,7 @@
     <w:basedOn w:val="DefaultParagraphFont"/>
     <w:uiPriority w:val="99"/>
     <w:unhideWhenUsed/>
-    <w:rsid w:val="004D5FD4"/>
+    <w:rsid w:val="0075332B"/>
     <w:rPr>
       <w:color w:val="0000FF" w:themeColor="hyperlink"/>
       <w:u w:val="single"/>

</xml_diff>

<commit_message>
Point all links to the rathiabeth-sudo GitHub repositories
Co-Authored-By: Claude Opus 5.5 <noreply@anthropic.com>
</commit_message>
<xml_diff>
--- a/reports/module1_report.docx
+++ b/reports/module1_report.docx
@@ -264,7 +264,7 @@
                   <w:color w:val="1F5FA8"/>
                   <w:u w:val="single"/>
                 </w:rPr>
-                <w:t>https://github.com/rathiabeth/module1-vit-antenna-image-classification</w:t>
+                <w:t>https://github.com/rathiabeth-sudo/901---module-1</w:t>
               </w:r>
             </w:hyperlink>
           </w:p>
@@ -291,7 +291,7 @@
       <w:pPr>
         <w:pStyle w:val="Heading1"/>
       </w:pPr>
-      <w:bookmarkStart w:id="0" w:name="_Toc243938830"/>
+      <w:bookmarkStart w:id="0" w:name="_Toc243939435"/>
       <w:r>
         <w:lastRenderedPageBreak/>
         <w:t>Table of Contents</w:t>
@@ -322,7 +322,7 @@
       <w:r>
         <w:fldChar w:fldCharType="separate"/>
       </w:r>
-      <w:hyperlink w:anchor="_Toc243938830" w:history="1">
+      <w:hyperlink w:anchor="_Toc243939435" w:history="1">
         <w:r>
           <w:rPr>
             <w:rStyle w:val="Hyperlink"/>
@@ -349,7 +349,7 @@
             <w:noProof/>
             <w:webHidden/>
           </w:rPr>
-          <w:instrText xml:space="preserve"> PAGEREF _Toc243938830 \h </w:instrText>
+          <w:instrText xml:space="preserve"> PAGEREF _Toc243939435 \h </w:instrText>
         </w:r>
         <w:r>
           <w:rPr>
@@ -395,7 +395,7 @@
           <w14:ligatures w14:val="standardContextual"/>
         </w:rPr>
       </w:pPr>
-      <w:hyperlink w:anchor="_Toc243938831" w:history="1">
+      <w:hyperlink w:anchor="_Toc243939436" w:history="1">
         <w:r>
           <w:rPr>
             <w:rStyle w:val="Hyperlink"/>
@@ -422,7 +422,7 @@
             <w:noProof/>
             <w:webHidden/>
           </w:rPr>
-          <w:instrText xml:space="preserve"> PAGEREF _Toc243938831 \h </w:instrText>
+          <w:instrText xml:space="preserve"> PAGEREF _Toc243939436 \h </w:instrText>
         </w:r>
         <w:r>
           <w:rPr>
@@ -468,7 +468,7 @@
           <w14:ligatures w14:val="standardContextual"/>
         </w:rPr>
       </w:pPr>
-      <w:hyperlink w:anchor="_Toc243938832" w:history="1">
+      <w:hyperlink w:anchor="_Toc243939437" w:history="1">
         <w:r>
           <w:rPr>
             <w:rStyle w:val="Hyperlink"/>
@@ -495,7 +495,7 @@
             <w:noProof/>
             <w:webHidden/>
           </w:rPr>
-          <w:instrText xml:space="preserve"> PAGEREF _Toc243938832 \h </w:instrText>
+          <w:instrText xml:space="preserve"> PAGEREF _Toc243939437 \h </w:instrText>
         </w:r>
         <w:r>
           <w:rPr>
@@ -541,7 +541,7 @@
           <w14:ligatures w14:val="standardContextual"/>
         </w:rPr>
       </w:pPr>
-      <w:hyperlink w:anchor="_Toc243938833" w:history="1">
+      <w:hyperlink w:anchor="_Toc243939438" w:history="1">
         <w:r>
           <w:rPr>
             <w:rStyle w:val="Hyperlink"/>
@@ -568,7 +568,7 @@
             <w:noProof/>
             <w:webHidden/>
           </w:rPr>
-          <w:instrText xml:space="preserve"> PAGEREF _Toc243938833 \h </w:instrText>
+          <w:instrText xml:space="preserve"> PAGEREF _Toc243939438 \h </w:instrText>
         </w:r>
         <w:r>
           <w:rPr>
@@ -614,7 +614,7 @@
           <w14:ligatures w14:val="standardContextual"/>
         </w:rPr>
       </w:pPr>
-      <w:hyperlink w:anchor="_Toc243938834" w:history="1">
+      <w:hyperlink w:anchor="_Toc243939439" w:history="1">
         <w:r>
           <w:rPr>
             <w:rStyle w:val="Hyperlink"/>
@@ -641,7 +641,7 @@
             <w:noProof/>
             <w:webHidden/>
           </w:rPr>
-          <w:instrText xml:space="preserve"> PAGEREF _Toc243938834 \h </w:instrText>
+          <w:instrText xml:space="preserve"> PAGEREF _Toc243939439 \h </w:instrText>
         </w:r>
         <w:r>
           <w:rPr>
@@ -687,7 +687,7 @@
           <w14:ligatures w14:val="standardContextual"/>
         </w:rPr>
       </w:pPr>
-      <w:hyperlink w:anchor="_Toc243938835" w:history="1">
+      <w:hyperlink w:anchor="_Toc243939440" w:history="1">
         <w:r>
           <w:rPr>
             <w:rStyle w:val="Hyperlink"/>
@@ -714,7 +714,7 @@
             <w:noProof/>
             <w:webHidden/>
           </w:rPr>
-          <w:instrText xml:space="preserve"> PAGEREF _Toc243938835 \h </w:instrText>
+          <w:instrText xml:space="preserve"> PAGEREF _Toc243939440 \h </w:instrText>
         </w:r>
         <w:r>
           <w:rPr>
@@ -760,7 +760,7 @@
           <w14:ligatures w14:val="standardContextual"/>
         </w:rPr>
       </w:pPr>
-      <w:hyperlink w:anchor="_Toc243938836" w:history="1">
+      <w:hyperlink w:anchor="_Toc243939441" w:history="1">
         <w:r>
           <w:rPr>
             <w:rStyle w:val="Hyperlink"/>
@@ -787,7 +787,7 @@
             <w:noProof/>
             <w:webHidden/>
           </w:rPr>
-          <w:instrText xml:space="preserve"> PAGEREF _Toc243938836 \h </w:instrText>
+          <w:instrText xml:space="preserve"> PAGEREF _Toc243939441 \h </w:instrText>
         </w:r>
         <w:r>
           <w:rPr>
@@ -833,7 +833,7 @@
           <w14:ligatures w14:val="standardContextual"/>
         </w:rPr>
       </w:pPr>
-      <w:hyperlink w:anchor="_Toc243938837" w:history="1">
+      <w:hyperlink w:anchor="_Toc243939442" w:history="1">
         <w:r>
           <w:rPr>
             <w:rStyle w:val="Hyperlink"/>
@@ -860,7 +860,7 @@
             <w:noProof/>
             <w:webHidden/>
           </w:rPr>
-          <w:instrText xml:space="preserve"> PAGEREF _Toc243938837 \h </w:instrText>
+          <w:instrText xml:space="preserve"> PAGEREF _Toc243939442 \h </w:instrText>
         </w:r>
         <w:r>
           <w:rPr>
@@ -906,7 +906,7 @@
           <w14:ligatures w14:val="standardContextual"/>
         </w:rPr>
       </w:pPr>
-      <w:hyperlink w:anchor="_Toc243938838" w:history="1">
+      <w:hyperlink w:anchor="_Toc243939443" w:history="1">
         <w:r>
           <w:rPr>
             <w:rStyle w:val="Hyperlink"/>
@@ -933,7 +933,7 @@
             <w:noProof/>
             <w:webHidden/>
           </w:rPr>
-          <w:instrText xml:space="preserve"> PAGEREF _Toc243938838 \h </w:instrText>
+          <w:instrText xml:space="preserve"> PAGEREF _Toc243939443 \h </w:instrText>
         </w:r>
         <w:r>
           <w:rPr>
@@ -979,7 +979,7 @@
           <w14:ligatures w14:val="standardContextual"/>
         </w:rPr>
       </w:pPr>
-      <w:hyperlink w:anchor="_Toc243938839" w:history="1">
+      <w:hyperlink w:anchor="_Toc243939444" w:history="1">
         <w:r>
           <w:rPr>
             <w:rStyle w:val="Hyperlink"/>
@@ -1006,7 +1006,7 @@
             <w:noProof/>
             <w:webHidden/>
           </w:rPr>
-          <w:instrText xml:space="preserve"> PAGEREF _Toc243938839 \h </w:instrText>
+          <w:instrText xml:space="preserve"> PAGEREF _Toc243939444 \h </w:instrText>
         </w:r>
         <w:r>
           <w:rPr>
@@ -1052,7 +1052,7 @@
           <w14:ligatures w14:val="standardContextual"/>
         </w:rPr>
       </w:pPr>
-      <w:hyperlink w:anchor="_Toc243938840" w:history="1">
+      <w:hyperlink w:anchor="_Toc243939445" w:history="1">
         <w:r>
           <w:rPr>
             <w:rStyle w:val="Hyperlink"/>
@@ -1079,7 +1079,7 @@
             <w:noProof/>
             <w:webHidden/>
           </w:rPr>
-          <w:instrText xml:space="preserve"> PAGEREF _Toc243938840 \h </w:instrText>
+          <w:instrText xml:space="preserve"> PAGEREF _Toc243939445 \h </w:instrText>
         </w:r>
         <w:r>
           <w:rPr>
@@ -1125,7 +1125,7 @@
           <w14:ligatures w14:val="standardContextual"/>
         </w:rPr>
       </w:pPr>
-      <w:hyperlink w:anchor="_Toc243938841" w:history="1">
+      <w:hyperlink w:anchor="_Toc243939446" w:history="1">
         <w:r>
           <w:rPr>
             <w:rStyle w:val="Hyperlink"/>
@@ -1152,7 +1152,7 @@
             <w:noProof/>
             <w:webHidden/>
           </w:rPr>
-          <w:instrText xml:space="preserve"> PAGEREF _Toc243938841 \h </w:instrText>
+          <w:instrText xml:space="preserve"> PAGEREF _Toc243939446 \h </w:instrText>
         </w:r>
         <w:r>
           <w:rPr>
@@ -1198,7 +1198,7 @@
           <w14:ligatures w14:val="standardContextual"/>
         </w:rPr>
       </w:pPr>
-      <w:hyperlink w:anchor="_Toc243938842" w:history="1">
+      <w:hyperlink w:anchor="_Toc243939447" w:history="1">
         <w:r>
           <w:rPr>
             <w:rStyle w:val="Hyperlink"/>
@@ -1225,7 +1225,7 @@
             <w:noProof/>
             <w:webHidden/>
           </w:rPr>
-          <w:instrText xml:space="preserve"> PAGEREF _Toc243938842 \h </w:instrText>
+          <w:instrText xml:space="preserve"> PAGEREF _Toc243939447 \h </w:instrText>
         </w:r>
         <w:r>
           <w:rPr>
@@ -1271,7 +1271,7 @@
           <w14:ligatures w14:val="standardContextual"/>
         </w:rPr>
       </w:pPr>
-      <w:hyperlink w:anchor="_Toc243938843" w:history="1">
+      <w:hyperlink w:anchor="_Toc243939448" w:history="1">
         <w:r>
           <w:rPr>
             <w:rStyle w:val="Hyperlink"/>
@@ -1298,7 +1298,7 @@
             <w:noProof/>
             <w:webHidden/>
           </w:rPr>
-          <w:instrText xml:space="preserve"> PAGEREF _Toc243938843 \h </w:instrText>
+          <w:instrText xml:space="preserve"> PAGEREF _Toc243939448 \h </w:instrText>
         </w:r>
         <w:r>
           <w:rPr>
@@ -1344,7 +1344,7 @@
           <w14:ligatures w14:val="standardContextual"/>
         </w:rPr>
       </w:pPr>
-      <w:hyperlink w:anchor="_Toc243938844" w:history="1">
+      <w:hyperlink w:anchor="_Toc243939449" w:history="1">
         <w:r>
           <w:rPr>
             <w:rStyle w:val="Hyperlink"/>
@@ -1371,7 +1371,7 @@
             <w:noProof/>
             <w:webHidden/>
           </w:rPr>
-          <w:instrText xml:space="preserve"> PAGEREF _Toc243938844 \h </w:instrText>
+          <w:instrText xml:space="preserve"> PAGEREF _Toc243939449 \h </w:instrText>
         </w:r>
         <w:r>
           <w:rPr>
@@ -1417,7 +1417,7 @@
           <w14:ligatures w14:val="standardContextual"/>
         </w:rPr>
       </w:pPr>
-      <w:hyperlink w:anchor="_Toc243938845" w:history="1">
+      <w:hyperlink w:anchor="_Toc243939450" w:history="1">
         <w:r>
           <w:rPr>
             <w:rStyle w:val="Hyperlink"/>
@@ -1444,7 +1444,7 @@
             <w:noProof/>
             <w:webHidden/>
           </w:rPr>
-          <w:instrText xml:space="preserve"> PAGEREF _Toc243938845 \h </w:instrText>
+          <w:instrText xml:space="preserve"> PAGEREF _Toc243939450 \h </w:instrText>
         </w:r>
         <w:r>
           <w:rPr>
@@ -1490,7 +1490,7 @@
           <w14:ligatures w14:val="standardContextual"/>
         </w:rPr>
       </w:pPr>
-      <w:hyperlink w:anchor="_Toc243938846" w:history="1">
+      <w:hyperlink w:anchor="_Toc243939451" w:history="1">
         <w:r>
           <w:rPr>
             <w:rStyle w:val="Hyperlink"/>
@@ -1517,7 +1517,7 @@
             <w:noProof/>
             <w:webHidden/>
           </w:rPr>
-          <w:instrText xml:space="preserve"> PAGEREF _Toc243938846 \h </w:instrText>
+          <w:instrText xml:space="preserve"> PAGEREF _Toc243939451 \h </w:instrText>
         </w:r>
         <w:r>
           <w:rPr>
@@ -1563,7 +1563,7 @@
           <w14:ligatures w14:val="standardContextual"/>
         </w:rPr>
       </w:pPr>
-      <w:hyperlink w:anchor="_Toc243938847" w:history="1">
+      <w:hyperlink w:anchor="_Toc243939452" w:history="1">
         <w:r>
           <w:rPr>
             <w:rStyle w:val="Hyperlink"/>
@@ -1590,7 +1590,7 @@
             <w:noProof/>
             <w:webHidden/>
           </w:rPr>
-          <w:instrText xml:space="preserve"> PAGEREF _Toc243938847 \h </w:instrText>
+          <w:instrText xml:space="preserve"> PAGEREF _Toc243939452 \h </w:instrText>
         </w:r>
         <w:r>
           <w:rPr>
@@ -1636,7 +1636,7 @@
           <w14:ligatures w14:val="standardContextual"/>
         </w:rPr>
       </w:pPr>
-      <w:hyperlink w:anchor="_Toc243938848" w:history="1">
+      <w:hyperlink w:anchor="_Toc243939453" w:history="1">
         <w:r>
           <w:rPr>
             <w:rStyle w:val="Hyperlink"/>
@@ -1663,7 +1663,7 @@
             <w:noProof/>
             <w:webHidden/>
           </w:rPr>
-          <w:instrText xml:space="preserve"> PAGEREF _Toc243938848 \h </w:instrText>
+          <w:instrText xml:space="preserve"> PAGEREF _Toc243939453 \h </w:instrText>
         </w:r>
         <w:r>
           <w:rPr>
@@ -1709,7 +1709,7 @@
           <w14:ligatures w14:val="standardContextual"/>
         </w:rPr>
       </w:pPr>
-      <w:hyperlink w:anchor="_Toc243938849" w:history="1">
+      <w:hyperlink w:anchor="_Toc243939454" w:history="1">
         <w:r>
           <w:rPr>
             <w:rStyle w:val="Hyperlink"/>
@@ -1736,7 +1736,7 @@
             <w:noProof/>
             <w:webHidden/>
           </w:rPr>
-          <w:instrText xml:space="preserve"> PAGEREF _Toc243938849 \h </w:instrText>
+          <w:instrText xml:space="preserve"> PAGEREF _Toc243939454 \h </w:instrText>
         </w:r>
         <w:r>
           <w:rPr>
@@ -1782,7 +1782,7 @@
           <w14:ligatures w14:val="standardContextual"/>
         </w:rPr>
       </w:pPr>
-      <w:hyperlink w:anchor="_Toc243938850" w:history="1">
+      <w:hyperlink w:anchor="_Toc243939455" w:history="1">
         <w:r>
           <w:rPr>
             <w:rStyle w:val="Hyperlink"/>
@@ -1809,7 +1809,7 @@
             <w:noProof/>
             <w:webHidden/>
           </w:rPr>
-          <w:instrText xml:space="preserve"> PAGEREF _Toc243938850 \h </w:instrText>
+          <w:instrText xml:space="preserve"> PAGEREF _Toc243939455 \h </w:instrText>
         </w:r>
         <w:r>
           <w:rPr>
@@ -1855,7 +1855,7 @@
           <w14:ligatures w14:val="standardContextual"/>
         </w:rPr>
       </w:pPr>
-      <w:hyperlink w:anchor="_Toc243938851" w:history="1">
+      <w:hyperlink w:anchor="_Toc243939456" w:history="1">
         <w:r>
           <w:rPr>
             <w:rStyle w:val="Hyperlink"/>
@@ -1882,7 +1882,7 @@
             <w:noProof/>
             <w:webHidden/>
           </w:rPr>
-          <w:instrText xml:space="preserve"> PAGEREF _Toc243938851 \h </w:instrText>
+          <w:instrText xml:space="preserve"> PAGEREF _Toc243939456 \h </w:instrText>
         </w:r>
         <w:r>
           <w:rPr>
@@ -1928,7 +1928,7 @@
           <w14:ligatures w14:val="standardContextual"/>
         </w:rPr>
       </w:pPr>
-      <w:hyperlink w:anchor="_Toc243938852" w:history="1">
+      <w:hyperlink w:anchor="_Toc243939457" w:history="1">
         <w:r>
           <w:rPr>
             <w:rStyle w:val="Hyperlink"/>
@@ -1955,7 +1955,7 @@
             <w:noProof/>
             <w:webHidden/>
           </w:rPr>
-          <w:instrText xml:space="preserve"> PAGEREF _Toc243938852 \h </w:instrText>
+          <w:instrText xml:space="preserve"> PAGEREF _Toc243939457 \h </w:instrText>
         </w:r>
         <w:r>
           <w:rPr>
@@ -2001,7 +2001,7 @@
           <w14:ligatures w14:val="standardContextual"/>
         </w:rPr>
       </w:pPr>
-      <w:hyperlink w:anchor="_Toc243938853" w:history="1">
+      <w:hyperlink w:anchor="_Toc243939458" w:history="1">
         <w:r>
           <w:rPr>
             <w:rStyle w:val="Hyperlink"/>
@@ -2028,7 +2028,7 @@
             <w:noProof/>
             <w:webHidden/>
           </w:rPr>
-          <w:instrText xml:space="preserve"> PAGEREF _Toc243938853 \h </w:instrText>
+          <w:instrText xml:space="preserve"> PAGEREF _Toc243939458 \h </w:instrText>
         </w:r>
         <w:r>
           <w:rPr>
@@ -2074,7 +2074,7 @@
           <w14:ligatures w14:val="standardContextual"/>
         </w:rPr>
       </w:pPr>
-      <w:hyperlink w:anchor="_Toc243938854" w:history="1">
+      <w:hyperlink w:anchor="_Toc243939459" w:history="1">
         <w:r>
           <w:rPr>
             <w:rStyle w:val="Hyperlink"/>
@@ -2101,7 +2101,7 @@
             <w:noProof/>
             <w:webHidden/>
           </w:rPr>
-          <w:instrText xml:space="preserve"> PAGEREF _Toc243938854 \h </w:instrText>
+          <w:instrText xml:space="preserve"> PAGEREF _Toc243939459 \h </w:instrText>
         </w:r>
         <w:r>
           <w:rPr>
@@ -2147,7 +2147,7 @@
           <w14:ligatures w14:val="standardContextual"/>
         </w:rPr>
       </w:pPr>
-      <w:hyperlink w:anchor="_Toc243938855" w:history="1">
+      <w:hyperlink w:anchor="_Toc243939460" w:history="1">
         <w:r>
           <w:rPr>
             <w:rStyle w:val="Hyperlink"/>
@@ -2174,7 +2174,7 @@
             <w:noProof/>
             <w:webHidden/>
           </w:rPr>
-          <w:instrText xml:space="preserve"> PAGEREF _Toc243938855 \h </w:instrText>
+          <w:instrText xml:space="preserve"> PAGEREF _Toc243939460 \h </w:instrText>
         </w:r>
         <w:r>
           <w:rPr>
@@ -2220,7 +2220,7 @@
           <w14:ligatures w14:val="standardContextual"/>
         </w:rPr>
       </w:pPr>
-      <w:hyperlink w:anchor="_Toc243938856" w:history="1">
+      <w:hyperlink w:anchor="_Toc243939461" w:history="1">
         <w:r>
           <w:rPr>
             <w:rStyle w:val="Hyperlink"/>
@@ -2247,7 +2247,7 @@
             <w:noProof/>
             <w:webHidden/>
           </w:rPr>
-          <w:instrText xml:space="preserve"> PAGEREF _Toc243938856 \h </w:instrText>
+          <w:instrText xml:space="preserve"> PAGEREF _Toc243939461 \h </w:instrText>
         </w:r>
         <w:r>
           <w:rPr>
@@ -2293,7 +2293,7 @@
           <w14:ligatures w14:val="standardContextual"/>
         </w:rPr>
       </w:pPr>
-      <w:hyperlink w:anchor="_Toc243938857" w:history="1">
+      <w:hyperlink w:anchor="_Toc243939462" w:history="1">
         <w:r>
           <w:rPr>
             <w:rStyle w:val="Hyperlink"/>
@@ -2320,7 +2320,7 @@
             <w:noProof/>
             <w:webHidden/>
           </w:rPr>
-          <w:instrText xml:space="preserve"> PAGEREF _Toc243938857 \h </w:instrText>
+          <w:instrText xml:space="preserve"> PAGEREF _Toc243939462 \h </w:instrText>
         </w:r>
         <w:r>
           <w:rPr>
@@ -2366,7 +2366,7 @@
           <w14:ligatures w14:val="standardContextual"/>
         </w:rPr>
       </w:pPr>
-      <w:hyperlink w:anchor="_Toc243938858" w:history="1">
+      <w:hyperlink w:anchor="_Toc243939463" w:history="1">
         <w:r>
           <w:rPr>
             <w:rStyle w:val="Hyperlink"/>
@@ -2393,7 +2393,7 @@
             <w:noProof/>
             <w:webHidden/>
           </w:rPr>
-          <w:instrText xml:space="preserve"> PAGEREF _Toc243938858 \h </w:instrText>
+          <w:instrText xml:space="preserve"> PAGEREF _Toc243939463 \h </w:instrText>
         </w:r>
         <w:r>
           <w:rPr>
@@ -2438,7 +2438,7 @@
       <w:pPr>
         <w:pStyle w:val="Heading1"/>
       </w:pPr>
-      <w:bookmarkStart w:id="1" w:name="_Toc243938831"/>
+      <w:bookmarkStart w:id="1" w:name="_Toc243939436"/>
       <w:r>
         <w:lastRenderedPageBreak/>
         <w:t>Abstract</w:t>
@@ -2480,7 +2480,7 @@
       <w:pPr>
         <w:pStyle w:val="Heading1"/>
       </w:pPr>
-      <w:bookmarkStart w:id="2" w:name="_Toc243938832"/>
+      <w:bookmarkStart w:id="2" w:name="_Toc243939437"/>
       <w:r>
         <w:t>1. Introduction and Recap of the Research Problem</w:t>
       </w:r>
@@ -2519,7 +2519,7 @@
             <w:color w:val="1F5FA8"/>
             <w:u w:val="single"/>
           </w:rPr>
-          <w:t>https://github.com/rathiabeth/module2-numerical-surrogate-antenna-design</w:t>
+          <w:t>https://github.com/rathiabeth-sudo/902---Module-2</w:t>
         </w:r>
       </w:hyperlink>
       <w:r>
@@ -3270,7 +3270,7 @@
           <w:noProof/>
         </w:rPr>
         <w:drawing>
-          <wp:inline distT="0" distB="0" distL="0" distR="0" wp14:anchorId="1BAE283C" wp14:editId="034A5766">
+          <wp:inline distT="0" distB="0" distL="0" distR="0" wp14:anchorId="1EA9B7B1" wp14:editId="6FF8C422">
             <wp:extent cx="5760720" cy="2747420"/>
             <wp:effectExtent l="0" t="0" r="0" b="0"/>
             <wp:docPr id="1" name="Picture 1"/>
@@ -3319,7 +3319,7 @@
       <w:pPr>
         <w:pStyle w:val="Heading1"/>
       </w:pPr>
-      <w:bookmarkStart w:id="3" w:name="_Toc243938833"/>
+      <w:bookmarkStart w:id="3" w:name="_Toc243939438"/>
       <w:r>
         <w:t>2. Research Design and Hypotheses</w:t>
       </w:r>
@@ -3781,7 +3781,7 @@
       <w:pPr>
         <w:pStyle w:val="Heading1"/>
       </w:pPr>
-      <w:bookmarkStart w:id="4" w:name="_Toc243938834"/>
+      <w:bookmarkStart w:id="4" w:name="_Toc243939439"/>
       <w:r>
         <w:t>3. Dataset Description and Source Verification</w:t>
       </w:r>
@@ -4120,7 +4120,7 @@
       <w:pPr>
         <w:pStyle w:val="Heading1"/>
       </w:pPr>
-      <w:bookmarkStart w:id="5" w:name="_Toc243938835"/>
+      <w:bookmarkStart w:id="5" w:name="_Toc243939440"/>
       <w:r>
         <w:t>4. Data Preprocessing and Preparation</w:t>
       </w:r>
@@ -4130,7 +4130,7 @@
       <w:pPr>
         <w:pStyle w:val="Heading2"/>
       </w:pPr>
-      <w:bookmarkStart w:id="6" w:name="_Toc243938836"/>
+      <w:bookmarkStart w:id="6" w:name="_Toc243939441"/>
       <w:r>
         <w:t>4.1 Targets and label rules</w:t>
       </w:r>
@@ -4208,7 +4208,7 @@
       <w:pPr>
         <w:pStyle w:val="Heading2"/>
       </w:pPr>
-      <w:bookmarkStart w:id="7" w:name="_Toc243938837"/>
+      <w:bookmarkStart w:id="7" w:name="_Toc243939442"/>
       <w:r>
         <w:t>4.2 Standardised geometry images</w:t>
       </w:r>
@@ -4236,7 +4236,7 @@
           <w:noProof/>
         </w:rPr>
         <w:drawing>
-          <wp:inline distT="0" distB="0" distL="0" distR="0" wp14:anchorId="5607901D" wp14:editId="7B307AE1">
+          <wp:inline distT="0" distB="0" distL="0" distR="0" wp14:anchorId="35894D74" wp14:editId="6F6D33C7">
             <wp:extent cx="5760720" cy="1780586"/>
             <wp:effectExtent l="0" t="0" r="0" b="0"/>
             <wp:docPr id="2" name="Picture 2"/>
@@ -4291,7 +4291,7 @@
           <w:noProof/>
         </w:rPr>
         <w:drawing>
-          <wp:inline distT="0" distB="0" distL="0" distR="0" wp14:anchorId="0DE7127C" wp14:editId="74BCE58D">
+          <wp:inline distT="0" distB="0" distL="0" distR="0" wp14:anchorId="4B6854ED" wp14:editId="7C8ED6D8">
             <wp:extent cx="5120640" cy="981456"/>
             <wp:effectExtent l="0" t="0" r="0" b="0"/>
             <wp:docPr id="3" name="Picture 3"/>
@@ -4340,7 +4340,7 @@
       <w:pPr>
         <w:pStyle w:val="Heading2"/>
       </w:pPr>
-      <w:bookmarkStart w:id="8" w:name="_Toc243938838"/>
+      <w:bookmarkStart w:id="8" w:name="_Toc243939443"/>
       <w:r>
         <w:t>4.3 Cleaning, duplicates and leakage control</w:t>
       </w:r>
@@ -4442,7 +4442,7 @@
       <w:pPr>
         <w:pStyle w:val="Heading1"/>
       </w:pPr>
-      <w:bookmarkStart w:id="9" w:name="_Toc243938839"/>
+      <w:bookmarkStart w:id="9" w:name="_Toc243939444"/>
       <w:r>
         <w:lastRenderedPageBreak/>
         <w:t>5. Proposed Model: Vision Transformer</w:t>
@@ -4492,7 +4492,7 @@
       <w:pPr>
         <w:pStyle w:val="Heading1"/>
       </w:pPr>
-      <w:bookmarkStart w:id="10" w:name="_Toc243938840"/>
+      <w:bookmarkStart w:id="10" w:name="_Toc243939445"/>
       <w:r>
         <w:t>6. Training Strategy and Experimental Setup</w:t>
       </w:r>
@@ -5053,7 +5053,7 @@
       <w:pPr>
         <w:pStyle w:val="Heading1"/>
       </w:pPr>
-      <w:bookmarkStart w:id="11" w:name="_Toc243938841"/>
+      <w:bookmarkStart w:id="11" w:name="_Toc243939446"/>
       <w:r>
         <w:t>7. Baseline Methods and Comparative Models</w:t>
       </w:r>
@@ -5119,7 +5119,7 @@
       <w:pPr>
         <w:pStyle w:val="Heading1"/>
       </w:pPr>
-      <w:bookmarkStart w:id="12" w:name="_Toc243938842"/>
+      <w:bookmarkStart w:id="12" w:name="_Toc243939447"/>
       <w:r>
         <w:t>8. Evaluation Metrics and Analysis Plan</w:t>
       </w:r>
@@ -5140,7 +5140,7 @@
       <w:pPr>
         <w:pStyle w:val="Heading1"/>
       </w:pPr>
-      <w:bookmarkStart w:id="13" w:name="_Toc243938843"/>
+      <w:bookmarkStart w:id="13" w:name="_Toc243939448"/>
       <w:r>
         <w:t>9. Results and Discussion</w:t>
       </w:r>
@@ -5158,7 +5158,7 @@
       <w:pPr>
         <w:pStyle w:val="Heading2"/>
       </w:pPr>
-      <w:bookmarkStart w:id="14" w:name="_Toc243938844"/>
+      <w:bookmarkStart w:id="14" w:name="_Toc243939449"/>
       <w:r>
         <w:lastRenderedPageBreak/>
         <w:t>9.1 Main task: geometry image to matching class (RQ1, RQ2)</w:t>
@@ -6217,7 +6217,7 @@
           <w:noProof/>
         </w:rPr>
         <w:drawing>
-          <wp:inline distT="0" distB="0" distL="0" distR="0" wp14:anchorId="0DBF4F82" wp14:editId="7F59D64F">
+          <wp:inline distT="0" distB="0" distL="0" distR="0" wp14:anchorId="0ED51901" wp14:editId="202CEAA5">
             <wp:extent cx="5760720" cy="1400175"/>
             <wp:effectExtent l="0" t="0" r="0" b="0"/>
             <wp:docPr id="4" name="Picture 4"/>
@@ -6272,7 +6272,7 @@
           <w:noProof/>
         </w:rPr>
         <w:drawing>
-          <wp:inline distT="0" distB="0" distL="0" distR="0" wp14:anchorId="347F9BB9" wp14:editId="1E85C7F9">
+          <wp:inline distT="0" distB="0" distL="0" distR="0" wp14:anchorId="76328704" wp14:editId="0B72A4CF">
             <wp:extent cx="5486400" cy="1351722"/>
             <wp:effectExtent l="0" t="0" r="0" b="0"/>
             <wp:docPr id="5" name="Picture 5"/>
@@ -6321,7 +6321,7 @@
       <w:pPr>
         <w:pStyle w:val="Heading2"/>
       </w:pPr>
-      <w:bookmarkStart w:id="15" w:name="_Toc243938845"/>
+      <w:bookmarkStart w:id="15" w:name="_Toc243939450"/>
       <w:r>
         <w:lastRenderedPageBreak/>
         <w:t>9.2 Diagnosing the underperformance: Amendment 1 and augmentation ablation</w:t>
@@ -6739,7 +6739,7 @@
       <w:pPr>
         <w:pStyle w:val="Heading2"/>
       </w:pPr>
-      <w:bookmarkStart w:id="16" w:name="_Toc243938846"/>
+      <w:bookmarkStart w:id="16" w:name="_Toc243939451"/>
       <w:r>
         <w:t>9.3 Secondary task and modality comparison (RQ3)</w:t>
       </w:r>
@@ -7045,7 +7045,7 @@
         </w:rPr>
         <w:lastRenderedPageBreak/>
         <w:drawing>
-          <wp:inline distT="0" distB="0" distL="0" distR="0" wp14:anchorId="0D55650A" wp14:editId="2011F259">
+          <wp:inline distT="0" distB="0" distL="0" distR="0" wp14:anchorId="48295285" wp14:editId="744F906E">
             <wp:extent cx="5486400" cy="2194560"/>
             <wp:effectExtent l="0" t="0" r="0" b="0"/>
             <wp:docPr id="6" name="Picture 6"/>
@@ -7120,7 +7120,7 @@
       <w:pPr>
         <w:pStyle w:val="Heading2"/>
       </w:pPr>
-      <w:bookmarkStart w:id="17" w:name="_Toc243938847"/>
+      <w:bookmarkStart w:id="17" w:name="_Toc243939452"/>
       <w:r>
         <w:t>9.4 Explainability (RQ4)</w:t>
       </w:r>
@@ -7136,7 +7136,7 @@
           <w:noProof/>
         </w:rPr>
         <w:drawing>
-          <wp:inline distT="0" distB="0" distL="0" distR="0" wp14:anchorId="6B8AFF45" wp14:editId="4E6FEA15">
+          <wp:inline distT="0" distB="0" distL="0" distR="0" wp14:anchorId="2B64BD2E" wp14:editId="52BA52DE">
             <wp:extent cx="5760720" cy="1847187"/>
             <wp:effectExtent l="0" t="0" r="0" b="0"/>
             <wp:docPr id="7" name="Picture 7"/>
@@ -7191,7 +7191,7 @@
           <w:noProof/>
         </w:rPr>
         <w:drawing>
-          <wp:inline distT="0" distB="0" distL="0" distR="0" wp14:anchorId="367416C0" wp14:editId="1E99858A">
+          <wp:inline distT="0" distB="0" distL="0" distR="0" wp14:anchorId="510A0196" wp14:editId="07EBC9C3">
             <wp:extent cx="5029200" cy="1788160"/>
             <wp:effectExtent l="0" t="0" r="0" b="0"/>
             <wp:docPr id="8" name="Picture 8"/>
@@ -7261,7 +7261,7 @@
       <w:pPr>
         <w:pStyle w:val="Heading2"/>
       </w:pPr>
-      <w:bookmarkStart w:id="18" w:name="_Toc243938848"/>
+      <w:bookmarkStart w:id="18" w:name="_Toc243939453"/>
       <w:r>
         <w:t>9.5 Robustness and out-of-distribution generalisation (RQ5)</w:t>
       </w:r>
@@ -7888,7 +7888,7 @@
       <w:pPr>
         <w:pStyle w:val="Heading2"/>
       </w:pPr>
-      <w:bookmarkStart w:id="19" w:name="_Toc243938849"/>
+      <w:bookmarkStart w:id="19" w:name="_Toc243939454"/>
       <w:r>
         <w:lastRenderedPageBreak/>
         <w:t>9.6 Summary of hypotheses</w:t>
@@ -8253,7 +8253,7 @@
       <w:pPr>
         <w:pStyle w:val="Heading1"/>
       </w:pPr>
-      <w:bookmarkStart w:id="20" w:name="_Toc243938850"/>
+      <w:bookmarkStart w:id="20" w:name="_Toc243939455"/>
       <w:r>
         <w:t>10. Ethics, Bias, Privacy, and Reproducibility</w:t>
       </w:r>
@@ -8322,7 +8322,7 @@
       <w:pPr>
         <w:pStyle w:val="Heading1"/>
       </w:pPr>
-      <w:bookmarkStart w:id="21" w:name="_Toc243938851"/>
+      <w:bookmarkStart w:id="21" w:name="_Toc243939456"/>
       <w:r>
         <w:t>11. Limitations and Future Work</w:t>
       </w:r>
@@ -8434,7 +8434,7 @@
       <w:pPr>
         <w:pStyle w:val="Heading1"/>
       </w:pPr>
-      <w:bookmarkStart w:id="22" w:name="_Toc243938852"/>
+      <w:bookmarkStart w:id="22" w:name="_Toc243939457"/>
       <w:r>
         <w:t>12. Conclusion</w:t>
       </w:r>
@@ -8458,7 +8458,7 @@
       <w:pPr>
         <w:pStyle w:val="Heading1"/>
       </w:pPr>
-      <w:bookmarkStart w:id="23" w:name="_Toc243938853"/>
+      <w:bookmarkStart w:id="23" w:name="_Toc243939458"/>
       <w:r>
         <w:t>Data, Code and Output Availability</w:t>
       </w:r>
@@ -8477,7 +8477,7 @@
             <w:color w:val="1F5FA8"/>
             <w:u w:val="single"/>
           </w:rPr>
-          <w:t>https://github.com/rathiabeth/module1-vit-antenna-image-classification</w:t>
+          <w:t>https://github.com/rathiabeth-sudo/901---module-1</w:t>
         </w:r>
       </w:hyperlink>
       <w:r>
@@ -8489,7 +8489,7 @@
             <w:color w:val="1F5FA8"/>
             <w:u w:val="single"/>
           </w:rPr>
-          <w:t>https://github.com/rathiabeth/module2-numerical-surrogate-antenna-design</w:t>
+          <w:t>https://github.com/rathiabeth-sudo/902---Module-2</w:t>
         </w:r>
       </w:hyperlink>
       <w:r>
@@ -9453,7 +9453,7 @@
               <w:rPr>
                 <w:sz w:val="19"/>
               </w:rPr>
-              <w:t>Stored pytest output (18 passed in 4.18s)</w:t>
+              <w:t>Stored pytest output (18 passed in 4.53s)</w:t>
             </w:r>
           </w:p>
         </w:tc>
@@ -9825,7 +9825,7 @@
       <w:pPr>
         <w:pStyle w:val="Heading1"/>
       </w:pPr>
-      <w:bookmarkStart w:id="24" w:name="_Toc243938854"/>
+      <w:bookmarkStart w:id="24" w:name="_Toc243939459"/>
       <w:r>
         <w:t>References</w:t>
       </w:r>
@@ -9964,7 +9964,7 @@
       <w:pPr>
         <w:pStyle w:val="Heading1"/>
       </w:pPr>
-      <w:bookmarkStart w:id="25" w:name="_Toc243938855"/>
+      <w:bookmarkStart w:id="25" w:name="_Toc243939460"/>
       <w:r>
         <w:lastRenderedPageBreak/>
         <w:t>Appendix A. Data Dictionary</w:t>
@@ -11923,7 +11923,7 @@
       <w:pPr>
         <w:pStyle w:val="Heading1"/>
       </w:pPr>
-      <w:bookmarkStart w:id="26" w:name="_Toc243938856"/>
+      <w:bookmarkStart w:id="26" w:name="_Toc243939461"/>
       <w:r>
         <w:t>Appendix B. Configuration</w:t>
       </w:r>
@@ -12071,12 +12071,6 @@
           <w:sz w:val="17"/>
         </w:rPr>
         <w:br/>
-      </w:r>
-      <w:r>
-        <w:rPr>
-          <w:rFonts w:ascii="Consolas" w:hAnsi="Consolas"/>
-          <w:sz w:val="17"/>
-        </w:rPr>
         <w:t xml:space="preserve">    file: data/train-00000-of-00001.parquet</w:t>
       </w:r>
       <w:r>
@@ -12156,6 +12150,12 @@
           <w:sz w:val="17"/>
         </w:rPr>
         <w:br/>
+      </w:r>
+      <w:r>
+        <w:rPr>
+          <w:rFonts w:ascii="Consolas" w:hAnsi="Consolas"/>
+          <w:sz w:val="17"/>
+        </w:rPr>
         <w:t xml:space="preserve">  # -20 dB as the "high" boundary is a project ASSUMPTION that requires engineering confirmation.</w:t>
       </w:r>
       <w:r>
@@ -12180,12 +12180,6 @@
           <w:sz w:val="17"/>
         </w:rPr>
         <w:br/>
-      </w:r>
-      <w:r>
-        <w:rPr>
-          <w:rFonts w:ascii="Consolas" w:hAnsi="Consolas"/>
-          <w:sz w:val="17"/>
-        </w:rPr>
         <w:t xml:space="preserve">  # Band edges (GHz) from 3GPP TS 38.101-1 (FR1 upper edge 7.125 GHz; n77 3.3-4.2, n79 4.4-5.0).</w:t>
       </w:r>
       <w:r>
@@ -12265,6 +12259,12 @@
           <w:sz w:val="17"/>
         </w:rPr>
         <w:br/>
+      </w:r>
+      <w:r>
+        <w:rPr>
+          <w:rFonts w:ascii="Consolas" w:hAnsi="Consolas"/>
+          <w:sz w:val="17"/>
+        </w:rPr>
         <w:t xml:space="preserve">  # Out-of-distribution hold-out: the widest patches (W/L ratio above this) never enter train/val/test.</w:t>
       </w:r>
       <w:r>
@@ -12296,12 +12296,6 @@
           <w:sz w:val="17"/>
         </w:rPr>
         <w:br/>
-      </w:r>
-      <w:r>
-        <w:rPr>
-          <w:rFonts w:ascii="Consolas" w:hAnsi="Consolas"/>
-          <w:sz w:val="17"/>
-        </w:rPr>
         <w:t xml:space="preserve">  size: 224          # final image size (pixels)</w:t>
       </w:r>
       <w:r>
@@ -12381,6 +12375,12 @@
           <w:sz w:val="17"/>
         </w:rPr>
         <w:br/>
+      </w:r>
+      <w:r>
+        <w:rPr>
+          <w:rFonts w:ascii="Consolas" w:hAnsi="Consolas"/>
+          <w:sz w:val="17"/>
+        </w:rPr>
         <w:t xml:space="preserve">  lr_backbone: 3.0e-5</w:t>
       </w:r>
       <w:r>
@@ -12405,12 +12405,6 @@
           <w:sz w:val="17"/>
         </w:rPr>
         <w:br/>
-      </w:r>
-      <w:r>
-        <w:rPr>
-          <w:rFonts w:ascii="Consolas" w:hAnsi="Consolas"/>
-          <w:sz w:val="17"/>
-        </w:rPr>
         <w:t xml:space="preserve">  patience: 3              # early stopping on validation macro-F1 (reduced from 8 for CPU budget)</w:t>
       </w:r>
       <w:r>
@@ -12628,7 +12622,7 @@
       <w:pPr>
         <w:pStyle w:val="Heading1"/>
       </w:pPr>
-      <w:bookmarkStart w:id="27" w:name="_Toc243938857"/>
+      <w:bookmarkStart w:id="27" w:name="_Toc243939462"/>
       <w:r>
         <w:t>Appendix C. Experimental Details</w:t>
       </w:r>
@@ -14975,7 +14969,7 @@
       <w:pPr>
         <w:pStyle w:val="Heading1"/>
       </w:pPr>
-      <w:bookmarkStart w:id="28" w:name="_Toc243938858"/>
+      <w:bookmarkStart w:id="28" w:name="_Toc243939463"/>
       <w:r>
         <w:t>Appendix D. Reproducibility Instructions</w:t>
       </w:r>
@@ -15054,11 +15048,11 @@
             <w:color w:val="1F5FA8"/>
             <w:u w:val="single"/>
           </w:rPr>
-          <w:t>https://github.com/rathiabeth/module1-vit-antenna-image-classification</w:t>
+          <w:t>https://github.com/rathiabeth-sudo/901---module-1</w:t>
         </w:r>
       </w:hyperlink>
       <w:r>
-        <w:t xml:space="preserve">. The pytest output (18 passed in 4.18s) is stored in </w:t>
+        <w:t xml:space="preserve">. The pytest output (18 passed in 4.53s) is stored in </w:t>
       </w:r>
       <w:hyperlink r:id="rId71">
         <w:r>
@@ -15349,31 +15343,31 @@
       </w:rPr>
     </w:lvl>
   </w:abstractNum>
-  <w:num w:numId="1" w16cid:durableId="1954822574">
+  <w:num w:numId="1" w16cid:durableId="491216165">
     <w:abstractNumId w:val="8"/>
   </w:num>
-  <w:num w:numId="2" w16cid:durableId="474032186">
+  <w:num w:numId="2" w16cid:durableId="465702767">
     <w:abstractNumId w:val="6"/>
   </w:num>
-  <w:num w:numId="3" w16cid:durableId="1218669266">
+  <w:num w:numId="3" w16cid:durableId="1814566928">
     <w:abstractNumId w:val="5"/>
   </w:num>
-  <w:num w:numId="4" w16cid:durableId="777289230">
+  <w:num w:numId="4" w16cid:durableId="1958565526">
     <w:abstractNumId w:val="4"/>
   </w:num>
-  <w:num w:numId="5" w16cid:durableId="962928708">
+  <w:num w:numId="5" w16cid:durableId="431976256">
     <w:abstractNumId w:val="7"/>
   </w:num>
-  <w:num w:numId="6" w16cid:durableId="2095129589">
+  <w:num w:numId="6" w16cid:durableId="12735042">
     <w:abstractNumId w:val="3"/>
   </w:num>
-  <w:num w:numId="7" w16cid:durableId="240482811">
+  <w:num w:numId="7" w16cid:durableId="1561790193">
     <w:abstractNumId w:val="2"/>
   </w:num>
-  <w:num w:numId="8" w16cid:durableId="1705254396">
+  <w:num w:numId="8" w16cid:durableId="1029648932">
     <w:abstractNumId w:val="1"/>
   </w:num>
-  <w:num w:numId="9" w16cid:durableId="1206990643">
+  <w:num w:numId="9" w16cid:durableId="1803962991">
     <w:abstractNumId w:val="0"/>
   </w:num>
 </w:numbering>
@@ -26763,7 +26757,7 @@
     <w:autoRedefine/>
     <w:uiPriority w:val="39"/>
     <w:unhideWhenUsed/>
-    <w:rsid w:val="0075332B"/>
+    <w:rsid w:val="006F3118"/>
     <w:pPr>
       <w:spacing w:after="100"/>
     </w:pPr>
@@ -26775,7 +26769,7 @@
     <w:autoRedefine/>
     <w:uiPriority w:val="39"/>
     <w:unhideWhenUsed/>
-    <w:rsid w:val="0075332B"/>
+    <w:rsid w:val="006F3118"/>
     <w:pPr>
       <w:spacing w:after="100"/>
       <w:ind w:left="220"/>
@@ -26786,7 +26780,7 @@
     <w:basedOn w:val="DefaultParagraphFont"/>
     <w:uiPriority w:val="99"/>
     <w:unhideWhenUsed/>
-    <w:rsid w:val="0075332B"/>
+    <w:rsid w:val="006F3118"/>
     <w:rPr>
       <w:color w:val="0000FF" w:themeColor="hyperlink"/>
       <w:u w:val="single"/>

</xml_diff>

<commit_message>
Add student details; describe the work as a project, not a document
Fills the title page and poster with the student's name, ID, programme and
submission date, removes the report-generated line and placeholder note, and
rewords self-references ('this report documents...') to refer to the project.

Co-Authored-By: Claude Opus 5.5 <noreply@anthropic.com>
</commit_message>
<xml_diff>
--- a/reports/module1_report.docx
+++ b/reports/module1_report.docx
@@ -91,7 +91,7 @@
           </w:tcPr>
           <w:p>
             <w:r>
-              <w:t>[to be completed by student]</w:t>
+              <w:t>Ms. Rathi Devadhas</w:t>
             </w:r>
           </w:p>
         </w:tc>
@@ -119,7 +119,7 @@
           </w:tcPr>
           <w:p>
             <w:r>
-              <w:t>[to be completed by student]</w:t>
+              <w:t>1737089</w:t>
             </w:r>
           </w:p>
         </w:tc>
@@ -137,7 +137,7 @@
               <w:rPr>
                 <w:b/>
               </w:rPr>
-              <w:t>Programme / Module</w:t>
+              <w:t>Programme</w:t>
             </w:r>
           </w:p>
         </w:tc>
@@ -147,7 +147,7 @@
           </w:tcPr>
           <w:p>
             <w:r>
-              <w:t>[to be completed by student]</w:t>
+              <w:t>Master of Applied Artificial Intelligence</w:t>
             </w:r>
           </w:p>
         </w:tc>
@@ -165,63 +165,7 @@
               <w:rPr>
                 <w:b/>
               </w:rPr>
-              <w:t>Institution</w:t>
-            </w:r>
-          </w:p>
-        </w:tc>
-        <w:tc>
-          <w:tcPr>
-            <w:tcW w:w="5102" w:type="dxa"/>
-          </w:tcPr>
-          <w:p>
-            <w:r>
-              <w:t>[to be completed by student]</w:t>
-            </w:r>
-          </w:p>
-        </w:tc>
-      </w:tr>
-      <w:tr>
-        <w:trPr>
-          <w:jc w:val="center"/>
-        </w:trPr>
-        <w:tc>
-          <w:tcPr>
-            <w:tcW w:w="2835" w:type="dxa"/>
-          </w:tcPr>
-          <w:p>
-            <w:r>
-              <w:rPr>
-                <w:b/>
-              </w:rPr>
               <w:t>Submission date</w:t>
-            </w:r>
-          </w:p>
-        </w:tc>
-        <w:tc>
-          <w:tcPr>
-            <w:tcW w:w="5102" w:type="dxa"/>
-          </w:tcPr>
-          <w:p>
-            <w:r>
-              <w:t>[to be completed by student]</w:t>
-            </w:r>
-          </w:p>
-        </w:tc>
-      </w:tr>
-      <w:tr>
-        <w:trPr>
-          <w:jc w:val="center"/>
-        </w:trPr>
-        <w:tc>
-          <w:tcPr>
-            <w:tcW w:w="2835" w:type="dxa"/>
-          </w:tcPr>
-          <w:p>
-            <w:r>
-              <w:rPr>
-                <w:b/>
-              </w:rPr>
-              <w:t>Report generated</w:t>
             </w:r>
           </w:p>
         </w:tc>
@@ -281,7 +225,7 @@
           <w:color w:val="5F6B76"/>
           <w:sz w:val="19"/>
         </w:rPr>
-        <w:t>Bracketed fields are deliberate placeholders for personal details that were not provided. All results are from executed experiments on public simulation data. Ansys HFSS was not available and was not run.</w:t>
+        <w:t>All results are from executed experiments on public simulation data. Ansys HFSS was not available and was not run.</w:t>
       </w:r>
       <w:r>
         <w:br w:type="page"/>
@@ -291,7 +235,7 @@
       <w:pPr>
         <w:pStyle w:val="Heading1"/>
       </w:pPr>
-      <w:bookmarkStart w:id="0" w:name="_Toc243939435"/>
+      <w:bookmarkStart w:id="0" w:name="_Toc243940026"/>
       <w:r>
         <w:lastRenderedPageBreak/>
         <w:t>Table of Contents</w:t>
@@ -322,7 +266,7 @@
       <w:r>
         <w:fldChar w:fldCharType="separate"/>
       </w:r>
-      <w:hyperlink w:anchor="_Toc243939435" w:history="1">
+      <w:hyperlink w:anchor="_Toc243940026" w:history="1">
         <w:r>
           <w:rPr>
             <w:rStyle w:val="Hyperlink"/>
@@ -349,7 +293,7 @@
             <w:noProof/>
             <w:webHidden/>
           </w:rPr>
-          <w:instrText xml:space="preserve"> PAGEREF _Toc243939435 \h </w:instrText>
+          <w:instrText xml:space="preserve"> PAGEREF _Toc243940026 \h </w:instrText>
         </w:r>
         <w:r>
           <w:rPr>
@@ -395,7 +339,7 @@
           <w14:ligatures w14:val="standardContextual"/>
         </w:rPr>
       </w:pPr>
-      <w:hyperlink w:anchor="_Toc243939436" w:history="1">
+      <w:hyperlink w:anchor="_Toc243940027" w:history="1">
         <w:r>
           <w:rPr>
             <w:rStyle w:val="Hyperlink"/>
@@ -422,7 +366,7 @@
             <w:noProof/>
             <w:webHidden/>
           </w:rPr>
-          <w:instrText xml:space="preserve"> PAGEREF _Toc243939436 \h </w:instrText>
+          <w:instrText xml:space="preserve"> PAGEREF _Toc243940027 \h </w:instrText>
         </w:r>
         <w:r>
           <w:rPr>
@@ -468,7 +412,7 @@
           <w14:ligatures w14:val="standardContextual"/>
         </w:rPr>
       </w:pPr>
-      <w:hyperlink w:anchor="_Toc243939437" w:history="1">
+      <w:hyperlink w:anchor="_Toc243940028" w:history="1">
         <w:r>
           <w:rPr>
             <w:rStyle w:val="Hyperlink"/>
@@ -495,7 +439,7 @@
             <w:noProof/>
             <w:webHidden/>
           </w:rPr>
-          <w:instrText xml:space="preserve"> PAGEREF _Toc243939437 \h </w:instrText>
+          <w:instrText xml:space="preserve"> PAGEREF _Toc243940028 \h </w:instrText>
         </w:r>
         <w:r>
           <w:rPr>
@@ -541,7 +485,7 @@
           <w14:ligatures w14:val="standardContextual"/>
         </w:rPr>
       </w:pPr>
-      <w:hyperlink w:anchor="_Toc243939438" w:history="1">
+      <w:hyperlink w:anchor="_Toc243940029" w:history="1">
         <w:r>
           <w:rPr>
             <w:rStyle w:val="Hyperlink"/>
@@ -568,7 +512,7 @@
             <w:noProof/>
             <w:webHidden/>
           </w:rPr>
-          <w:instrText xml:space="preserve"> PAGEREF _Toc243939438 \h </w:instrText>
+          <w:instrText xml:space="preserve"> PAGEREF _Toc243940029 \h </w:instrText>
         </w:r>
         <w:r>
           <w:rPr>
@@ -614,7 +558,7 @@
           <w14:ligatures w14:val="standardContextual"/>
         </w:rPr>
       </w:pPr>
-      <w:hyperlink w:anchor="_Toc243939439" w:history="1">
+      <w:hyperlink w:anchor="_Toc243940030" w:history="1">
         <w:r>
           <w:rPr>
             <w:rStyle w:val="Hyperlink"/>
@@ -641,7 +585,7 @@
             <w:noProof/>
             <w:webHidden/>
           </w:rPr>
-          <w:instrText xml:space="preserve"> PAGEREF _Toc243939439 \h </w:instrText>
+          <w:instrText xml:space="preserve"> PAGEREF _Toc243940030 \h </w:instrText>
         </w:r>
         <w:r>
           <w:rPr>
@@ -687,7 +631,7 @@
           <w14:ligatures w14:val="standardContextual"/>
         </w:rPr>
       </w:pPr>
-      <w:hyperlink w:anchor="_Toc243939440" w:history="1">
+      <w:hyperlink w:anchor="_Toc243940031" w:history="1">
         <w:r>
           <w:rPr>
             <w:rStyle w:val="Hyperlink"/>
@@ -714,7 +658,7 @@
             <w:noProof/>
             <w:webHidden/>
           </w:rPr>
-          <w:instrText xml:space="preserve"> PAGEREF _Toc243939440 \h </w:instrText>
+          <w:instrText xml:space="preserve"> PAGEREF _Toc243940031 \h </w:instrText>
         </w:r>
         <w:r>
           <w:rPr>
@@ -760,7 +704,7 @@
           <w14:ligatures w14:val="standardContextual"/>
         </w:rPr>
       </w:pPr>
-      <w:hyperlink w:anchor="_Toc243939441" w:history="1">
+      <w:hyperlink w:anchor="_Toc243940032" w:history="1">
         <w:r>
           <w:rPr>
             <w:rStyle w:val="Hyperlink"/>
@@ -787,7 +731,7 @@
             <w:noProof/>
             <w:webHidden/>
           </w:rPr>
-          <w:instrText xml:space="preserve"> PAGEREF _Toc243939441 \h </w:instrText>
+          <w:instrText xml:space="preserve"> PAGEREF _Toc243940032 \h </w:instrText>
         </w:r>
         <w:r>
           <w:rPr>
@@ -833,7 +777,7 @@
           <w14:ligatures w14:val="standardContextual"/>
         </w:rPr>
       </w:pPr>
-      <w:hyperlink w:anchor="_Toc243939442" w:history="1">
+      <w:hyperlink w:anchor="_Toc243940033" w:history="1">
         <w:r>
           <w:rPr>
             <w:rStyle w:val="Hyperlink"/>
@@ -860,7 +804,7 @@
             <w:noProof/>
             <w:webHidden/>
           </w:rPr>
-          <w:instrText xml:space="preserve"> PAGEREF _Toc243939442 \h </w:instrText>
+          <w:instrText xml:space="preserve"> PAGEREF _Toc243940033 \h </w:instrText>
         </w:r>
         <w:r>
           <w:rPr>
@@ -906,7 +850,7 @@
           <w14:ligatures w14:val="standardContextual"/>
         </w:rPr>
       </w:pPr>
-      <w:hyperlink w:anchor="_Toc243939443" w:history="1">
+      <w:hyperlink w:anchor="_Toc243940034" w:history="1">
         <w:r>
           <w:rPr>
             <w:rStyle w:val="Hyperlink"/>
@@ -933,7 +877,7 @@
             <w:noProof/>
             <w:webHidden/>
           </w:rPr>
-          <w:instrText xml:space="preserve"> PAGEREF _Toc243939443 \h </w:instrText>
+          <w:instrText xml:space="preserve"> PAGEREF _Toc243940034 \h </w:instrText>
         </w:r>
         <w:r>
           <w:rPr>
@@ -979,7 +923,7 @@
           <w14:ligatures w14:val="standardContextual"/>
         </w:rPr>
       </w:pPr>
-      <w:hyperlink w:anchor="_Toc243939444" w:history="1">
+      <w:hyperlink w:anchor="_Toc243940035" w:history="1">
         <w:r>
           <w:rPr>
             <w:rStyle w:val="Hyperlink"/>
@@ -1006,7 +950,7 @@
             <w:noProof/>
             <w:webHidden/>
           </w:rPr>
-          <w:instrText xml:space="preserve"> PAGEREF _Toc243939444 \h </w:instrText>
+          <w:instrText xml:space="preserve"> PAGEREF _Toc243940035 \h </w:instrText>
         </w:r>
         <w:r>
           <w:rPr>
@@ -1052,7 +996,7 @@
           <w14:ligatures w14:val="standardContextual"/>
         </w:rPr>
       </w:pPr>
-      <w:hyperlink w:anchor="_Toc243939445" w:history="1">
+      <w:hyperlink w:anchor="_Toc243940036" w:history="1">
         <w:r>
           <w:rPr>
             <w:rStyle w:val="Hyperlink"/>
@@ -1079,7 +1023,7 @@
             <w:noProof/>
             <w:webHidden/>
           </w:rPr>
-          <w:instrText xml:space="preserve"> PAGEREF _Toc243939445 \h </w:instrText>
+          <w:instrText xml:space="preserve"> PAGEREF _Toc243940036 \h </w:instrText>
         </w:r>
         <w:r>
           <w:rPr>
@@ -1125,7 +1069,7 @@
           <w14:ligatures w14:val="standardContextual"/>
         </w:rPr>
       </w:pPr>
-      <w:hyperlink w:anchor="_Toc243939446" w:history="1">
+      <w:hyperlink w:anchor="_Toc243940037" w:history="1">
         <w:r>
           <w:rPr>
             <w:rStyle w:val="Hyperlink"/>
@@ -1152,7 +1096,7 @@
             <w:noProof/>
             <w:webHidden/>
           </w:rPr>
-          <w:instrText xml:space="preserve"> PAGEREF _Toc243939446 \h </w:instrText>
+          <w:instrText xml:space="preserve"> PAGEREF _Toc243940037 \h </w:instrText>
         </w:r>
         <w:r>
           <w:rPr>
@@ -1198,7 +1142,7 @@
           <w14:ligatures w14:val="standardContextual"/>
         </w:rPr>
       </w:pPr>
-      <w:hyperlink w:anchor="_Toc243939447" w:history="1">
+      <w:hyperlink w:anchor="_Toc243940038" w:history="1">
         <w:r>
           <w:rPr>
             <w:rStyle w:val="Hyperlink"/>
@@ -1225,7 +1169,7 @@
             <w:noProof/>
             <w:webHidden/>
           </w:rPr>
-          <w:instrText xml:space="preserve"> PAGEREF _Toc243939447 \h </w:instrText>
+          <w:instrText xml:space="preserve"> PAGEREF _Toc243940038 \h </w:instrText>
         </w:r>
         <w:r>
           <w:rPr>
@@ -1271,7 +1215,7 @@
           <w14:ligatures w14:val="standardContextual"/>
         </w:rPr>
       </w:pPr>
-      <w:hyperlink w:anchor="_Toc243939448" w:history="1">
+      <w:hyperlink w:anchor="_Toc243940039" w:history="1">
         <w:r>
           <w:rPr>
             <w:rStyle w:val="Hyperlink"/>
@@ -1298,7 +1242,7 @@
             <w:noProof/>
             <w:webHidden/>
           </w:rPr>
-          <w:instrText xml:space="preserve"> PAGEREF _Toc243939448 \h </w:instrText>
+          <w:instrText xml:space="preserve"> PAGEREF _Toc243940039 \h </w:instrText>
         </w:r>
         <w:r>
           <w:rPr>
@@ -1344,7 +1288,7 @@
           <w14:ligatures w14:val="standardContextual"/>
         </w:rPr>
       </w:pPr>
-      <w:hyperlink w:anchor="_Toc243939449" w:history="1">
+      <w:hyperlink w:anchor="_Toc243940040" w:history="1">
         <w:r>
           <w:rPr>
             <w:rStyle w:val="Hyperlink"/>
@@ -1371,7 +1315,7 @@
             <w:noProof/>
             <w:webHidden/>
           </w:rPr>
-          <w:instrText xml:space="preserve"> PAGEREF _Toc243939449 \h </w:instrText>
+          <w:instrText xml:space="preserve"> PAGEREF _Toc243940040 \h </w:instrText>
         </w:r>
         <w:r>
           <w:rPr>
@@ -1417,7 +1361,7 @@
           <w14:ligatures w14:val="standardContextual"/>
         </w:rPr>
       </w:pPr>
-      <w:hyperlink w:anchor="_Toc243939450" w:history="1">
+      <w:hyperlink w:anchor="_Toc243940041" w:history="1">
         <w:r>
           <w:rPr>
             <w:rStyle w:val="Hyperlink"/>
@@ -1444,7 +1388,7 @@
             <w:noProof/>
             <w:webHidden/>
           </w:rPr>
-          <w:instrText xml:space="preserve"> PAGEREF _Toc243939450 \h </w:instrText>
+          <w:instrText xml:space="preserve"> PAGEREF _Toc243940041 \h </w:instrText>
         </w:r>
         <w:r>
           <w:rPr>
@@ -1490,7 +1434,7 @@
           <w14:ligatures w14:val="standardContextual"/>
         </w:rPr>
       </w:pPr>
-      <w:hyperlink w:anchor="_Toc243939451" w:history="1">
+      <w:hyperlink w:anchor="_Toc243940042" w:history="1">
         <w:r>
           <w:rPr>
             <w:rStyle w:val="Hyperlink"/>
@@ -1517,7 +1461,7 @@
             <w:noProof/>
             <w:webHidden/>
           </w:rPr>
-          <w:instrText xml:space="preserve"> PAGEREF _Toc243939451 \h </w:instrText>
+          <w:instrText xml:space="preserve"> PAGEREF _Toc243940042 \h </w:instrText>
         </w:r>
         <w:r>
           <w:rPr>
@@ -1563,7 +1507,7 @@
           <w14:ligatures w14:val="standardContextual"/>
         </w:rPr>
       </w:pPr>
-      <w:hyperlink w:anchor="_Toc243939452" w:history="1">
+      <w:hyperlink w:anchor="_Toc243940043" w:history="1">
         <w:r>
           <w:rPr>
             <w:rStyle w:val="Hyperlink"/>
@@ -1590,7 +1534,7 @@
             <w:noProof/>
             <w:webHidden/>
           </w:rPr>
-          <w:instrText xml:space="preserve"> PAGEREF _Toc243939452 \h </w:instrText>
+          <w:instrText xml:space="preserve"> PAGEREF _Toc243940043 \h </w:instrText>
         </w:r>
         <w:r>
           <w:rPr>
@@ -1636,7 +1580,7 @@
           <w14:ligatures w14:val="standardContextual"/>
         </w:rPr>
       </w:pPr>
-      <w:hyperlink w:anchor="_Toc243939453" w:history="1">
+      <w:hyperlink w:anchor="_Toc243940044" w:history="1">
         <w:r>
           <w:rPr>
             <w:rStyle w:val="Hyperlink"/>
@@ -1663,7 +1607,7 @@
             <w:noProof/>
             <w:webHidden/>
           </w:rPr>
-          <w:instrText xml:space="preserve"> PAGEREF _Toc243939453 \h </w:instrText>
+          <w:instrText xml:space="preserve"> PAGEREF _Toc243940044 \h </w:instrText>
         </w:r>
         <w:r>
           <w:rPr>
@@ -1709,7 +1653,7 @@
           <w14:ligatures w14:val="standardContextual"/>
         </w:rPr>
       </w:pPr>
-      <w:hyperlink w:anchor="_Toc243939454" w:history="1">
+      <w:hyperlink w:anchor="_Toc243940045" w:history="1">
         <w:r>
           <w:rPr>
             <w:rStyle w:val="Hyperlink"/>
@@ -1736,7 +1680,7 @@
             <w:noProof/>
             <w:webHidden/>
           </w:rPr>
-          <w:instrText xml:space="preserve"> PAGEREF _Toc243939454 \h </w:instrText>
+          <w:instrText xml:space="preserve"> PAGEREF _Toc243940045 \h </w:instrText>
         </w:r>
         <w:r>
           <w:rPr>
@@ -1782,7 +1726,7 @@
           <w14:ligatures w14:val="standardContextual"/>
         </w:rPr>
       </w:pPr>
-      <w:hyperlink w:anchor="_Toc243939455" w:history="1">
+      <w:hyperlink w:anchor="_Toc243940046" w:history="1">
         <w:r>
           <w:rPr>
             <w:rStyle w:val="Hyperlink"/>
@@ -1809,7 +1753,7 @@
             <w:noProof/>
             <w:webHidden/>
           </w:rPr>
-          <w:instrText xml:space="preserve"> PAGEREF _Toc243939455 \h </w:instrText>
+          <w:instrText xml:space="preserve"> PAGEREF _Toc243940046 \h </w:instrText>
         </w:r>
         <w:r>
           <w:rPr>
@@ -1855,7 +1799,7 @@
           <w14:ligatures w14:val="standardContextual"/>
         </w:rPr>
       </w:pPr>
-      <w:hyperlink w:anchor="_Toc243939456" w:history="1">
+      <w:hyperlink w:anchor="_Toc243940047" w:history="1">
         <w:r>
           <w:rPr>
             <w:rStyle w:val="Hyperlink"/>
@@ -1882,7 +1826,7 @@
             <w:noProof/>
             <w:webHidden/>
           </w:rPr>
-          <w:instrText xml:space="preserve"> PAGEREF _Toc243939456 \h </w:instrText>
+          <w:instrText xml:space="preserve"> PAGEREF _Toc243940047 \h </w:instrText>
         </w:r>
         <w:r>
           <w:rPr>
@@ -1928,7 +1872,7 @@
           <w14:ligatures w14:val="standardContextual"/>
         </w:rPr>
       </w:pPr>
-      <w:hyperlink w:anchor="_Toc243939457" w:history="1">
+      <w:hyperlink w:anchor="_Toc243940048" w:history="1">
         <w:r>
           <w:rPr>
             <w:rStyle w:val="Hyperlink"/>
@@ -1955,7 +1899,7 @@
             <w:noProof/>
             <w:webHidden/>
           </w:rPr>
-          <w:instrText xml:space="preserve"> PAGEREF _Toc243939457 \h </w:instrText>
+          <w:instrText xml:space="preserve"> PAGEREF _Toc243940048 \h </w:instrText>
         </w:r>
         <w:r>
           <w:rPr>
@@ -2001,7 +1945,7 @@
           <w14:ligatures w14:val="standardContextual"/>
         </w:rPr>
       </w:pPr>
-      <w:hyperlink w:anchor="_Toc243939458" w:history="1">
+      <w:hyperlink w:anchor="_Toc243940049" w:history="1">
         <w:r>
           <w:rPr>
             <w:rStyle w:val="Hyperlink"/>
@@ -2028,7 +1972,7 @@
             <w:noProof/>
             <w:webHidden/>
           </w:rPr>
-          <w:instrText xml:space="preserve"> PAGEREF _Toc243939458 \h </w:instrText>
+          <w:instrText xml:space="preserve"> PAGEREF _Toc243940049 \h </w:instrText>
         </w:r>
         <w:r>
           <w:rPr>
@@ -2074,7 +2018,7 @@
           <w14:ligatures w14:val="standardContextual"/>
         </w:rPr>
       </w:pPr>
-      <w:hyperlink w:anchor="_Toc243939459" w:history="1">
+      <w:hyperlink w:anchor="_Toc243940050" w:history="1">
         <w:r>
           <w:rPr>
             <w:rStyle w:val="Hyperlink"/>
@@ -2101,7 +2045,7 @@
             <w:noProof/>
             <w:webHidden/>
           </w:rPr>
-          <w:instrText xml:space="preserve"> PAGEREF _Toc243939459 \h </w:instrText>
+          <w:instrText xml:space="preserve"> PAGEREF _Toc243940050 \h </w:instrText>
         </w:r>
         <w:r>
           <w:rPr>
@@ -2147,7 +2091,7 @@
           <w14:ligatures w14:val="standardContextual"/>
         </w:rPr>
       </w:pPr>
-      <w:hyperlink w:anchor="_Toc243939460" w:history="1">
+      <w:hyperlink w:anchor="_Toc243940051" w:history="1">
         <w:r>
           <w:rPr>
             <w:rStyle w:val="Hyperlink"/>
@@ -2174,7 +2118,7 @@
             <w:noProof/>
             <w:webHidden/>
           </w:rPr>
-          <w:instrText xml:space="preserve"> PAGEREF _Toc243939460 \h </w:instrText>
+          <w:instrText xml:space="preserve"> PAGEREF _Toc243940051 \h </w:instrText>
         </w:r>
         <w:r>
           <w:rPr>
@@ -2220,7 +2164,7 @@
           <w14:ligatures w14:val="standardContextual"/>
         </w:rPr>
       </w:pPr>
-      <w:hyperlink w:anchor="_Toc243939461" w:history="1">
+      <w:hyperlink w:anchor="_Toc243940052" w:history="1">
         <w:r>
           <w:rPr>
             <w:rStyle w:val="Hyperlink"/>
@@ -2247,7 +2191,7 @@
             <w:noProof/>
             <w:webHidden/>
           </w:rPr>
-          <w:instrText xml:space="preserve"> PAGEREF _Toc243939461 \h </w:instrText>
+          <w:instrText xml:space="preserve"> PAGEREF _Toc243940052 \h </w:instrText>
         </w:r>
         <w:r>
           <w:rPr>
@@ -2293,7 +2237,7 @@
           <w14:ligatures w14:val="standardContextual"/>
         </w:rPr>
       </w:pPr>
-      <w:hyperlink w:anchor="_Toc243939462" w:history="1">
+      <w:hyperlink w:anchor="_Toc243940053" w:history="1">
         <w:r>
           <w:rPr>
             <w:rStyle w:val="Hyperlink"/>
@@ -2320,7 +2264,7 @@
             <w:noProof/>
             <w:webHidden/>
           </w:rPr>
-          <w:instrText xml:space="preserve"> PAGEREF _Toc243939462 \h </w:instrText>
+          <w:instrText xml:space="preserve"> PAGEREF _Toc243940053 \h </w:instrText>
         </w:r>
         <w:r>
           <w:rPr>
@@ -2366,7 +2310,7 @@
           <w14:ligatures w14:val="standardContextual"/>
         </w:rPr>
       </w:pPr>
-      <w:hyperlink w:anchor="_Toc243939463" w:history="1">
+      <w:hyperlink w:anchor="_Toc243940054" w:history="1">
         <w:r>
           <w:rPr>
             <w:rStyle w:val="Hyperlink"/>
@@ -2393,7 +2337,7 @@
             <w:noProof/>
             <w:webHidden/>
           </w:rPr>
-          <w:instrText xml:space="preserve"> PAGEREF _Toc243939463 \h </w:instrText>
+          <w:instrText xml:space="preserve"> PAGEREF _Toc243940054 \h </w:instrText>
         </w:r>
         <w:r>
           <w:rPr>
@@ -2438,7 +2382,7 @@
       <w:pPr>
         <w:pStyle w:val="Heading1"/>
       </w:pPr>
-      <w:bookmarkStart w:id="1" w:name="_Toc243939436"/>
+      <w:bookmarkStart w:id="1" w:name="_Toc243940027"/>
       <w:r>
         <w:lastRenderedPageBreak/>
         <w:t>Abstract</w:t>
@@ -2450,16 +2394,16 @@
         <w:jc w:val="both"/>
       </w:pPr>
       <w:r>
-        <w:t>This report documents the implementation and evaluation of Module 1 of a two-module applied-AI framework for hybrid-slotted defected ground structure (DGS) compact patch antennas: an image-based Vision Transformer (ViT) that classifies antenna performance from standardised images and explains which image regions drive its predictions. No licensed public dataset of Ansys HFSS images of hybrid-slotted DGS antennas exists, and HFSS was not available, so the module was built and executed as a proof of concept o</w:t>
-      </w:r>
-      <w:r>
-        <w:t>n two verified public simulation datasets: 2,051 openEMS-simulated rectangular patch antennas (MIT licence) and 3,000 RadPat-50K radiation-pattern plots (CC BY 4.0). Every patch design was rendered as a text-free, standardised two-panel geometry image and labelled from its simulated S11 response using rules frozen before training. A ViT-S/16 pretrained on ImageNet-21k was partially fine-tuned on a CPU and compared with a majority-class baseline, a compact CNN and a frozen-backbone linear probe on a locked d</w:t>
-      </w:r>
-      <w:r>
-        <w:t>esign-level split. On the three-class impedance-matching task the pre-registered fine-tuned ViT reached a test macro-F1 of 0.582 ± 0.008 (three seeds), against 0.643 ± 0.022 for the CNN, 0.709 for the linear probe and 0.269 for the majority baseline. Training curves showed underfitting, and the augmentation ablation identified the cause: small rotations and shifts blurred the one-to-two-pixel feed offset that determines matching. Without augmentation the same ViT reached 0.725 (exploratory, one seed). Atten</w:t>
-      </w:r>
-      <w:r>
-        <w:t>tion rollout placed 1.41 times more attribution on the feed region than its area share in the median design, but also revealed background attention sinks. Robustness tests showed sensitivity to blur and colour rendering. The results establish a reproducible, honest image pipeline that is ready to be applied to the HFSS dataset; they do not validate hybrid-slotted DGS performance.</w:t>
+        <w:t>This project implements and evaluates Module 1 of a two-module applied-AI framework for hybrid-slotted defected ground structure (DGS) compact patch antennas: an image-based Vision Transformer (ViT) that classifies antenna performance from standardised images and explains which image regions drive its predictions. No licensed public dataset of Ansys HFSS images of hybrid-slotted DGS antennas exists, and HFSS was not available, so the module was built and executed as a proof of concept on two verified public</w:t>
+      </w:r>
+      <w:r>
+        <w:t xml:space="preserve"> simulation datasets: 2,051 openEMS-simulated rectangular patch antennas (MIT licence) and 3,000 RadPat-50K radiation-pattern plots (CC BY 4.0). Every patch design was rendered as a text-free, standardised two-panel geometry image and labelled from its simulated S11 response using rules frozen before training. A ViT-S/16 pretrained on ImageNet-21k was partially fine-tuned on a CPU and compared with a majority-class baseline, a compact CNN and a frozen-backbone linear probe on a locked design-level split. On</w:t>
+      </w:r>
+      <w:r>
+        <w:t xml:space="preserve"> the three-class impedance-matching task the pre-registered fine-tuned ViT reached a test macro-F1 of 0.582 ± 0.008 (three seeds), against 0.643 ± 0.022 for the CNN, 0.709 for the linear probe and 0.269 for the majority baseline. Training curves showed underfitting, and the augmentation ablation identified the cause: small rotations and shifts blurred the one-to-two-pixel feed offset that determines matching. Without augmentation the same ViT reached 0.725 (exploratory, one seed). Attention rollout placed 1</w:t>
+      </w:r>
+      <w:r>
+        <w:t>.41 times more attribution on the feed region than its area share in the median design, but also revealed background attention sinks. Robustness tests showed sensitivity to blur and colour rendering. The results establish a reproducible, honest image pipeline that is ready to be applied to the HFSS dataset; they do not validate hybrid-slotted DGS performance.</w:t>
       </w:r>
     </w:p>
     <w:p>
@@ -2480,7 +2424,7 @@
       <w:pPr>
         <w:pStyle w:val="Heading1"/>
       </w:pPr>
-      <w:bookmarkStart w:id="2" w:name="_Toc243939437"/>
+      <w:bookmarkStart w:id="2" w:name="_Toc243940028"/>
       <w:r>
         <w:t>1. Introduction and Recap of the Research Problem</w:t>
       </w:r>
@@ -2502,7 +2446,7 @@
         <w:jc w:val="both"/>
       </w:pPr>
       <w:r>
-        <w:t xml:space="preserve">The research objective of this module is unchanged from that report: </w:t>
+        <w:t xml:space="preserve">The research objective of Module 1 is unchanged from the original research proposal: </w:t>
       </w:r>
       <w:r>
         <w:rPr>
@@ -2511,7 +2455,7 @@
         <w:t>to investigate whether standardised antenna geometry and electromagnetic images can support antenna-performance classification and explainable visual analysis.</w:t>
       </w:r>
       <w:r>
-        <w:t xml:space="preserve"> Module 1 is the image branch of the overall framework. The numerical-text surrogate, the multimodal fusion stage and the NSGA-II optimisation form Module 2, which is documented in a separate report and repository (</w:t>
+        <w:t xml:space="preserve"> Module 1 is the image branch of the overall framework. The numerical-text surrogate, the multimodal fusion stage and the NSGA-II optimisation form Module 2, a companion project in its own repository (</w:t>
       </w:r>
       <w:hyperlink r:id="rId9">
         <w:r>
@@ -3270,7 +3214,7 @@
           <w:noProof/>
         </w:rPr>
         <w:drawing>
-          <wp:inline distT="0" distB="0" distL="0" distR="0" wp14:anchorId="1EA9B7B1" wp14:editId="6FF8C422">
+          <wp:inline distT="0" distB="0" distL="0" distR="0" wp14:anchorId="0F653754" wp14:editId="39084CEF">
             <wp:extent cx="5760720" cy="2747420"/>
             <wp:effectExtent l="0" t="0" r="0" b="0"/>
             <wp:docPr id="1" name="Picture 1"/>
@@ -3319,7 +3263,7 @@
       <w:pPr>
         <w:pStyle w:val="Heading1"/>
       </w:pPr>
-      <w:bookmarkStart w:id="3" w:name="_Toc243939438"/>
+      <w:bookmarkStart w:id="3" w:name="_Toc243940029"/>
       <w:r>
         <w:t>2. Research Design and Hypotheses</w:t>
       </w:r>
@@ -3781,7 +3725,7 @@
       <w:pPr>
         <w:pStyle w:val="Heading1"/>
       </w:pPr>
-      <w:bookmarkStart w:id="4" w:name="_Toc243939439"/>
+      <w:bookmarkStart w:id="4" w:name="_Toc243940030"/>
       <w:r>
         <w:t>3. Dataset Description and Source Verification</w:t>
       </w:r>
@@ -4120,7 +4064,7 @@
       <w:pPr>
         <w:pStyle w:val="Heading1"/>
       </w:pPr>
-      <w:bookmarkStart w:id="5" w:name="_Toc243939440"/>
+      <w:bookmarkStart w:id="5" w:name="_Toc243940031"/>
       <w:r>
         <w:t>4. Data Preprocessing and Preparation</w:t>
       </w:r>
@@ -4130,7 +4074,7 @@
       <w:pPr>
         <w:pStyle w:val="Heading2"/>
       </w:pPr>
-      <w:bookmarkStart w:id="6" w:name="_Toc243939441"/>
+      <w:bookmarkStart w:id="6" w:name="_Toc243940032"/>
       <w:r>
         <w:t>4.1 Targets and label rules</w:t>
       </w:r>
@@ -4208,7 +4152,7 @@
       <w:pPr>
         <w:pStyle w:val="Heading2"/>
       </w:pPr>
-      <w:bookmarkStart w:id="7" w:name="_Toc243939442"/>
+      <w:bookmarkStart w:id="7" w:name="_Toc243940033"/>
       <w:r>
         <w:t>4.2 Standardised geometry images</w:t>
       </w:r>
@@ -4236,7 +4180,7 @@
           <w:noProof/>
         </w:rPr>
         <w:drawing>
-          <wp:inline distT="0" distB="0" distL="0" distR="0" wp14:anchorId="35894D74" wp14:editId="6F6D33C7">
+          <wp:inline distT="0" distB="0" distL="0" distR="0" wp14:anchorId="0E7C483D" wp14:editId="50EC16B7">
             <wp:extent cx="5760720" cy="1780586"/>
             <wp:effectExtent l="0" t="0" r="0" b="0"/>
             <wp:docPr id="2" name="Picture 2"/>
@@ -4291,7 +4235,7 @@
           <w:noProof/>
         </w:rPr>
         <w:drawing>
-          <wp:inline distT="0" distB="0" distL="0" distR="0" wp14:anchorId="4B6854ED" wp14:editId="7C8ED6D8">
+          <wp:inline distT="0" distB="0" distL="0" distR="0" wp14:anchorId="0C303A0F" wp14:editId="3130012E">
             <wp:extent cx="5120640" cy="981456"/>
             <wp:effectExtent l="0" t="0" r="0" b="0"/>
             <wp:docPr id="3" name="Picture 3"/>
@@ -4340,7 +4284,7 @@
       <w:pPr>
         <w:pStyle w:val="Heading2"/>
       </w:pPr>
-      <w:bookmarkStart w:id="8" w:name="_Toc243939443"/>
+      <w:bookmarkStart w:id="8" w:name="_Toc243940034"/>
       <w:r>
         <w:t>4.3 Cleaning, duplicates and leakage control</w:t>
       </w:r>
@@ -4442,7 +4386,7 @@
       <w:pPr>
         <w:pStyle w:val="Heading1"/>
       </w:pPr>
-      <w:bookmarkStart w:id="9" w:name="_Toc243939444"/>
+      <w:bookmarkStart w:id="9" w:name="_Toc243940035"/>
       <w:r>
         <w:lastRenderedPageBreak/>
         <w:t>5. Proposed Model: Vision Transformer</w:t>
@@ -4492,7 +4436,7 @@
       <w:pPr>
         <w:pStyle w:val="Heading1"/>
       </w:pPr>
-      <w:bookmarkStart w:id="10" w:name="_Toc243939445"/>
+      <w:bookmarkStart w:id="10" w:name="_Toc243940036"/>
       <w:r>
         <w:t>6. Training Strategy and Experimental Setup</w:t>
       </w:r>
@@ -5053,7 +4997,7 @@
       <w:pPr>
         <w:pStyle w:val="Heading1"/>
       </w:pPr>
-      <w:bookmarkStart w:id="11" w:name="_Toc243939446"/>
+      <w:bookmarkStart w:id="11" w:name="_Toc243940037"/>
       <w:r>
         <w:t>7. Baseline Methods and Comparative Models</w:t>
       </w:r>
@@ -5119,7 +5063,7 @@
       <w:pPr>
         <w:pStyle w:val="Heading1"/>
       </w:pPr>
-      <w:bookmarkStart w:id="12" w:name="_Toc243939447"/>
+      <w:bookmarkStart w:id="12" w:name="_Toc243940038"/>
       <w:r>
         <w:t>8. Evaluation Metrics and Analysis Plan</w:t>
       </w:r>
@@ -5140,7 +5084,7 @@
       <w:pPr>
         <w:pStyle w:val="Heading1"/>
       </w:pPr>
-      <w:bookmarkStart w:id="13" w:name="_Toc243939448"/>
+      <w:bookmarkStart w:id="13" w:name="_Toc243940039"/>
       <w:r>
         <w:t>9. Results and Discussion</w:t>
       </w:r>
@@ -5158,7 +5102,7 @@
       <w:pPr>
         <w:pStyle w:val="Heading2"/>
       </w:pPr>
-      <w:bookmarkStart w:id="14" w:name="_Toc243939449"/>
+      <w:bookmarkStart w:id="14" w:name="_Toc243940040"/>
       <w:r>
         <w:lastRenderedPageBreak/>
         <w:t>9.1 Main task: geometry image to matching class (RQ1, RQ2)</w:t>
@@ -6217,7 +6161,7 @@
           <w:noProof/>
         </w:rPr>
         <w:drawing>
-          <wp:inline distT="0" distB="0" distL="0" distR="0" wp14:anchorId="0ED51901" wp14:editId="202CEAA5">
+          <wp:inline distT="0" distB="0" distL="0" distR="0" wp14:anchorId="19AA103D" wp14:editId="2C3DB56D">
             <wp:extent cx="5760720" cy="1400175"/>
             <wp:effectExtent l="0" t="0" r="0" b="0"/>
             <wp:docPr id="4" name="Picture 4"/>
@@ -6272,7 +6216,7 @@
           <w:noProof/>
         </w:rPr>
         <w:drawing>
-          <wp:inline distT="0" distB="0" distL="0" distR="0" wp14:anchorId="76328704" wp14:editId="0B72A4CF">
+          <wp:inline distT="0" distB="0" distL="0" distR="0" wp14:anchorId="5665D217" wp14:editId="1B399EBD">
             <wp:extent cx="5486400" cy="1351722"/>
             <wp:effectExtent l="0" t="0" r="0" b="0"/>
             <wp:docPr id="5" name="Picture 5"/>
@@ -6321,7 +6265,7 @@
       <w:pPr>
         <w:pStyle w:val="Heading2"/>
       </w:pPr>
-      <w:bookmarkStart w:id="15" w:name="_Toc243939450"/>
+      <w:bookmarkStart w:id="15" w:name="_Toc243940041"/>
       <w:r>
         <w:lastRenderedPageBreak/>
         <w:t>9.2 Diagnosing the underperformance: Amendment 1 and augmentation ablation</w:t>
@@ -6739,7 +6683,7 @@
       <w:pPr>
         <w:pStyle w:val="Heading2"/>
       </w:pPr>
-      <w:bookmarkStart w:id="16" w:name="_Toc243939451"/>
+      <w:bookmarkStart w:id="16" w:name="_Toc243940042"/>
       <w:r>
         <w:t>9.3 Secondary task and modality comparison (RQ3)</w:t>
       </w:r>
@@ -7045,7 +6989,7 @@
         </w:rPr>
         <w:lastRenderedPageBreak/>
         <w:drawing>
-          <wp:inline distT="0" distB="0" distL="0" distR="0" wp14:anchorId="48295285" wp14:editId="744F906E">
+          <wp:inline distT="0" distB="0" distL="0" distR="0" wp14:anchorId="0C8B7F19" wp14:editId="5E978BAA">
             <wp:extent cx="5486400" cy="2194560"/>
             <wp:effectExtent l="0" t="0" r="0" b="0"/>
             <wp:docPr id="6" name="Picture 6"/>
@@ -7120,7 +7064,7 @@
       <w:pPr>
         <w:pStyle w:val="Heading2"/>
       </w:pPr>
-      <w:bookmarkStart w:id="17" w:name="_Toc243939452"/>
+      <w:bookmarkStart w:id="17" w:name="_Toc243940043"/>
       <w:r>
         <w:t>9.4 Explainability (RQ4)</w:t>
       </w:r>
@@ -7136,7 +7080,7 @@
           <w:noProof/>
         </w:rPr>
         <w:drawing>
-          <wp:inline distT="0" distB="0" distL="0" distR="0" wp14:anchorId="2B64BD2E" wp14:editId="52BA52DE">
+          <wp:inline distT="0" distB="0" distL="0" distR="0" wp14:anchorId="76D5F1B0" wp14:editId="08A5F396">
             <wp:extent cx="5760720" cy="1847187"/>
             <wp:effectExtent l="0" t="0" r="0" b="0"/>
             <wp:docPr id="7" name="Picture 7"/>
@@ -7191,7 +7135,7 @@
           <w:noProof/>
         </w:rPr>
         <w:drawing>
-          <wp:inline distT="0" distB="0" distL="0" distR="0" wp14:anchorId="510A0196" wp14:editId="07EBC9C3">
+          <wp:inline distT="0" distB="0" distL="0" distR="0" wp14:anchorId="617E84B3" wp14:editId="4DB5C49B">
             <wp:extent cx="5029200" cy="1788160"/>
             <wp:effectExtent l="0" t="0" r="0" b="0"/>
             <wp:docPr id="8" name="Picture 8"/>
@@ -7261,7 +7205,7 @@
       <w:pPr>
         <w:pStyle w:val="Heading2"/>
       </w:pPr>
-      <w:bookmarkStart w:id="18" w:name="_Toc243939453"/>
+      <w:bookmarkStart w:id="18" w:name="_Toc243940044"/>
       <w:r>
         <w:t>9.5 Robustness and out-of-distribution generalisation (RQ5)</w:t>
       </w:r>
@@ -7888,7 +7832,7 @@
       <w:pPr>
         <w:pStyle w:val="Heading2"/>
       </w:pPr>
-      <w:bookmarkStart w:id="19" w:name="_Toc243939454"/>
+      <w:bookmarkStart w:id="19" w:name="_Toc243940045"/>
       <w:r>
         <w:lastRenderedPageBreak/>
         <w:t>9.6 Summary of hypotheses</w:t>
@@ -8253,7 +8197,7 @@
       <w:pPr>
         <w:pStyle w:val="Heading1"/>
       </w:pPr>
-      <w:bookmarkStart w:id="20" w:name="_Toc243939455"/>
+      <w:bookmarkStart w:id="20" w:name="_Toc243940046"/>
       <w:r>
         <w:t>10. Ethics, Bias, Privacy, and Reproducibility</w:t>
       </w:r>
@@ -8322,7 +8266,7 @@
       <w:pPr>
         <w:pStyle w:val="Heading1"/>
       </w:pPr>
-      <w:bookmarkStart w:id="21" w:name="_Toc243939456"/>
+      <w:bookmarkStart w:id="21" w:name="_Toc243940047"/>
       <w:r>
         <w:t>11. Limitations and Future Work</w:t>
       </w:r>
@@ -8434,7 +8378,7 @@
       <w:pPr>
         <w:pStyle w:val="Heading1"/>
       </w:pPr>
-      <w:bookmarkStart w:id="22" w:name="_Toc243939457"/>
+      <w:bookmarkStart w:id="22" w:name="_Toc243940048"/>
       <w:r>
         <w:t>12. Conclusion</w:t>
       </w:r>
@@ -8458,7 +8402,7 @@
       <w:pPr>
         <w:pStyle w:val="Heading1"/>
       </w:pPr>
-      <w:bookmarkStart w:id="23" w:name="_Toc243939458"/>
+      <w:bookmarkStart w:id="23" w:name="_Toc243940049"/>
       <w:r>
         <w:t>Data, Code and Output Availability</w:t>
       </w:r>
@@ -9678,7 +9622,7 @@
               <w:rPr>
                 <w:sz w:val="19"/>
               </w:rPr>
-              <w:t>All figures used in this report</w:t>
+              <w:t>All figures produced by the project</w:t>
             </w:r>
           </w:p>
         </w:tc>
@@ -9825,7 +9769,7 @@
       <w:pPr>
         <w:pStyle w:val="Heading1"/>
       </w:pPr>
-      <w:bookmarkStart w:id="24" w:name="_Toc243939459"/>
+      <w:bookmarkStart w:id="24" w:name="_Toc243940050"/>
       <w:r>
         <w:t>References</w:t>
       </w:r>
@@ -9964,7 +9908,7 @@
       <w:pPr>
         <w:pStyle w:val="Heading1"/>
       </w:pPr>
-      <w:bookmarkStart w:id="25" w:name="_Toc243939460"/>
+      <w:bookmarkStart w:id="25" w:name="_Toc243940051"/>
       <w:r>
         <w:lastRenderedPageBreak/>
         <w:t>Appendix A. Data Dictionary</w:t>
@@ -11923,7 +11867,7 @@
       <w:pPr>
         <w:pStyle w:val="Heading1"/>
       </w:pPr>
-      <w:bookmarkStart w:id="26" w:name="_Toc243939461"/>
+      <w:bookmarkStart w:id="26" w:name="_Toc243940052"/>
       <w:r>
         <w:t>Appendix B. Configuration</w:t>
       </w:r>
@@ -12622,7 +12566,7 @@
       <w:pPr>
         <w:pStyle w:val="Heading1"/>
       </w:pPr>
-      <w:bookmarkStart w:id="27" w:name="_Toc243939462"/>
+      <w:bookmarkStart w:id="27" w:name="_Toc243940053"/>
       <w:r>
         <w:t>Appendix C. Experimental Details</w:t>
       </w:r>
@@ -14959,17 +14903,17 @@
       </w:pPr>
       <w:r>
         <w:lastRenderedPageBreak/>
-        <w:t>Failed or abandoned runs: the first CNN design (four double-convolution blocks at full resolution, about 60 s per epoch) was stopped after three epochs to save compute and replaced by the stride-2 stem version reported here. A first training queue was restarted as a detached, resumable process; partial runs were discarded and re-run from scratch. Because of a launcher quoting error, the pre-registered ViT seeds 43 and 44 and CNN seed 43 ran concurrently with other jobs; their results are unaffected, but the</w:t>
-      </w:r>
-      <w:r>
-        <w:t>ir training times are inflated and should not be compared. The first definition of resonance (the deepest S11 dip) was replaced before training by the first matched resonance. No test-set result was used for any of these decisions.</w:t>
+        <w:t>Failed or abandoned runs: the first CNN design (four double-convolution blocks at full resolution, about 60 s per epoch) was stopped after three epochs to save compute and replaced by the stride-2 stem version reported in Section 7. A first training queue was restarted as a detached, resumable process; partial runs were discarded and re-run from scratch. Because of a launcher quoting error, the pre-registered ViT seeds 43 and 44 and CNN seed 43 ran concurrently with other jobs; their results are unaffected,</w:t>
+      </w:r>
+      <w:r>
+        <w:t xml:space="preserve"> but their training times are inflated and should not be compared. The first definition of resonance (the deepest S11 dip) was replaced before training by the first matched resonance. No test-set result was used for any of these decisions.</w:t>
       </w:r>
     </w:p>
     <w:p>
       <w:pPr>
         <w:pStyle w:val="Heading1"/>
       </w:pPr>
-      <w:bookmarkStart w:id="28" w:name="_Toc243939463"/>
+      <w:bookmarkStart w:id="28" w:name="_Toc243940054"/>
       <w:r>
         <w:t>Appendix D. Reproducibility Instructions</w:t>
       </w:r>
@@ -15343,31 +15287,31 @@
       </w:rPr>
     </w:lvl>
   </w:abstractNum>
-  <w:num w:numId="1" w16cid:durableId="491216165">
+  <w:num w:numId="1" w16cid:durableId="2080397703">
     <w:abstractNumId w:val="8"/>
   </w:num>
-  <w:num w:numId="2" w16cid:durableId="465702767">
+  <w:num w:numId="2" w16cid:durableId="382173147">
     <w:abstractNumId w:val="6"/>
   </w:num>
-  <w:num w:numId="3" w16cid:durableId="1814566928">
+  <w:num w:numId="3" w16cid:durableId="1695495170">
     <w:abstractNumId w:val="5"/>
   </w:num>
-  <w:num w:numId="4" w16cid:durableId="1958565526">
+  <w:num w:numId="4" w16cid:durableId="1772317324">
     <w:abstractNumId w:val="4"/>
   </w:num>
-  <w:num w:numId="5" w16cid:durableId="431976256">
+  <w:num w:numId="5" w16cid:durableId="369885903">
     <w:abstractNumId w:val="7"/>
   </w:num>
-  <w:num w:numId="6" w16cid:durableId="12735042">
+  <w:num w:numId="6" w16cid:durableId="1959490215">
     <w:abstractNumId w:val="3"/>
   </w:num>
-  <w:num w:numId="7" w16cid:durableId="1561790193">
+  <w:num w:numId="7" w16cid:durableId="1504853499">
     <w:abstractNumId w:val="2"/>
   </w:num>
-  <w:num w:numId="8" w16cid:durableId="1029648932">
+  <w:num w:numId="8" w16cid:durableId="1496266545">
     <w:abstractNumId w:val="1"/>
   </w:num>
-  <w:num w:numId="9" w16cid:durableId="1803962991">
+  <w:num w:numId="9" w16cid:durableId="30765879">
     <w:abstractNumId w:val="0"/>
   </w:num>
 </w:numbering>
@@ -26757,7 +26701,7 @@
     <w:autoRedefine/>
     <w:uiPriority w:val="39"/>
     <w:unhideWhenUsed/>
-    <w:rsid w:val="006F3118"/>
+    <w:rsid w:val="006E31D0"/>
     <w:pPr>
       <w:spacing w:after="100"/>
     </w:pPr>
@@ -26769,7 +26713,7 @@
     <w:autoRedefine/>
     <w:uiPriority w:val="39"/>
     <w:unhideWhenUsed/>
-    <w:rsid w:val="006F3118"/>
+    <w:rsid w:val="006E31D0"/>
     <w:pPr>
       <w:spacing w:after="100"/>
       <w:ind w:left="220"/>
@@ -26780,7 +26724,7 @@
     <w:basedOn w:val="DefaultParagraphFont"/>
     <w:uiPriority w:val="99"/>
     <w:unhideWhenUsed/>
-    <w:rsid w:val="006F3118"/>
+    <w:rsid w:val="006E31D0"/>
     <w:rPr>
       <w:color w:val="0000FF" w:themeColor="hyperlink"/>
       <w:u w:val="single"/>

</xml_diff>